<commit_message>
EP01 working prompts: reference prompts on top, per-clip images to prepare
Co-Authored-By: Claude Opus 5.5 <noreply@anthropic.com>
Claude-Session: https://claude.ai/code/session_01VAADPC5RMETnb7oPTVQosk
</commit_message>
<xml_diff>
--- a/episodes/EP01_chernobyl_night/EP01_Чернобыль_Рабочие_промпты.docx
+++ b/episodes/EP01_chernobyl_night/EP01_Чернобыль_Рабочие_промпты.docx
@@ -148,7 +148,7 @@
         <w:spacing w:after="40"/>
       </w:pPr>
       <w:r>
-        <w:t xml:space="preserve">Приложите 2 референса (раздел 2) перетаскиванием, кнопкой Add или вводом @.</w:t>
+        <w:t xml:space="preserve">Приложите 3 картинки, указанные у клипа («Что подготовить»): перетаскиванием, кнопкой Add или вводом @.</w:t>
       </w:r>
     </w:p>
     <w:p>
@@ -179,7 +179,35 @@
         <w:pStyle w:val="Heading1"/>
       </w:pPr>
       <w:r>
-        <w:t xml:space="preserve">2. Референсы (уже есть — новые не делать)</w:t>
+        <w:t xml:space="preserve">2. Референсы — сделать один раз перед всеми клипами</w:t>
+      </w:r>
+    </w:p>
+    <w:p>
+      <w:pPr>
+        <w:spacing w:after="80"/>
+      </w:pPr>
+      <w:r>
+        <w:t xml:space="preserve">Во Flow: поле промпта → модель → </w:t>
+      </w:r>
+      <w:r>
+        <w:rPr>
+          <w:b/>
+          <w:bCs/>
+        </w:rPr>
+        <w:t xml:space="preserve">Image</w:t>
+      </w:r>
+      <w:r>
+        <w:t xml:space="preserve"> (картинка) → формат </w:t>
+      </w:r>
+      <w:r>
+        <w:rPr>
+          <w:b/>
+          <w:bCs/>
+        </w:rPr>
+        <w:t xml:space="preserve">9:16</w:t>
+      </w:r>
+      <w:r>
+        <w:t xml:space="preserve"> → вставить промпт → Generate → выбрать лучший → More (⋮) → Download → сохранить под указанным именем. Потом загрузить готовую картинку в проект (Add), чтобы прикладывать её к клипам.</w:t>
       </w:r>
     </w:p>
     <w:tbl>
@@ -195,9 +223,10 @@
         </w:tblBorders>
       </w:tblPr>
       <w:tblGrid>
-        <w:gridCol w:w="3300"/>
-        <w:gridCol w:w="3600"/>
-        <w:gridCol w:w="2738"/>
+        <w:gridCol w:w="2500"/>
+        <w:gridCol w:w="2000"/>
+        <w:gridCol w:w="3100"/>
+        <w:gridCol w:w="2038"/>
       </w:tblGrid>
       <w:tr>
         <w:trPr>
@@ -206,7 +235,7 @@
         </w:trPr>
         <w:tc>
           <w:tcPr>
-            <w:tcW w:type="dxa" w:w="3300"/>
+            <w:tcW w:type="dxa" w:w="2500"/>
             <w:tcBorders>
               <w:top w:val="single" w:color="BFB5AA" w:sz="4"/>
               <w:left w:val="single" w:color="BFB5AA" w:sz="4"/>
@@ -233,7 +262,7 @@
         </w:tc>
         <w:tc>
           <w:tcPr>
-            <w:tcW w:type="dxa" w:w="3600"/>
+            <w:tcW w:type="dxa" w:w="2000"/>
             <w:tcBorders>
               <w:top w:val="single" w:color="BFB5AA" w:sz="4"/>
               <w:left w:val="single" w:color="BFB5AA" w:sz="4"/>
@@ -260,7 +289,7 @@
         </w:tc>
         <w:tc>
           <w:tcPr>
-            <w:tcW w:type="dxa" w:w="2738"/>
+            <w:tcW w:type="dxa" w:w="3100"/>
             <w:tcBorders>
               <w:top w:val="single" w:color="BFB5AA" w:sz="4"/>
               <w:left w:val="single" w:color="BFB5AA" w:sz="4"/>
@@ -281,7 +310,34 @@
                 <w:b/>
                 <w:bCs/>
               </w:rPr>
-              <w:t xml:space="preserve">Когда прикладывать</w:t>
+              <w:t xml:space="preserve">Есть?</w:t>
+            </w:r>
+          </w:p>
+        </w:tc>
+        <w:tc>
+          <w:tcPr>
+            <w:tcW w:type="dxa" w:w="2038"/>
+            <w:tcBorders>
+              <w:top w:val="single" w:color="BFB5AA" w:sz="4"/>
+              <w:left w:val="single" w:color="BFB5AA" w:sz="4"/>
+              <w:bottom w:val="single" w:color="BFB5AA" w:sz="4"/>
+              <w:right w:val="single" w:color="BFB5AA" w:sz="4"/>
+            </w:tcBorders>
+            <w:shd w:fill="E8E0D6" w:color="auto" w:val="clear"/>
+            <w:tcMar>
+              <w:top w:type="dxa" w:w="40"/>
+              <w:left w:type="dxa" w:w="80"/>
+              <w:bottom w:type="dxa" w:w="40"/>
+              <w:right w:type="dxa" w:w="80"/>
+            </w:tcMar>
+          </w:tcPr>
+          <w:p>
+            <w:r>
+              <w:rPr>
+                <w:b/>
+                <w:bCs/>
+              </w:rPr>
+              <w:t xml:space="preserve">Нужен в клипах</w:t>
             </w:r>
           </w:p>
         </w:tc>
@@ -293,7 +349,7 @@
         </w:trPr>
         <w:tc>
           <w:tcPr>
-            <w:tcW w:type="dxa" w:w="3300"/>
+            <w:tcW w:type="dxa" w:w="2500"/>
             <w:tcBorders>
               <w:top w:val="single" w:color="BFB5AA" w:sz="4"/>
               <w:left w:val="single" w:color="BFB5AA" w:sz="4"/>
@@ -319,7 +375,7 @@
         </w:tc>
         <w:tc>
           <w:tcPr>
-            <w:tcW w:type="dxa" w:w="3600"/>
+            <w:tcW w:type="dxa" w:w="2000"/>
             <w:tcBorders>
               <w:top w:val="single" w:color="BFB5AA" w:sz="4"/>
               <w:left w:val="single" w:color="BFB5AA" w:sz="4"/>
@@ -345,27 +401,53 @@
         </w:tc>
         <w:tc>
           <w:tcPr>
-            <w:tcW w:type="dxa" w:w="2738"/>
-            <w:tcBorders>
-              <w:top w:val="single" w:color="BFB5AA" w:sz="4"/>
-              <w:left w:val="single" w:color="BFB5AA" w:sz="4"/>
-              <w:bottom w:val="single" w:color="BFB5AA" w:sz="4"/>
-              <w:right w:val="single" w:color="BFB5AA" w:sz="4"/>
-            </w:tcBorders>
-            <w:tcMar>
-              <w:top w:type="dxa" w:w="40"/>
-              <w:left w:type="dxa" w:w="80"/>
-              <w:bottom w:type="dxa" w:w="40"/>
-              <w:right w:type="dxa" w:w="80"/>
-            </w:tcMar>
-          </w:tcPr>
-          <w:p>
-            <w:r>
-              <w:rPr>
-                <w:b w:val="false"/>
-                <w:bCs w:val="false"/>
-              </w:rPr>
-              <w:t xml:space="preserve">во всех 12 клипах</w:t>
+            <w:tcW w:type="dxa" w:w="3100"/>
+            <w:tcBorders>
+              <w:top w:val="single" w:color="BFB5AA" w:sz="4"/>
+              <w:left w:val="single" w:color="BFB5AA" w:sz="4"/>
+              <w:bottom w:val="single" w:color="BFB5AA" w:sz="4"/>
+              <w:right w:val="single" w:color="BFB5AA" w:sz="4"/>
+            </w:tcBorders>
+            <w:tcMar>
+              <w:top w:type="dxa" w:w="40"/>
+              <w:left w:type="dxa" w:w="80"/>
+              <w:bottom w:type="dxa" w:w="40"/>
+              <w:right w:type="dxa" w:w="80"/>
+            </w:tcMar>
+          </w:tcPr>
+          <w:p>
+            <w:r>
+              <w:rPr>
+                <w:b w:val="false"/>
+                <w:bCs w:val="false"/>
+              </w:rPr>
+              <w:t xml:space="preserve">есть</w:t>
+            </w:r>
+          </w:p>
+        </w:tc>
+        <w:tc>
+          <w:tcPr>
+            <w:tcW w:type="dxa" w:w="2038"/>
+            <w:tcBorders>
+              <w:top w:val="single" w:color="BFB5AA" w:sz="4"/>
+              <w:left w:val="single" w:color="BFB5AA" w:sz="4"/>
+              <w:bottom w:val="single" w:color="BFB5AA" w:sz="4"/>
+              <w:right w:val="single" w:color="BFB5AA" w:sz="4"/>
+            </w:tcBorders>
+            <w:tcMar>
+              <w:top w:type="dxa" w:w="40"/>
+              <w:left w:type="dxa" w:w="80"/>
+              <w:bottom w:type="dxa" w:w="40"/>
+              <w:right w:type="dxa" w:w="80"/>
+            </w:tcMar>
+          </w:tcPr>
+          <w:p>
+            <w:r>
+              <w:rPr>
+                <w:b w:val="false"/>
+                <w:bCs w:val="false"/>
+              </w:rPr>
+              <w:t xml:space="preserve">всех 12</w:t>
             </w:r>
           </w:p>
         </w:tc>
@@ -377,79 +459,105 @@
         </w:trPr>
         <w:tc>
           <w:tcPr>
-            <w:tcW w:type="dxa" w:w="3300"/>
-            <w:tcBorders>
-              <w:top w:val="single" w:color="BFB5AA" w:sz="4"/>
-              <w:left w:val="single" w:color="BFB5AA" w:sz="4"/>
-              <w:bottom w:val="single" w:color="BFB5AA" w:sz="4"/>
-              <w:right w:val="single" w:color="BFB5AA" w:sz="4"/>
-            </w:tcBorders>
-            <w:tcMar>
-              <w:top w:type="dxa" w:w="40"/>
-              <w:left w:type="dxa" w:w="80"/>
-              <w:bottom w:type="dxa" w:w="40"/>
-              <w:right w:type="dxa" w:w="80"/>
-            </w:tcMar>
-          </w:tcPr>
-          <w:p>
-            <w:r>
-              <w:rPr>
-                <w:b w:val="false"/>
-                <w:bCs w:val="false"/>
-              </w:rPr>
-              <w:t xml:space="preserve">vera_EP01_costume_from_K01.png</w:t>
-            </w:r>
-          </w:p>
-        </w:tc>
-        <w:tc>
-          <w:tcPr>
-            <w:tcW w:type="dxa" w:w="3600"/>
-            <w:tcBorders>
-              <w:top w:val="single" w:color="BFB5AA" w:sz="4"/>
-              <w:left w:val="single" w:color="BFB5AA" w:sz="4"/>
-              <w:bottom w:val="single" w:color="BFB5AA" w:sz="4"/>
-              <w:right w:val="single" w:color="BFB5AA" w:sz="4"/>
-            </w:tcBorders>
-            <w:tcMar>
-              <w:top w:type="dxa" w:w="40"/>
-              <w:left w:type="dxa" w:w="80"/>
-              <w:bottom w:type="dxa" w:w="40"/>
-              <w:right w:type="dxa" w:w="80"/>
-            </w:tcMar>
-          </w:tcPr>
-          <w:p>
-            <w:r>
-              <w:rPr>
-                <w:b w:val="false"/>
-                <w:bCs w:val="false"/>
-              </w:rPr>
-              <w:t xml:space="preserve">Вера в костюме EP01 — кадр из вашего клипа 01</w:t>
-            </w:r>
-          </w:p>
-        </w:tc>
-        <w:tc>
-          <w:tcPr>
-            <w:tcW w:type="dxa" w:w="2738"/>
-            <w:tcBorders>
-              <w:top w:val="single" w:color="BFB5AA" w:sz="4"/>
-              <w:left w:val="single" w:color="BFB5AA" w:sz="4"/>
-              <w:bottom w:val="single" w:color="BFB5AA" w:sz="4"/>
-              <w:right w:val="single" w:color="BFB5AA" w:sz="4"/>
-            </w:tcBorders>
-            <w:tcMar>
-              <w:top w:type="dxa" w:w="40"/>
-              <w:left w:type="dxa" w:w="80"/>
-              <w:bottom w:type="dxa" w:w="40"/>
-              <w:right w:type="dxa" w:w="80"/>
-            </w:tcMar>
-          </w:tcPr>
-          <w:p>
-            <w:r>
-              <w:rPr>
-                <w:b w:val="false"/>
-                <w:bCs w:val="false"/>
-              </w:rPr>
-              <w:t xml:space="preserve">во всех 12 клипах</w:t>
+            <w:tcW w:type="dxa" w:w="2500"/>
+            <w:tcBorders>
+              <w:top w:val="single" w:color="BFB5AA" w:sz="4"/>
+              <w:left w:val="single" w:color="BFB5AA" w:sz="4"/>
+              <w:bottom w:val="single" w:color="BFB5AA" w:sz="4"/>
+              <w:right w:val="single" w:color="BFB5AA" w:sz="4"/>
+            </w:tcBorders>
+            <w:tcMar>
+              <w:top w:type="dxa" w:w="40"/>
+              <w:left w:type="dxa" w:w="80"/>
+              <w:bottom w:type="dxa" w:w="40"/>
+              <w:right w:type="dxa" w:w="80"/>
+            </w:tcMar>
+          </w:tcPr>
+          <w:p>
+            <w:r>
+              <w:rPr>
+                <w:b w:val="false"/>
+                <w:bCs w:val="false"/>
+              </w:rPr>
+              <w:t xml:space="preserve">vera_body_reference.png</w:t>
+            </w:r>
+          </w:p>
+        </w:tc>
+        <w:tc>
+          <w:tcPr>
+            <w:tcW w:type="dxa" w:w="2000"/>
+            <w:tcBorders>
+              <w:top w:val="single" w:color="BFB5AA" w:sz="4"/>
+              <w:left w:val="single" w:color="BFB5AA" w:sz="4"/>
+              <w:bottom w:val="single" w:color="BFB5AA" w:sz="4"/>
+              <w:right w:val="single" w:color="BFB5AA" w:sz="4"/>
+            </w:tcBorders>
+            <w:tcMar>
+              <w:top w:type="dxa" w:w="40"/>
+              <w:left w:type="dxa" w:w="80"/>
+              <w:bottom w:type="dxa" w:w="40"/>
+              <w:right w:type="dxa" w:w="80"/>
+            </w:tcMar>
+          </w:tcPr>
+          <w:p>
+            <w:r>
+              <w:rPr>
+                <w:b w:val="false"/>
+                <w:bCs w:val="false"/>
+              </w:rPr>
+              <w:t xml:space="preserve">тело Веры</w:t>
+            </w:r>
+          </w:p>
+        </w:tc>
+        <w:tc>
+          <w:tcPr>
+            <w:tcW w:type="dxa" w:w="3100"/>
+            <w:tcBorders>
+              <w:top w:val="single" w:color="BFB5AA" w:sz="4"/>
+              <w:left w:val="single" w:color="BFB5AA" w:sz="4"/>
+              <w:bottom w:val="single" w:color="BFB5AA" w:sz="4"/>
+              <w:right w:val="single" w:color="BFB5AA" w:sz="4"/>
+            </w:tcBorders>
+            <w:tcMar>
+              <w:top w:type="dxa" w:w="40"/>
+              <w:left w:type="dxa" w:w="80"/>
+              <w:bottom w:type="dxa" w:w="40"/>
+              <w:right w:type="dxa" w:w="80"/>
+            </w:tcMar>
+          </w:tcPr>
+          <w:p>
+            <w:r>
+              <w:rPr>
+                <w:b w:val="false"/>
+                <w:bCs w:val="false"/>
+              </w:rPr>
+              <w:t xml:space="preserve">есть</w:t>
+            </w:r>
+          </w:p>
+        </w:tc>
+        <w:tc>
+          <w:tcPr>
+            <w:tcW w:type="dxa" w:w="2038"/>
+            <w:tcBorders>
+              <w:top w:val="single" w:color="BFB5AA" w:sz="4"/>
+              <w:left w:val="single" w:color="BFB5AA" w:sz="4"/>
+              <w:bottom w:val="single" w:color="BFB5AA" w:sz="4"/>
+              <w:right w:val="single" w:color="BFB5AA" w:sz="4"/>
+            </w:tcBorders>
+            <w:tcMar>
+              <w:top w:type="dxa" w:w="40"/>
+              <w:left w:type="dxa" w:w="80"/>
+              <w:bottom w:type="dxa" w:w="40"/>
+              <w:right w:type="dxa" w:w="80"/>
+            </w:tcMar>
+          </w:tcPr>
+          <w:p>
+            <w:r>
+              <w:rPr>
+                <w:b w:val="false"/>
+                <w:bCs w:val="false"/>
+              </w:rPr>
+              <w:t xml:space="preserve">только для промпта 2.1</w:t>
             </w:r>
           </w:p>
         </w:tc>
@@ -461,79 +569,545 @@
         </w:trPr>
         <w:tc>
           <w:tcPr>
-            <w:tcW w:type="dxa" w:w="3300"/>
-            <w:tcBorders>
-              <w:top w:val="single" w:color="BFB5AA" w:sz="4"/>
-              <w:left w:val="single" w:color="BFB5AA" w:sz="4"/>
-              <w:bottom w:val="single" w:color="BFB5AA" w:sz="4"/>
-              <w:right w:val="single" w:color="BFB5AA" w:sz="4"/>
-            </w:tcBorders>
-            <w:tcMar>
-              <w:top w:type="dxa" w:w="40"/>
-              <w:left w:type="dxa" w:w="80"/>
-              <w:bottom w:type="dxa" w:w="40"/>
-              <w:right w:type="dxa" w:w="80"/>
-            </w:tcMar>
-          </w:tcPr>
-          <w:p>
-            <w:r>
-              <w:rPr>
-                <w:b w:val="false"/>
-                <w:bCs w:val="false"/>
-              </w:rPr>
-              <w:t xml:space="preserve">vera_body_reference.png</w:t>
-            </w:r>
-          </w:p>
-        </w:tc>
-        <w:tc>
-          <w:tcPr>
-            <w:tcW w:type="dxa" w:w="3600"/>
-            <w:tcBorders>
-              <w:top w:val="single" w:color="BFB5AA" w:sz="4"/>
-              <w:left w:val="single" w:color="BFB5AA" w:sz="4"/>
-              <w:bottom w:val="single" w:color="BFB5AA" w:sz="4"/>
-              <w:right w:val="single" w:color="BFB5AA" w:sz="4"/>
-            </w:tcBorders>
-            <w:tcMar>
-              <w:top w:type="dxa" w:w="40"/>
-              <w:left w:type="dxa" w:w="80"/>
-              <w:bottom w:type="dxa" w:w="40"/>
-              <w:right w:type="dxa" w:w="80"/>
-            </w:tcMar>
-          </w:tcPr>
-          <w:p>
-            <w:r>
-              <w:rPr>
-                <w:b w:val="false"/>
-                <w:bCs w:val="false"/>
-              </w:rPr>
-              <w:t xml:space="preserve">тело и пропорции</w:t>
-            </w:r>
-          </w:p>
-        </w:tc>
-        <w:tc>
-          <w:tcPr>
-            <w:tcW w:type="dxa" w:w="2738"/>
-            <w:tcBorders>
-              <w:top w:val="single" w:color="BFB5AA" w:sz="4"/>
-              <w:left w:val="single" w:color="BFB5AA" w:sz="4"/>
-              <w:bottom w:val="single" w:color="BFB5AA" w:sz="4"/>
-              <w:right w:val="single" w:color="BFB5AA" w:sz="4"/>
-            </w:tcBorders>
-            <w:tcMar>
-              <w:top w:type="dxa" w:w="40"/>
-              <w:left w:type="dxa" w:w="80"/>
-              <w:bottom w:type="dxa" w:w="40"/>
-              <w:right w:type="dxa" w:w="80"/>
-            </w:tcMar>
-          </w:tcPr>
-          <w:p>
-            <w:r>
-              <w:rPr>
-                <w:b w:val="false"/>
-                <w:bCs w:val="false"/>
-              </w:rPr>
-              <w:t xml:space="preserve">не нужен для клипов (только если делать новый костюм)</w:t>
+            <w:tcW w:type="dxa" w:w="2500"/>
+            <w:tcBorders>
+              <w:top w:val="single" w:color="BFB5AA" w:sz="4"/>
+              <w:left w:val="single" w:color="BFB5AA" w:sz="4"/>
+              <w:bottom w:val="single" w:color="BFB5AA" w:sz="4"/>
+              <w:right w:val="single" w:color="BFB5AA" w:sz="4"/>
+            </w:tcBorders>
+            <w:tcMar>
+              <w:top w:type="dxa" w:w="40"/>
+              <w:left w:type="dxa" w:w="80"/>
+              <w:bottom w:type="dxa" w:w="40"/>
+              <w:right w:type="dxa" w:w="80"/>
+            </w:tcMar>
+          </w:tcPr>
+          <w:p>
+            <w:r>
+              <w:rPr>
+                <w:b w:val="false"/>
+                <w:bCs w:val="false"/>
+              </w:rPr>
+              <w:t xml:space="preserve">vera_EP01_costume.png</w:t>
+            </w:r>
+          </w:p>
+        </w:tc>
+        <w:tc>
+          <w:tcPr>
+            <w:tcW w:type="dxa" w:w="2000"/>
+            <w:tcBorders>
+              <w:top w:val="single" w:color="BFB5AA" w:sz="4"/>
+              <w:left w:val="single" w:color="BFB5AA" w:sz="4"/>
+              <w:bottom w:val="single" w:color="BFB5AA" w:sz="4"/>
+              <w:right w:val="single" w:color="BFB5AA" w:sz="4"/>
+            </w:tcBorders>
+            <w:tcMar>
+              <w:top w:type="dxa" w:w="40"/>
+              <w:left w:type="dxa" w:w="80"/>
+              <w:bottom w:type="dxa" w:w="40"/>
+              <w:right w:type="dxa" w:w="80"/>
+            </w:tcMar>
+          </w:tcPr>
+          <w:p>
+            <w:r>
+              <w:rPr>
+                <w:b w:val="false"/>
+                <w:bCs w:val="false"/>
+              </w:rPr>
+              <w:t xml:space="preserve">Вера в костюме EP01</w:t>
+            </w:r>
+          </w:p>
+        </w:tc>
+        <w:tc>
+          <w:tcPr>
+            <w:tcW w:type="dxa" w:w="3100"/>
+            <w:tcBorders>
+              <w:top w:val="single" w:color="BFB5AA" w:sz="4"/>
+              <w:left w:val="single" w:color="BFB5AA" w:sz="4"/>
+              <w:bottom w:val="single" w:color="BFB5AA" w:sz="4"/>
+              <w:right w:val="single" w:color="BFB5AA" w:sz="4"/>
+            </w:tcBorders>
+            <w:tcMar>
+              <w:top w:type="dxa" w:w="40"/>
+              <w:left w:type="dxa" w:w="80"/>
+              <w:bottom w:type="dxa" w:w="40"/>
+              <w:right w:type="dxa" w:w="80"/>
+            </w:tcMar>
+          </w:tcPr>
+          <w:p>
+            <w:r>
+              <w:rPr>
+                <w:b w:val="false"/>
+                <w:bCs w:val="false"/>
+              </w:rPr>
+              <w:t xml:space="preserve">есть кадр из клипа 01 (vera_EP01_costume_from_K01.png) — можно использовать его; или сделать чистый по 2.1</w:t>
+            </w:r>
+          </w:p>
+        </w:tc>
+        <w:tc>
+          <w:tcPr>
+            <w:tcW w:type="dxa" w:w="2038"/>
+            <w:tcBorders>
+              <w:top w:val="single" w:color="BFB5AA" w:sz="4"/>
+              <w:left w:val="single" w:color="BFB5AA" w:sz="4"/>
+              <w:bottom w:val="single" w:color="BFB5AA" w:sz="4"/>
+              <w:right w:val="single" w:color="BFB5AA" w:sz="4"/>
+            </w:tcBorders>
+            <w:tcMar>
+              <w:top w:type="dxa" w:w="40"/>
+              <w:left w:type="dxa" w:w="80"/>
+              <w:bottom w:type="dxa" w:w="40"/>
+              <w:right w:type="dxa" w:w="80"/>
+            </w:tcMar>
+          </w:tcPr>
+          <w:p>
+            <w:r>
+              <w:rPr>
+                <w:b w:val="false"/>
+                <w:bCs w:val="false"/>
+              </w:rPr>
+              <w:t xml:space="preserve">всех 12</w:t>
+            </w:r>
+          </w:p>
+        </w:tc>
+      </w:tr>
+      <w:tr>
+        <w:trPr>
+          <w:cantSplit/>
+          <w:tblHeader w:val="false"/>
+        </w:trPr>
+        <w:tc>
+          <w:tcPr>
+            <w:tcW w:type="dxa" w:w="2500"/>
+            <w:tcBorders>
+              <w:top w:val="single" w:color="BFB5AA" w:sz="4"/>
+              <w:left w:val="single" w:color="BFB5AA" w:sz="4"/>
+              <w:bottom w:val="single" w:color="BFB5AA" w:sz="4"/>
+              <w:right w:val="single" w:color="BFB5AA" w:sz="4"/>
+            </w:tcBorders>
+            <w:tcMar>
+              <w:top w:type="dxa" w:w="40"/>
+              <w:left w:type="dxa" w:w="80"/>
+              <w:bottom w:type="dxa" w:w="40"/>
+              <w:right w:type="dxa" w:w="80"/>
+            </w:tcMar>
+          </w:tcPr>
+          <w:p>
+            <w:r>
+              <w:rPr>
+                <w:b w:val="false"/>
+                <w:bCs w:val="false"/>
+              </w:rPr>
+              <w:t xml:space="preserve">loc_unit4_night.png</w:t>
+            </w:r>
+          </w:p>
+        </w:tc>
+        <w:tc>
+          <w:tcPr>
+            <w:tcW w:type="dxa" w:w="2000"/>
+            <w:tcBorders>
+              <w:top w:val="single" w:color="BFB5AA" w:sz="4"/>
+              <w:left w:val="single" w:color="BFB5AA" w:sz="4"/>
+              <w:bottom w:val="single" w:color="BFB5AA" w:sz="4"/>
+              <w:right w:val="single" w:color="BFB5AA" w:sz="4"/>
+            </w:tcBorders>
+            <w:tcMar>
+              <w:top w:type="dxa" w:w="40"/>
+              <w:left w:type="dxa" w:w="80"/>
+              <w:bottom w:type="dxa" w:w="40"/>
+              <w:right w:type="dxa" w:w="80"/>
+            </w:tcMar>
+          </w:tcPr>
+          <w:p>
+            <w:r>
+              <w:rPr>
+                <w:b w:val="false"/>
+                <w:bCs w:val="false"/>
+              </w:rPr>
+              <w:t xml:space="preserve">станция ночью</w:t>
+            </w:r>
+          </w:p>
+        </w:tc>
+        <w:tc>
+          <w:tcPr>
+            <w:tcW w:type="dxa" w:w="3100"/>
+            <w:tcBorders>
+              <w:top w:val="single" w:color="BFB5AA" w:sz="4"/>
+              <w:left w:val="single" w:color="BFB5AA" w:sz="4"/>
+              <w:bottom w:val="single" w:color="BFB5AA" w:sz="4"/>
+              <w:right w:val="single" w:color="BFB5AA" w:sz="4"/>
+            </w:tcBorders>
+            <w:tcMar>
+              <w:top w:type="dxa" w:w="40"/>
+              <w:left w:type="dxa" w:w="80"/>
+              <w:bottom w:type="dxa" w:w="40"/>
+              <w:right w:type="dxa" w:w="80"/>
+            </w:tcMar>
+          </w:tcPr>
+          <w:p>
+            <w:r>
+              <w:rPr>
+                <w:b w:val="false"/>
+                <w:bCs w:val="false"/>
+              </w:rPr>
+              <w:t xml:space="preserve">сделать (2.2)</w:t>
+            </w:r>
+          </w:p>
+        </w:tc>
+        <w:tc>
+          <w:tcPr>
+            <w:tcW w:type="dxa" w:w="2038"/>
+            <w:tcBorders>
+              <w:top w:val="single" w:color="BFB5AA" w:sz="4"/>
+              <w:left w:val="single" w:color="BFB5AA" w:sz="4"/>
+              <w:bottom w:val="single" w:color="BFB5AA" w:sz="4"/>
+              <w:right w:val="single" w:color="BFB5AA" w:sz="4"/>
+            </w:tcBorders>
+            <w:tcMar>
+              <w:top w:type="dxa" w:w="40"/>
+              <w:left w:type="dxa" w:w="80"/>
+              <w:bottom w:type="dxa" w:w="40"/>
+              <w:right w:type="dxa" w:w="80"/>
+            </w:tcMar>
+          </w:tcPr>
+          <w:p>
+            <w:r>
+              <w:rPr>
+                <w:b w:val="false"/>
+                <w:bCs w:val="false"/>
+              </w:rPr>
+              <w:t xml:space="preserve">01, 06, 07</w:t>
+            </w:r>
+          </w:p>
+        </w:tc>
+      </w:tr>
+      <w:tr>
+        <w:trPr>
+          <w:cantSplit/>
+          <w:tblHeader w:val="false"/>
+        </w:trPr>
+        <w:tc>
+          <w:tcPr>
+            <w:tcW w:type="dxa" w:w="2500"/>
+            <w:tcBorders>
+              <w:top w:val="single" w:color="BFB5AA" w:sz="4"/>
+              <w:left w:val="single" w:color="BFB5AA" w:sz="4"/>
+              <w:bottom w:val="single" w:color="BFB5AA" w:sz="4"/>
+              <w:right w:val="single" w:color="BFB5AA" w:sz="4"/>
+            </w:tcBorders>
+            <w:tcMar>
+              <w:top w:type="dxa" w:w="40"/>
+              <w:left w:type="dxa" w:w="80"/>
+              <w:bottom w:type="dxa" w:w="40"/>
+              <w:right w:type="dxa" w:w="80"/>
+            </w:tcMar>
+          </w:tcPr>
+          <w:p>
+            <w:r>
+              <w:rPr>
+                <w:b w:val="false"/>
+                <w:bCs w:val="false"/>
+              </w:rPr>
+              <w:t xml:space="preserve">loc_control_room.png</w:t>
+            </w:r>
+          </w:p>
+        </w:tc>
+        <w:tc>
+          <w:tcPr>
+            <w:tcW w:type="dxa" w:w="2000"/>
+            <w:tcBorders>
+              <w:top w:val="single" w:color="BFB5AA" w:sz="4"/>
+              <w:left w:val="single" w:color="BFB5AA" w:sz="4"/>
+              <w:bottom w:val="single" w:color="BFB5AA" w:sz="4"/>
+              <w:right w:val="single" w:color="BFB5AA" w:sz="4"/>
+            </w:tcBorders>
+            <w:tcMar>
+              <w:top w:type="dxa" w:w="40"/>
+              <w:left w:type="dxa" w:w="80"/>
+              <w:bottom w:type="dxa" w:w="40"/>
+              <w:right w:type="dxa" w:w="80"/>
+            </w:tcMar>
+          </w:tcPr>
+          <w:p>
+            <w:r>
+              <w:rPr>
+                <w:b w:val="false"/>
+                <w:bCs w:val="false"/>
+              </w:rPr>
+              <w:t xml:space="preserve">блочный щит</w:t>
+            </w:r>
+          </w:p>
+        </w:tc>
+        <w:tc>
+          <w:tcPr>
+            <w:tcW w:type="dxa" w:w="3100"/>
+            <w:tcBorders>
+              <w:top w:val="single" w:color="BFB5AA" w:sz="4"/>
+              <w:left w:val="single" w:color="BFB5AA" w:sz="4"/>
+              <w:bottom w:val="single" w:color="BFB5AA" w:sz="4"/>
+              <w:right w:val="single" w:color="BFB5AA" w:sz="4"/>
+            </w:tcBorders>
+            <w:tcMar>
+              <w:top w:type="dxa" w:w="40"/>
+              <w:left w:type="dxa" w:w="80"/>
+              <w:bottom w:type="dxa" w:w="40"/>
+              <w:right w:type="dxa" w:w="80"/>
+            </w:tcMar>
+          </w:tcPr>
+          <w:p>
+            <w:r>
+              <w:rPr>
+                <w:b w:val="false"/>
+                <w:bCs w:val="false"/>
+              </w:rPr>
+              <w:t xml:space="preserve">сделать (2.3)</w:t>
+            </w:r>
+          </w:p>
+        </w:tc>
+        <w:tc>
+          <w:tcPr>
+            <w:tcW w:type="dxa" w:w="2038"/>
+            <w:tcBorders>
+              <w:top w:val="single" w:color="BFB5AA" w:sz="4"/>
+              <w:left w:val="single" w:color="BFB5AA" w:sz="4"/>
+              <w:bottom w:val="single" w:color="BFB5AA" w:sz="4"/>
+              <w:right w:val="single" w:color="BFB5AA" w:sz="4"/>
+            </w:tcBorders>
+            <w:tcMar>
+              <w:top w:type="dxa" w:w="40"/>
+              <w:left w:type="dxa" w:w="80"/>
+              <w:bottom w:type="dxa" w:w="40"/>
+              <w:right w:type="dxa" w:w="80"/>
+            </w:tcMar>
+          </w:tcPr>
+          <w:p>
+            <w:r>
+              <w:rPr>
+                <w:b w:val="false"/>
+                <w:bCs w:val="false"/>
+              </w:rPr>
+              <w:t xml:space="preserve">02, 03, 04, 05</w:t>
+            </w:r>
+          </w:p>
+        </w:tc>
+      </w:tr>
+      <w:tr>
+        <w:trPr>
+          <w:cantSplit/>
+          <w:tblHeader w:val="false"/>
+        </w:trPr>
+        <w:tc>
+          <w:tcPr>
+            <w:tcW w:type="dxa" w:w="2500"/>
+            <w:tcBorders>
+              <w:top w:val="single" w:color="BFB5AA" w:sz="4"/>
+              <w:left w:val="single" w:color="BFB5AA" w:sz="4"/>
+              <w:bottom w:val="single" w:color="BFB5AA" w:sz="4"/>
+              <w:right w:val="single" w:color="BFB5AA" w:sz="4"/>
+            </w:tcBorders>
+            <w:tcMar>
+              <w:top w:type="dxa" w:w="40"/>
+              <w:left w:type="dxa" w:w="80"/>
+              <w:bottom w:type="dxa" w:w="40"/>
+              <w:right w:type="dxa" w:w="80"/>
+            </w:tcMar>
+          </w:tcPr>
+          <w:p>
+            <w:r>
+              <w:rPr>
+                <w:b w:val="false"/>
+                <w:bCs w:val="false"/>
+              </w:rPr>
+              <w:t xml:space="preserve">ref_firefighter.png</w:t>
+            </w:r>
+          </w:p>
+        </w:tc>
+        <w:tc>
+          <w:tcPr>
+            <w:tcW w:type="dxa" w:w="2000"/>
+            <w:tcBorders>
+              <w:top w:val="single" w:color="BFB5AA" w:sz="4"/>
+              <w:left w:val="single" w:color="BFB5AA" w:sz="4"/>
+              <w:bottom w:val="single" w:color="BFB5AA" w:sz="4"/>
+              <w:right w:val="single" w:color="BFB5AA" w:sz="4"/>
+            </w:tcBorders>
+            <w:tcMar>
+              <w:top w:type="dxa" w:w="40"/>
+              <w:left w:type="dxa" w:w="80"/>
+              <w:bottom w:type="dxa" w:w="40"/>
+              <w:right w:type="dxa" w:w="80"/>
+            </w:tcMar>
+          </w:tcPr>
+          <w:p>
+            <w:r>
+              <w:rPr>
+                <w:b w:val="false"/>
+                <w:bCs w:val="false"/>
+              </w:rPr>
+              <w:t xml:space="preserve">пожарный 1986</w:t>
+            </w:r>
+          </w:p>
+        </w:tc>
+        <w:tc>
+          <w:tcPr>
+            <w:tcW w:type="dxa" w:w="3100"/>
+            <w:tcBorders>
+              <w:top w:val="single" w:color="BFB5AA" w:sz="4"/>
+              <w:left w:val="single" w:color="BFB5AA" w:sz="4"/>
+              <w:bottom w:val="single" w:color="BFB5AA" w:sz="4"/>
+              <w:right w:val="single" w:color="BFB5AA" w:sz="4"/>
+            </w:tcBorders>
+            <w:tcMar>
+              <w:top w:type="dxa" w:w="40"/>
+              <w:left w:type="dxa" w:w="80"/>
+              <w:bottom w:type="dxa" w:w="40"/>
+              <w:right w:type="dxa" w:w="80"/>
+            </w:tcMar>
+          </w:tcPr>
+          <w:p>
+            <w:r>
+              <w:rPr>
+                <w:b w:val="false"/>
+                <w:bCs w:val="false"/>
+              </w:rPr>
+              <w:t xml:space="preserve">сделать (2.4)</w:t>
+            </w:r>
+          </w:p>
+        </w:tc>
+        <w:tc>
+          <w:tcPr>
+            <w:tcW w:type="dxa" w:w="2038"/>
+            <w:tcBorders>
+              <w:top w:val="single" w:color="BFB5AA" w:sz="4"/>
+              <w:left w:val="single" w:color="BFB5AA" w:sz="4"/>
+              <w:bottom w:val="single" w:color="BFB5AA" w:sz="4"/>
+              <w:right w:val="single" w:color="BFB5AA" w:sz="4"/>
+            </w:tcBorders>
+            <w:tcMar>
+              <w:top w:type="dxa" w:w="40"/>
+              <w:left w:type="dxa" w:w="80"/>
+              <w:bottom w:type="dxa" w:w="40"/>
+              <w:right w:type="dxa" w:w="80"/>
+            </w:tcMar>
+          </w:tcPr>
+          <w:p>
+            <w:r>
+              <w:rPr>
+                <w:b w:val="false"/>
+                <w:bCs w:val="false"/>
+              </w:rPr>
+              <w:t xml:space="preserve">08, 09</w:t>
+            </w:r>
+          </w:p>
+        </w:tc>
+      </w:tr>
+      <w:tr>
+        <w:trPr>
+          <w:cantSplit/>
+          <w:tblHeader w:val="false"/>
+        </w:trPr>
+        <w:tc>
+          <w:tcPr>
+            <w:tcW w:type="dxa" w:w="2500"/>
+            <w:tcBorders>
+              <w:top w:val="single" w:color="BFB5AA" w:sz="4"/>
+              <w:left w:val="single" w:color="BFB5AA" w:sz="4"/>
+              <w:bottom w:val="single" w:color="BFB5AA" w:sz="4"/>
+              <w:right w:val="single" w:color="BFB5AA" w:sz="4"/>
+            </w:tcBorders>
+            <w:tcMar>
+              <w:top w:type="dxa" w:w="40"/>
+              <w:left w:type="dxa" w:w="80"/>
+              <w:bottom w:type="dxa" w:w="40"/>
+              <w:right w:type="dxa" w:w="80"/>
+            </w:tcMar>
+          </w:tcPr>
+          <w:p>
+            <w:r>
+              <w:rPr>
+                <w:b w:val="false"/>
+                <w:bCs w:val="false"/>
+              </w:rPr>
+              <w:t xml:space="preserve">loc_pripyat_street.png</w:t>
+            </w:r>
+          </w:p>
+        </w:tc>
+        <w:tc>
+          <w:tcPr>
+            <w:tcW w:type="dxa" w:w="2000"/>
+            <w:tcBorders>
+              <w:top w:val="single" w:color="BFB5AA" w:sz="4"/>
+              <w:left w:val="single" w:color="BFB5AA" w:sz="4"/>
+              <w:bottom w:val="single" w:color="BFB5AA" w:sz="4"/>
+              <w:right w:val="single" w:color="BFB5AA" w:sz="4"/>
+            </w:tcBorders>
+            <w:tcMar>
+              <w:top w:type="dxa" w:w="40"/>
+              <w:left w:type="dxa" w:w="80"/>
+              <w:bottom w:type="dxa" w:w="40"/>
+              <w:right w:type="dxa" w:w="80"/>
+            </w:tcMar>
+          </w:tcPr>
+          <w:p>
+            <w:r>
+              <w:rPr>
+                <w:b w:val="false"/>
+                <w:bCs w:val="false"/>
+              </w:rPr>
+              <w:t xml:space="preserve">улица Припяти</w:t>
+            </w:r>
+          </w:p>
+        </w:tc>
+        <w:tc>
+          <w:tcPr>
+            <w:tcW w:type="dxa" w:w="3100"/>
+            <w:tcBorders>
+              <w:top w:val="single" w:color="BFB5AA" w:sz="4"/>
+              <w:left w:val="single" w:color="BFB5AA" w:sz="4"/>
+              <w:bottom w:val="single" w:color="BFB5AA" w:sz="4"/>
+              <w:right w:val="single" w:color="BFB5AA" w:sz="4"/>
+            </w:tcBorders>
+            <w:tcMar>
+              <w:top w:type="dxa" w:w="40"/>
+              <w:left w:type="dxa" w:w="80"/>
+              <w:bottom w:type="dxa" w:w="40"/>
+              <w:right w:type="dxa" w:w="80"/>
+            </w:tcMar>
+          </w:tcPr>
+          <w:p>
+            <w:r>
+              <w:rPr>
+                <w:b w:val="false"/>
+                <w:bCs w:val="false"/>
+              </w:rPr>
+              <w:t xml:space="preserve">сделать (2.5)</w:t>
+            </w:r>
+          </w:p>
+        </w:tc>
+        <w:tc>
+          <w:tcPr>
+            <w:tcW w:type="dxa" w:w="2038"/>
+            <w:tcBorders>
+              <w:top w:val="single" w:color="BFB5AA" w:sz="4"/>
+              <w:left w:val="single" w:color="BFB5AA" w:sz="4"/>
+              <w:bottom w:val="single" w:color="BFB5AA" w:sz="4"/>
+              <w:right w:val="single" w:color="BFB5AA" w:sz="4"/>
+            </w:tcBorders>
+            <w:tcMar>
+              <w:top w:type="dxa" w:w="40"/>
+              <w:left w:type="dxa" w:w="80"/>
+              <w:bottom w:type="dxa" w:w="40"/>
+              <w:right w:type="dxa" w:w="80"/>
+            </w:tcMar>
+          </w:tcPr>
+          <w:p>
+            <w:r>
+              <w:rPr>
+                <w:b w:val="false"/>
+                <w:bCs w:val="false"/>
+              </w:rPr>
+              <w:t xml:space="preserve">10, 11, 12</w:t>
             </w:r>
           </w:p>
         </w:tc>
@@ -541,10 +1115,122 @@
     </w:tbl>
     <w:p>
       <w:pPr>
-        <w:spacing w:after="80"/>
-      </w:pPr>
-      <w:r>
-        <w:t xml:space="preserve">Промпты ссылаются на них словами «the uploaded face image» и «the uploaded costume image» — ничего в тексте менять не нужно.</w:t>
+        <w:pStyle w:val="Heading2"/>
+        <w:keepNext/>
+      </w:pPr>
+      <w:r>
+        <w:t xml:space="preserve">2.1. Вера в костюме — vera_EP01_costume.png (приложить vera_face_reference.png + vera_body_reference.png; если хватает кадра из клипа 01 — пропустить)</w:t>
+      </w:r>
+    </w:p>
+    <w:p>
+      <w:pPr>
+        <w:shd w:fill="F2EFEA" w:color="auto" w:val="clear"/>
+        <w:spacing w:after="120"/>
+        <w:ind w:left="120" w:right="120"/>
+      </w:pPr>
+      <w:r>
+        <w:rPr>
+          <w:rFonts w:ascii="Consolas" w:cs="Consolas" w:eastAsia="Consolas" w:hAnsi="Consolas"/>
+          <w:sz w:val="16"/>
+          <w:szCs w:val="16"/>
+        </w:rPr>
+        <w:t xml:space="preserve">Use the uploaded face image as the strict identity reference and the uploaded body image as the reference for body shape and proportions of the same woman, Vera. Keep exactly the same face, adult woman about 25, grey-green eyes, small mole under the eye, light freckles, dark-brown shoulder-length wavy hair, natural slim adult proportions. Dress her in a Soviet-era 1986 outfit: long dark worn wool coat, wine-red scarf, brass compass-rose brooch on the coat, dark waistcoat, light shirt, leather belt, brown leather shoulder bag, dark trousers or skirt and leather boots. Full-body front view, relaxed neutral pose, plain light warm-grey studio background, soft even lighting. Semi-realistic cinematic 3D/2.5D animation style with a subtle painterly texture; not cartoonish, not photorealistic. Single character only, no text, no logos, no watermark.</w:t>
+      </w:r>
+    </w:p>
+    <w:p>
+      <w:pPr>
+        <w:pStyle w:val="Heading2"/>
+        <w:keepNext/>
+      </w:pPr>
+      <w:r>
+        <w:t xml:space="preserve">2.2. Станция ночью — loc_unit4_night.png (без картинок, только промпт)</w:t>
+      </w:r>
+    </w:p>
+    <w:p>
+      <w:pPr>
+        <w:shd w:fill="F2EFEA" w:color="auto" w:val="clear"/>
+        <w:spacing w:after="120"/>
+        <w:ind w:left="120" w:right="120"/>
+      </w:pPr>
+      <w:r>
+        <w:rPr>
+          <w:rFonts w:ascii="Consolas" w:cs="Consolas" w:eastAsia="Consolas" w:hAnsi="Consolas"/>
+          <w:sz w:val="16"/>
+          <w:szCs w:val="16"/>
+        </w:rPr>
+        <w:t xml:space="preserve">Vertical 9:16 wide establishing image of a large Soviet nuclear power plant at night in spring 1986: long rectangular concrete reactor building of unit 4 with a tall red-and-white striped ventilation stack beside it, a long turbine hall in front, sodium street lamps, a few lit windows, power lines, flat landscape, clear dark-blue night sky. No people. Semi-realistic cinematic 3D/2.5D animation with a subtle painterly texture, natural motivated lighting, atmospheric depth. No text, no letters, no logos, no watermark.</w:t>
+      </w:r>
+    </w:p>
+    <w:p>
+      <w:pPr>
+        <w:pStyle w:val="Heading2"/>
+        <w:keepNext/>
+      </w:pPr>
+      <w:r>
+        <w:t xml:space="preserve">2.3. Блочный щит — loc_control_room.png</w:t>
+      </w:r>
+    </w:p>
+    <w:p>
+      <w:pPr>
+        <w:shd w:fill="F2EFEA" w:color="auto" w:val="clear"/>
+        <w:spacing w:after="120"/>
+        <w:ind w:left="120" w:right="120"/>
+      </w:pPr>
+      <w:r>
+        <w:rPr>
+          <w:rFonts w:ascii="Consolas" w:cs="Consolas" w:eastAsia="Consolas" w:hAnsi="Consolas"/>
+          <w:sz w:val="16"/>
+          <w:szCs w:val="16"/>
+        </w:rPr>
+        <w:t xml:space="preserve">Vertical 9:16 image of a Soviet nuclear power plant unit control room at night in 1986: long grey-green control desks with rows of switches, round analogue gauges and small indicator lamps, a large wall panel covered with a circular grid of small lamps, cold fluorescent ceiling light, linoleum floor, no windows. No people. Semi-realistic cinematic 3D/2.5D animation with a subtle painterly texture, natural motivated lighting, atmospheric depth. No text, no letters, no labels with readable writing, no logos, no watermark.</w:t>
+      </w:r>
+    </w:p>
+    <w:p>
+      <w:pPr>
+        <w:pStyle w:val="Heading2"/>
+        <w:keepNext/>
+      </w:pPr>
+      <w:r>
+        <w:t xml:space="preserve">2.4. Пожарный 1986 — ref_firefighter.png</w:t>
+      </w:r>
+    </w:p>
+    <w:p>
+      <w:pPr>
+        <w:shd w:fill="F2EFEA" w:color="auto" w:val="clear"/>
+        <w:spacing w:after="120"/>
+        <w:ind w:left="120" w:right="120"/>
+      </w:pPr>
+      <w:r>
+        <w:rPr>
+          <w:rFonts w:ascii="Consolas" w:cs="Consolas" w:eastAsia="Consolas" w:hAnsi="Consolas"/>
+          <w:sz w:val="16"/>
+          <w:szCs w:val="16"/>
+        </w:rPr>
+        <w:t xml:space="preserve">Vertical 9:16 full-body reference image of a Soviet firefighter in 1986, a man in his twenties: dark canvas firefighter turnout coat with a wide belt, canvas trousers, rubber boots, a simple dark fire helmet, no respirator mask, holding a folded canvas fire hose. Plain light warm-grey background, soft even light. Semi-realistic cinematic 3D/2.5D animation with a subtle painterly texture, natural adult proportions. Single character only, no text, no badges with readable writing, no logos, no watermark.</w:t>
+      </w:r>
+    </w:p>
+    <w:p>
+      <w:pPr>
+        <w:pStyle w:val="Heading2"/>
+        <w:keepNext/>
+      </w:pPr>
+      <w:r>
+        <w:t xml:space="preserve">2.5. Улица Припяти — loc_pripyat_street.png</w:t>
+      </w:r>
+    </w:p>
+    <w:p>
+      <w:pPr>
+        <w:shd w:fill="F2EFEA" w:color="auto" w:val="clear"/>
+        <w:spacing w:after="120"/>
+        <w:ind w:left="120" w:right="120"/>
+      </w:pPr>
+      <w:r>
+        <w:rPr>
+          <w:rFonts w:ascii="Consolas" w:cs="Consolas" w:eastAsia="Consolas" w:hAnsi="Consolas"/>
+          <w:sz w:val="16"/>
+          <w:szCs w:val="16"/>
+        </w:rPr>
+        <w:t xml:space="preserve">Vertical 9:16 image of a residential street in a young Soviet city in April 1986: nine- and sixteen-storey white panel apartment blocks, wide pavements, young poplar trees with first green leaves, a bus stop shelter, simple street lamps, early morning soft light. No people, no cars. Semi-realistic cinematic 3D/2.5D animation with a subtle painterly texture, natural lighting. No text, no letters, no signs with readable writing, no logos, no watermark.</w:t>
       </w:r>
     </w:p>
     <w:p>
@@ -2722,6 +3408,7 @@
     </w:p>
     <w:p>
       <w:pPr>
+        <w:shd w:fill="FFF4D6" w:color="auto" w:val="clear"/>
         <w:spacing w:after="80"/>
       </w:pPr>
       <w:r>
@@ -2729,6 +3416,31 @@
           <w:b/>
           <w:bCs/>
         </w:rPr>
+        <w:t xml:space="preserve">Что подготовить:</w:t>
+      </w:r>
+      <w:r>
+        <w:t xml:space="preserve"> картинка loc_unit4_night.png (станция ночью, 2.2)  </w:t>
+      </w:r>
+      <w:r>
+        <w:rPr>
+          <w:b/>
+          <w:bCs/>
+        </w:rPr>
+        <w:t xml:space="preserve">Вставить в Ingredients (3 шт.):</w:t>
+      </w:r>
+      <w:r>
+        <w:t xml:space="preserve"> 1) vera_face_reference.png  2) vera_EP01_costume (или кадр из клипа 01)  3) loc_unit4_night.png</w:t>
+      </w:r>
+    </w:p>
+    <w:p>
+      <w:pPr>
+        <w:spacing w:after="80"/>
+      </w:pPr>
+      <w:r>
+        <w:rPr>
+          <w:b/>
+          <w:bCs/>
+        </w:rPr>
         <w:t xml:space="preserve">Реплика:</w:t>
       </w:r>
       <w:r>
@@ -2762,7 +3474,7 @@
           <w:sz w:val="16"/>
           <w:szCs w:val="16"/>
         </w:rPr>
-        <w:t xml:space="preserve">[REFERENCES] Use the uploaded face image as Vera's exact identity and the uploaded costume image as her exact outfit. Keep identical in every frame: adult woman about 25, grey-green eyes, small mole under the eye, light freckles, dark-brown shoulder-length wavy hair, natural slim adult proportions; long dark worn coat, wine-red scarf, brass compass-rose brooch, dark waistcoat, light shirt.</w:t>
+        <w:t xml:space="preserve">[REFERENCES] Use the uploaded face image as Vera's exact identity and the uploaded costume image as her exact outfit. Keep identical in every frame: adult woman about 25, grey-green eyes, small mole under the eye, light freckles, dark-brown shoulder-length wavy hair, natural slim adult proportions; long dark worn coat, wine-red scarf, brass compass-rose brooch, dark waistcoat, light shirt. Use the uploaded location image as the exact look of the power plant buildings and the setting.</w:t>
       </w:r>
     </w:p>
     <w:p>
@@ -2926,6 +3638,7 @@
     </w:p>
     <w:p>
       <w:pPr>
+        <w:shd w:fill="FFF4D6" w:color="auto" w:val="clear"/>
         <w:spacing w:after="80"/>
       </w:pPr>
       <w:r>
@@ -2933,6 +3646,31 @@
           <w:b/>
           <w:bCs/>
         </w:rPr>
+        <w:t xml:space="preserve">Что подготовить:</w:t>
+      </w:r>
+      <w:r>
+        <w:t xml:space="preserve"> картинка loc_control_room.png (блочный щит, 2.3)  </w:t>
+      </w:r>
+      <w:r>
+        <w:rPr>
+          <w:b/>
+          <w:bCs/>
+        </w:rPr>
+        <w:t xml:space="preserve">Вставить в Ingredients (3 шт.):</w:t>
+      </w:r>
+      <w:r>
+        <w:t xml:space="preserve"> 1) vera_face_reference.png  2) vera_EP01_costume (или кадр из клипа 01)  3) loc_control_room.png</w:t>
+      </w:r>
+    </w:p>
+    <w:p>
+      <w:pPr>
+        <w:spacing w:after="80"/>
+      </w:pPr>
+      <w:r>
+        <w:rPr>
+          <w:b/>
+          <w:bCs/>
+        </w:rPr>
         <w:t xml:space="preserve">Реплика:</w:t>
       </w:r>
       <w:r>
@@ -2966,7 +3704,7 @@
           <w:sz w:val="16"/>
           <w:szCs w:val="16"/>
         </w:rPr>
-        <w:t xml:space="preserve">[REFERENCES] Use the uploaded face image as Vera's exact identity and the uploaded costume image as her exact outfit. Keep identical in every frame: adult woman about 25, grey-green eyes, small mole under the eye, light freckles, dark-brown shoulder-length wavy hair, natural slim adult proportions; long dark worn coat, wine-red scarf, brass compass-rose brooch, dark waistcoat, light shirt.</w:t>
+        <w:t xml:space="preserve">[REFERENCES] Use the uploaded face image as Vera's exact identity and the uploaded costume image as her exact outfit. Keep identical in every frame: adult woman about 25, grey-green eyes, small mole under the eye, light freckles, dark-brown shoulder-length wavy hair, natural slim adult proportions; long dark worn coat, wine-red scarf, brass compass-rose brooch, dark waistcoat, light shirt. Use the uploaded location image as the exact look of the control room.</w:t>
       </w:r>
     </w:p>
     <w:p>
@@ -3130,6 +3868,7 @@
     </w:p>
     <w:p>
       <w:pPr>
+        <w:shd w:fill="FFF4D6" w:color="auto" w:val="clear"/>
         <w:spacing w:after="80"/>
       </w:pPr>
       <w:r>
@@ -3137,6 +3876,31 @@
           <w:b/>
           <w:bCs/>
         </w:rPr>
+        <w:t xml:space="preserve">Что подготовить:</w:t>
+      </w:r>
+      <w:r>
+        <w:t xml:space="preserve"> картинка loc_control_room.png (блочный щит, 2.3)  </w:t>
+      </w:r>
+      <w:r>
+        <w:rPr>
+          <w:b/>
+          <w:bCs/>
+        </w:rPr>
+        <w:t xml:space="preserve">Вставить в Ingredients (3 шт.):</w:t>
+      </w:r>
+      <w:r>
+        <w:t xml:space="preserve"> 1) vera_face_reference.png  2) vera_EP01_costume (или кадр из клипа 01)  3) loc_control_room.png</w:t>
+      </w:r>
+    </w:p>
+    <w:p>
+      <w:pPr>
+        <w:spacing w:after="80"/>
+      </w:pPr>
+      <w:r>
+        <w:rPr>
+          <w:b/>
+          <w:bCs/>
+        </w:rPr>
         <w:t xml:space="preserve">Реплика:</w:t>
       </w:r>
       <w:r>
@@ -3170,7 +3934,7 @@
           <w:sz w:val="16"/>
           <w:szCs w:val="16"/>
         </w:rPr>
-        <w:t xml:space="preserve">[REFERENCES] Use the uploaded face image as Vera's exact identity and the uploaded costume image as her exact outfit. Keep identical in every frame: adult woman about 25, grey-green eyes, small mole under the eye, light freckles, dark-brown shoulder-length wavy hair, natural slim adult proportions; long dark worn coat, wine-red scarf, brass compass-rose brooch, dark waistcoat, light shirt.</w:t>
+        <w:t xml:space="preserve">[REFERENCES] Use the uploaded face image as Vera's exact identity and the uploaded costume image as her exact outfit. Keep identical in every frame: adult woman about 25, grey-green eyes, small mole under the eye, light freckles, dark-brown shoulder-length wavy hair, natural slim adult proportions; long dark worn coat, wine-red scarf, brass compass-rose brooch, dark waistcoat, light shirt. Use the uploaded location image as the exact look of the control room.</w:t>
       </w:r>
     </w:p>
     <w:p>
@@ -3334,6 +4098,7 @@
     </w:p>
     <w:p>
       <w:pPr>
+        <w:shd w:fill="FFF4D6" w:color="auto" w:val="clear"/>
         <w:spacing w:after="80"/>
       </w:pPr>
       <w:r>
@@ -3341,6 +4106,31 @@
           <w:b/>
           <w:bCs/>
         </w:rPr>
+        <w:t xml:space="preserve">Что подготовить:</w:t>
+      </w:r>
+      <w:r>
+        <w:t xml:space="preserve"> картинка loc_control_room.png (блочный щит, 2.3)  </w:t>
+      </w:r>
+      <w:r>
+        <w:rPr>
+          <w:b/>
+          <w:bCs/>
+        </w:rPr>
+        <w:t xml:space="preserve">Вставить в Ingredients (3 шт.):</w:t>
+      </w:r>
+      <w:r>
+        <w:t xml:space="preserve"> 1) vera_face_reference.png  2) vera_EP01_costume (или кадр из клипа 01)  3) loc_control_room.png</w:t>
+      </w:r>
+    </w:p>
+    <w:p>
+      <w:pPr>
+        <w:spacing w:after="80"/>
+      </w:pPr>
+      <w:r>
+        <w:rPr>
+          <w:b/>
+          <w:bCs/>
+        </w:rPr>
         <w:t xml:space="preserve">Реплика:</w:t>
       </w:r>
       <w:r>
@@ -3374,7 +4164,7 @@
           <w:sz w:val="16"/>
           <w:szCs w:val="16"/>
         </w:rPr>
-        <w:t xml:space="preserve">[REFERENCES] Use the uploaded face image as Vera's exact identity and the uploaded costume image as her exact outfit. Keep identical in every frame: adult woman about 25, grey-green eyes, small mole under the eye, light freckles, dark-brown shoulder-length wavy hair, natural slim adult proportions; long dark worn coat, wine-red scarf, brass compass-rose brooch, dark waistcoat, light shirt.</w:t>
+        <w:t xml:space="preserve">[REFERENCES] Use the uploaded face image as Vera's exact identity and the uploaded costume image as her exact outfit. Keep identical in every frame: adult woman about 25, grey-green eyes, small mole under the eye, light freckles, dark-brown shoulder-length wavy hair, natural slim adult proportions; long dark worn coat, wine-red scarf, brass compass-rose brooch, dark waistcoat, light shirt. Use the uploaded location image as the exact look of the control room.</w:t>
       </w:r>
     </w:p>
     <w:p>
@@ -3538,6 +4328,7 @@
     </w:p>
     <w:p>
       <w:pPr>
+        <w:shd w:fill="FFF4D6" w:color="auto" w:val="clear"/>
         <w:spacing w:after="80"/>
       </w:pPr>
       <w:r>
@@ -3545,6 +4336,31 @@
           <w:b/>
           <w:bCs/>
         </w:rPr>
+        <w:t xml:space="preserve">Что подготовить:</w:t>
+      </w:r>
+      <w:r>
+        <w:t xml:space="preserve"> картинка loc_control_room.png (блочный щит, 2.3)  </w:t>
+      </w:r>
+      <w:r>
+        <w:rPr>
+          <w:b/>
+          <w:bCs/>
+        </w:rPr>
+        <w:t xml:space="preserve">Вставить в Ingredients (3 шт.):</w:t>
+      </w:r>
+      <w:r>
+        <w:t xml:space="preserve"> 1) vera_face_reference.png  2) vera_EP01_costume (или кадр из клипа 01)  3) loc_control_room.png</w:t>
+      </w:r>
+    </w:p>
+    <w:p>
+      <w:pPr>
+        <w:spacing w:after="80"/>
+      </w:pPr>
+      <w:r>
+        <w:rPr>
+          <w:b/>
+          <w:bCs/>
+        </w:rPr>
         <w:t xml:space="preserve">Реплика:</w:t>
       </w:r>
       <w:r>
@@ -3578,7 +4394,7 @@
           <w:sz w:val="16"/>
           <w:szCs w:val="16"/>
         </w:rPr>
-        <w:t xml:space="preserve">[REFERENCES] Use the uploaded face image as Vera's exact identity and the uploaded costume image as her exact outfit. Keep identical in every frame: adult woman about 25, grey-green eyes, small mole under the eye, light freckles, dark-brown shoulder-length wavy hair, natural slim adult proportions; long dark worn coat, wine-red scarf, brass compass-rose brooch, dark waistcoat, light shirt.</w:t>
+        <w:t xml:space="preserve">[REFERENCES] Use the uploaded face image as Vera's exact identity and the uploaded costume image as her exact outfit. Keep identical in every frame: adult woman about 25, grey-green eyes, small mole under the eye, light freckles, dark-brown shoulder-length wavy hair, natural slim adult proportions; long dark worn coat, wine-red scarf, brass compass-rose brooch, dark waistcoat, light shirt. Use the uploaded location image as the exact look of the control room.</w:t>
       </w:r>
     </w:p>
     <w:p>
@@ -3742,6 +4558,7 @@
     </w:p>
     <w:p>
       <w:pPr>
+        <w:shd w:fill="FFF4D6" w:color="auto" w:val="clear"/>
         <w:spacing w:after="80"/>
       </w:pPr>
       <w:r>
@@ -3749,6 +4566,31 @@
           <w:b/>
           <w:bCs/>
         </w:rPr>
+        <w:t xml:space="preserve">Что подготовить:</w:t>
+      </w:r>
+      <w:r>
+        <w:t xml:space="preserve"> картинка loc_unit4_night.png (станция ночью, 2.2)  </w:t>
+      </w:r>
+      <w:r>
+        <w:rPr>
+          <w:b/>
+          <w:bCs/>
+        </w:rPr>
+        <w:t xml:space="preserve">Вставить в Ingredients (3 шт.):</w:t>
+      </w:r>
+      <w:r>
+        <w:t xml:space="preserve"> 1) vera_face_reference.png  2) vera_EP01_costume (или кадр из клипа 01)  3) loc_unit4_night.png</w:t>
+      </w:r>
+    </w:p>
+    <w:p>
+      <w:pPr>
+        <w:spacing w:after="80"/>
+      </w:pPr>
+      <w:r>
+        <w:rPr>
+          <w:b/>
+          <w:bCs/>
+        </w:rPr>
         <w:t xml:space="preserve">Реплика:</w:t>
       </w:r>
       <w:r>
@@ -3782,7 +4624,7 @@
           <w:sz w:val="16"/>
           <w:szCs w:val="16"/>
         </w:rPr>
-        <w:t xml:space="preserve">[REFERENCES] Use the uploaded face image as Vera's exact identity and the uploaded costume image as her exact outfit. Keep identical in every frame: adult woman about 25, grey-green eyes, small mole under the eye, light freckles, dark-brown shoulder-length wavy hair, natural slim adult proportions; long dark worn coat, wine-red scarf, brass compass-rose brooch, dark waistcoat, light shirt.</w:t>
+        <w:t xml:space="preserve">[REFERENCES] Use the uploaded face image as Vera's exact identity and the uploaded costume image as her exact outfit. Keep identical in every frame: adult woman about 25, grey-green eyes, small mole under the eye, light freckles, dark-brown shoulder-length wavy hair, natural slim adult proportions; long dark worn coat, wine-red scarf, brass compass-rose brooch, dark waistcoat, light shirt. Use the uploaded location image as the exact look of the power plant buildings and the setting.</w:t>
       </w:r>
     </w:p>
     <w:p>
@@ -3946,6 +4788,7 @@
     </w:p>
     <w:p>
       <w:pPr>
+        <w:shd w:fill="FFF4D6" w:color="auto" w:val="clear"/>
         <w:spacing w:after="80"/>
       </w:pPr>
       <w:r>
@@ -3953,6 +4796,31 @@
           <w:b/>
           <w:bCs/>
         </w:rPr>
+        <w:t xml:space="preserve">Что подготовить:</w:t>
+      </w:r>
+      <w:r>
+        <w:t xml:space="preserve"> картинка loc_unit4_night.png (станция ночью, 2.2)  </w:t>
+      </w:r>
+      <w:r>
+        <w:rPr>
+          <w:b/>
+          <w:bCs/>
+        </w:rPr>
+        <w:t xml:space="preserve">Вставить в Ingredients (3 шт.):</w:t>
+      </w:r>
+      <w:r>
+        <w:t xml:space="preserve"> 1) vera_face_reference.png  2) vera_EP01_costume (или кадр из клипа 01)  3) loc_unit4_night.png</w:t>
+      </w:r>
+    </w:p>
+    <w:p>
+      <w:pPr>
+        <w:spacing w:after="80"/>
+      </w:pPr>
+      <w:r>
+        <w:rPr>
+          <w:b/>
+          <w:bCs/>
+        </w:rPr>
         <w:t xml:space="preserve">Реплика:</w:t>
       </w:r>
       <w:r>
@@ -3986,7 +4854,7 @@
           <w:sz w:val="16"/>
           <w:szCs w:val="16"/>
         </w:rPr>
-        <w:t xml:space="preserve">[REFERENCES] Use the uploaded face image as Vera's exact identity and the uploaded costume image as her exact outfit. Keep identical in every frame: adult woman about 25, grey-green eyes, small mole under the eye, light freckles, dark-brown shoulder-length wavy hair, natural slim adult proportions; long dark worn coat, wine-red scarf, brass compass-rose brooch, dark waistcoat, light shirt.</w:t>
+        <w:t xml:space="preserve">[REFERENCES] Use the uploaded face image as Vera's exact identity and the uploaded costume image as her exact outfit. Keep identical in every frame: adult woman about 25, grey-green eyes, small mole under the eye, light freckles, dark-brown shoulder-length wavy hair, natural slim adult proportions; long dark worn coat, wine-red scarf, brass compass-rose brooch, dark waistcoat, light shirt. Use the uploaded location image as the exact look of the power plant buildings and the setting.</w:t>
       </w:r>
     </w:p>
     <w:p>
@@ -4150,6 +5018,7 @@
     </w:p>
     <w:p>
       <w:pPr>
+        <w:shd w:fill="FFF4D6" w:color="auto" w:val="clear"/>
         <w:spacing w:after="80"/>
       </w:pPr>
       <w:r>
@@ -4157,6 +5026,31 @@
           <w:b/>
           <w:bCs/>
         </w:rPr>
+        <w:t xml:space="preserve">Что подготовить:</w:t>
+      </w:r>
+      <w:r>
+        <w:t xml:space="preserve"> картинка ref_firefighter.png (пожарный, 2.4) — станция описана в промпте словами.  </w:t>
+      </w:r>
+      <w:r>
+        <w:rPr>
+          <w:b/>
+          <w:bCs/>
+        </w:rPr>
+        <w:t xml:space="preserve">Вставить в Ingredients (3 шт.):</w:t>
+      </w:r>
+      <w:r>
+        <w:t xml:space="preserve"> 1) vera_face_reference.png  2) vera_EP01_costume (или кадр из клипа 01)  3) ref_firefighter.png</w:t>
+      </w:r>
+    </w:p>
+    <w:p>
+      <w:pPr>
+        <w:spacing w:after="80"/>
+      </w:pPr>
+      <w:r>
+        <w:rPr>
+          <w:b/>
+          <w:bCs/>
+        </w:rPr>
         <w:t xml:space="preserve">Реплика:</w:t>
       </w:r>
       <w:r>
@@ -4190,7 +5084,7 @@
           <w:sz w:val="16"/>
           <w:szCs w:val="16"/>
         </w:rPr>
-        <w:t xml:space="preserve">[REFERENCES] Use the uploaded face image as Vera's exact identity and the uploaded costume image as her exact outfit. Keep identical in every frame: adult woman about 25, grey-green eyes, small mole under the eye, light freckles, dark-brown shoulder-length wavy hair, natural slim adult proportions; long dark worn coat, wine-red scarf, brass compass-rose brooch, dark waistcoat, light shirt.</w:t>
+        <w:t xml:space="preserve">[REFERENCES] Use the uploaded face image as Vera's exact identity and the uploaded costume image as her exact outfit. Keep identical in every frame: adult woman about 25, grey-green eyes, small mole under the eye, light freckles, dark-brown shoulder-length wavy hair, natural slim adult proportions; long dark worn coat, wine-red scarf, brass compass-rose brooch, dark waistcoat, light shirt. Use the uploaded firefighter image as the exact look of the firefighters' uniforms.</w:t>
       </w:r>
     </w:p>
     <w:p>
@@ -4354,6 +5248,7 @@
     </w:p>
     <w:p>
       <w:pPr>
+        <w:shd w:fill="FFF4D6" w:color="auto" w:val="clear"/>
         <w:spacing w:after="80"/>
       </w:pPr>
       <w:r>
@@ -4361,6 +5256,31 @@
           <w:b/>
           <w:bCs/>
         </w:rPr>
+        <w:t xml:space="preserve">Что подготовить:</w:t>
+      </w:r>
+      <w:r>
+        <w:t xml:space="preserve"> картинка ref_firefighter.png (пожарный, 2.4) — станция описана в промпте словами.  </w:t>
+      </w:r>
+      <w:r>
+        <w:rPr>
+          <w:b/>
+          <w:bCs/>
+        </w:rPr>
+        <w:t xml:space="preserve">Вставить в Ingredients (3 шт.):</w:t>
+      </w:r>
+      <w:r>
+        <w:t xml:space="preserve"> 1) vera_face_reference.png  2) vera_EP01_costume (или кадр из клипа 01)  3) ref_firefighter.png</w:t>
+      </w:r>
+    </w:p>
+    <w:p>
+      <w:pPr>
+        <w:spacing w:after="80"/>
+      </w:pPr>
+      <w:r>
+        <w:rPr>
+          <w:b/>
+          <w:bCs/>
+        </w:rPr>
         <w:t xml:space="preserve">Реплика:</w:t>
       </w:r>
       <w:r>
@@ -4394,7 +5314,7 @@
           <w:sz w:val="16"/>
           <w:szCs w:val="16"/>
         </w:rPr>
-        <w:t xml:space="preserve">[REFERENCES] Use the uploaded face image as Vera's exact identity and the uploaded costume image as her exact outfit. Keep identical in every frame: adult woman about 25, grey-green eyes, small mole under the eye, light freckles, dark-brown shoulder-length wavy hair, natural slim adult proportions; long dark worn coat, wine-red scarf, brass compass-rose brooch, dark waistcoat, light shirt.</w:t>
+        <w:t xml:space="preserve">[REFERENCES] Use the uploaded face image as Vera's exact identity and the uploaded costume image as her exact outfit. Keep identical in every frame: adult woman about 25, grey-green eyes, small mole under the eye, light freckles, dark-brown shoulder-length wavy hair, natural slim adult proportions; long dark worn coat, wine-red scarf, brass compass-rose brooch, dark waistcoat, light shirt. Use the uploaded firefighter image as the exact look of the firefighters' uniforms.</w:t>
       </w:r>
     </w:p>
     <w:p>
@@ -4558,6 +5478,7 @@
     </w:p>
     <w:p>
       <w:pPr>
+        <w:shd w:fill="FFF4D6" w:color="auto" w:val="clear"/>
         <w:spacing w:after="80"/>
       </w:pPr>
       <w:r>
@@ -4565,6 +5486,31 @@
           <w:b/>
           <w:bCs/>
         </w:rPr>
+        <w:t xml:space="preserve">Что подготовить:</w:t>
+      </w:r>
+      <w:r>
+        <w:t xml:space="preserve"> картинка loc_pripyat_street.png (улица Припяти, 2.5)  </w:t>
+      </w:r>
+      <w:r>
+        <w:rPr>
+          <w:b/>
+          <w:bCs/>
+        </w:rPr>
+        <w:t xml:space="preserve">Вставить в Ingredients (3 шт.):</w:t>
+      </w:r>
+      <w:r>
+        <w:t xml:space="preserve"> 1) vera_face_reference.png  2) vera_EP01_costume (или кадр из клипа 01)  3) loc_pripyat_street.png</w:t>
+      </w:r>
+    </w:p>
+    <w:p>
+      <w:pPr>
+        <w:spacing w:after="80"/>
+      </w:pPr>
+      <w:r>
+        <w:rPr>
+          <w:b/>
+          <w:bCs/>
+        </w:rPr>
         <w:t xml:space="preserve">Реплика:</w:t>
       </w:r>
       <w:r>
@@ -4598,7 +5544,7 @@
           <w:sz w:val="16"/>
           <w:szCs w:val="16"/>
         </w:rPr>
-        <w:t xml:space="preserve">[REFERENCES] Use the uploaded face image as Vera's exact identity and the uploaded costume image as her exact outfit. Keep identical in every frame: adult woman about 25, grey-green eyes, small mole under the eye, light freckles, dark-brown shoulder-length wavy hair, natural slim adult proportions; long dark worn coat, wine-red scarf, brass compass-rose brooch, dark waistcoat, light shirt.</w:t>
+        <w:t xml:space="preserve">[REFERENCES] Use the uploaded face image as Vera's exact identity and the uploaded costume image as her exact outfit. Keep identical in every frame: adult woman about 25, grey-green eyes, small mole under the eye, light freckles, dark-brown shoulder-length wavy hair, natural slim adult proportions; long dark worn coat, wine-red scarf, brass compass-rose brooch, dark waistcoat, light shirt. Use the uploaded location image as the exact look of the Pripyat street.</w:t>
       </w:r>
     </w:p>
     <w:p>
@@ -4762,6 +5708,7 @@
     </w:p>
     <w:p>
       <w:pPr>
+        <w:shd w:fill="FFF4D6" w:color="auto" w:val="clear"/>
         <w:spacing w:after="80"/>
       </w:pPr>
       <w:r>
@@ -4769,6 +5716,31 @@
           <w:b/>
           <w:bCs/>
         </w:rPr>
+        <w:t xml:space="preserve">Что подготовить:</w:t>
+      </w:r>
+      <w:r>
+        <w:t xml:space="preserve"> картинка loc_pripyat_street.png (улица Припяти, 2.5)  </w:t>
+      </w:r>
+      <w:r>
+        <w:rPr>
+          <w:b/>
+          <w:bCs/>
+        </w:rPr>
+        <w:t xml:space="preserve">Вставить в Ingredients (3 шт.):</w:t>
+      </w:r>
+      <w:r>
+        <w:t xml:space="preserve"> 1) vera_face_reference.png  2) vera_EP01_costume (или кадр из клипа 01)  3) loc_pripyat_street.png</w:t>
+      </w:r>
+    </w:p>
+    <w:p>
+      <w:pPr>
+        <w:spacing w:after="80"/>
+      </w:pPr>
+      <w:r>
+        <w:rPr>
+          <w:b/>
+          <w:bCs/>
+        </w:rPr>
         <w:t xml:space="preserve">Реплика:</w:t>
       </w:r>
       <w:r>
@@ -4802,7 +5774,7 @@
           <w:sz w:val="16"/>
           <w:szCs w:val="16"/>
         </w:rPr>
-        <w:t xml:space="preserve">[REFERENCES] Use the uploaded face image as Vera's exact identity and the uploaded costume image as her exact outfit. Keep identical in every frame: adult woman about 25, grey-green eyes, small mole under the eye, light freckles, dark-brown shoulder-length wavy hair, natural slim adult proportions; long dark worn coat, wine-red scarf, brass compass-rose brooch, dark waistcoat, light shirt.</w:t>
+        <w:t xml:space="preserve">[REFERENCES] Use the uploaded face image as Vera's exact identity and the uploaded costume image as her exact outfit. Keep identical in every frame: adult woman about 25, grey-green eyes, small mole under the eye, light freckles, dark-brown shoulder-length wavy hair, natural slim adult proportions; long dark worn coat, wine-red scarf, brass compass-rose brooch, dark waistcoat, light shirt. Use the uploaded location image as the exact look of the Pripyat street.</w:t>
       </w:r>
     </w:p>
     <w:p>
@@ -4966,6 +5938,7 @@
     </w:p>
     <w:p>
       <w:pPr>
+        <w:shd w:fill="FFF4D6" w:color="auto" w:val="clear"/>
         <w:spacing w:after="80"/>
       </w:pPr>
       <w:r>
@@ -4973,6 +5946,31 @@
           <w:b/>
           <w:bCs/>
         </w:rPr>
+        <w:t xml:space="preserve">Что подготовить:</w:t>
+      </w:r>
+      <w:r>
+        <w:t xml:space="preserve"> картинка loc_pripyat_street.png (улица Припяти, 2.5)  </w:t>
+      </w:r>
+      <w:r>
+        <w:rPr>
+          <w:b/>
+          <w:bCs/>
+        </w:rPr>
+        <w:t xml:space="preserve">Вставить в Ingredients (3 шт.):</w:t>
+      </w:r>
+      <w:r>
+        <w:t xml:space="preserve"> 1) vera_face_reference.png  2) vera_EP01_costume (или кадр из клипа 01)  3) loc_pripyat_street.png</w:t>
+      </w:r>
+    </w:p>
+    <w:p>
+      <w:pPr>
+        <w:spacing w:after="80"/>
+      </w:pPr>
+      <w:r>
+        <w:rPr>
+          <w:b/>
+          <w:bCs/>
+        </w:rPr>
         <w:t xml:space="preserve">Реплика:</w:t>
       </w:r>
       <w:r>
@@ -5006,7 +6004,7 @@
           <w:sz w:val="16"/>
           <w:szCs w:val="16"/>
         </w:rPr>
-        <w:t xml:space="preserve">[REFERENCES] Use the uploaded face image as Vera's exact identity and the uploaded costume image as her exact outfit. Keep identical in every frame: adult woman about 25, grey-green eyes, small mole under the eye, light freckles, dark-brown shoulder-length wavy hair, natural slim adult proportions; long dark worn coat, wine-red scarf, brass compass-rose brooch, dark waistcoat, light shirt.</w:t>
+        <w:t xml:space="preserve">[REFERENCES] Use the uploaded face image as Vera's exact identity and the uploaded costume image as her exact outfit. Keep identical in every frame: adult woman about 25, grey-green eyes, small mole under the eye, light freckles, dark-brown shoulder-length wavy hair, natural slim adult proportions; long dark worn coat, wine-red scarf, brass compass-rose brooch, dark waistcoat, light shirt. Use the uploaded location image as the exact look of the Pripyat street.</w:t>
       </w:r>
     </w:p>
     <w:p>

</xml_diff>

<commit_message>
EP01 v6: stylized-animation block in all 12 Omni Flash prompts
Co-Authored-By: Claude Opus 5.5 <noreply@anthropic.com>
Claude-Session: https://claude.ai/code/session_01VAADPC5RMETnb7oPTVQosk
</commit_message>
<xml_diff>
--- a/episodes/EP01_chernobyl_night/EP01_Чернобыль_Рабочие_промпты.docx
+++ b/episodes/EP01_chernobyl_night/EP01_Чернобыль_Рабочие_промпты.docx
@@ -2487,6 +2487,21 @@
           <w:sz w:val="16"/>
           <w:szCs w:val="16"/>
         </w:rPr>
+        <w:t xml:space="preserve">[STYLE — MOST IMPORTANT] Stylized 3D animated feature-film look with a hand-painted, painterly texture — exactly the same drawn, illustrated style as the @Vera character images. Soft painted shading, slightly simplified stylized forms, smooth painted skin without pores, visible brush-like texture in hair, clothes and background. This is an animated cartoon-film frame, NOT live action, NOT a photograph, NOT photorealistic, NOT a real human actor.</w:t>
+      </w:r>
+    </w:p>
+    <w:p>
+      <w:pPr>
+        <w:shd w:fill="F2EFEA" w:color="auto" w:val="clear"/>
+        <w:spacing w:after="0"/>
+        <w:ind w:left="120" w:right="120"/>
+      </w:pPr>
+      <w:r>
+        <w:rPr>
+          <w:rFonts w:ascii="Consolas" w:cs="Consolas" w:eastAsia="Consolas" w:hAnsi="Consolas"/>
+          <w:sz w:val="16"/>
+          <w:szCs w:val="16"/>
+        </w:rPr>
         <w:t xml:space="preserve">[SCENE] Hook: Vera walks toward the camera along the access road of the Chernobyl plant minutes before the accident while the night shift moves all around her.</w:t>
       </w:r>
     </w:p>
@@ -2502,7 +2517,7 @@
           <w:sz w:val="16"/>
           <w:szCs w:val="16"/>
         </w:rPr>
-        <w:t xml:space="preserve">[REFERENCES] Vera is the character @Vera — keep her face, body, outfit and voice exactly the same in every frame. Use @loc_unit4_night as the setting.</w:t>
+        <w:t xml:space="preserve">[REFERENCES] Vera is the character @Vera — keep her face, body, outfit, art style and voice exactly as in the character images, in every frame. Do not make her more realistic than the character images. Use @loc_unit4_night as the setting, painted in the same animated style.</w:t>
       </w:r>
     </w:p>
     <w:p>
@@ -2592,7 +2607,7 @@
           <w:sz w:val="16"/>
           <w:szCs w:val="16"/>
         </w:rPr>
-        <w:t xml:space="preserve">[LIGHT] Orange sodium light, cold blue sky, headlight beams sweeping across her face.</w:t>
+        <w:t xml:space="preserve">[LIGHT] Orange sodium light, cold blue sky, headlight beams sweeping across her face — stylized, soft, like an animated film.</w:t>
       </w:r>
     </w:p>
     <w:p>
@@ -2622,7 +2637,7 @@
           <w:sz w:val="16"/>
           <w:szCs w:val="16"/>
         </w:rPr>
-        <w:t xml:space="preserve">[STYLE] Semi-realistic cinematic 3D/2.5D animation with a subtle painterly texture, natural adult proportions, expressive realistic facial acting, motivated lighting, atmospheric depth, historically plausible props and architecture. Not cartoonish, not photorealistic. Vertical 9:16.</w:t>
+        <w:t xml:space="preserve">[AVOID] No photorealism, no live-action look, no real-person faces, no skin pores or photographic detail, no film-camera realism; no shots without Vera; no static or frozen background; no English speech, no other voices speaking words, no extra lines, no music; no subtitles or on-screen text, no logos, no watermarks; no extra fingers, no face, style or outfit changes, no modern objects, no gratuitous gore.</w:t>
       </w:r>
     </w:p>
     <w:p>
@@ -2637,7 +2652,7 @@
           <w:sz w:val="16"/>
           <w:szCs w:val="16"/>
         </w:rPr>
-        <w:t xml:space="preserve">[AVOID] No shots without Vera, Vera never leaves the frame; no static or frozen background, no idle crowd; no English speech, no other voices speaking words, no extra lines, no music; no subtitles, captions or on-screen text, no logos, no watermarks; no extra fingers, no face, voice or outfit changes, no modern objects, no gratuitous gore.</w:t>
+        <w:t xml:space="preserve">[STYLE REMINDER] Whole clip in the same stylized painterly 3D animation style as the @Vera character images, not realistic; all other people are stylized animated characters too.</w:t>
       </w:r>
     </w:p>
     <w:p>
@@ -2687,6 +2702,21 @@
           <w:sz w:val="16"/>
           <w:szCs w:val="16"/>
         </w:rPr>
+        <w:t xml:space="preserve">[STYLE — MOST IMPORTANT] Stylized 3D animated feature-film look with a hand-painted, painterly texture — exactly the same drawn, illustrated style as the @Vera character images. Soft painted shading, slightly simplified stylized forms, smooth painted skin without pores, visible brush-like texture in hair, clothes and background. This is an animated cartoon-film frame, NOT live action, NOT a photograph, NOT photorealistic, NOT a real human actor.</w:t>
+      </w:r>
+    </w:p>
+    <w:p>
+      <w:pPr>
+        <w:shd w:fill="F2EFEA" w:color="auto" w:val="clear"/>
+        <w:spacing w:after="0"/>
+        <w:ind w:left="120" w:right="120"/>
+      </w:pPr>
+      <w:r>
+        <w:rPr>
+          <w:rFonts w:ascii="Consolas" w:cs="Consolas" w:eastAsia="Consolas" w:hAnsi="Consolas"/>
+          <w:sz w:val="16"/>
+          <w:szCs w:val="16"/>
+        </w:rPr>
         <w:t xml:space="preserve">[SCENE] Immersion: Vera walks along the busy unit 4 control room during the night shift as the test is being prepared; nobody notices her.</w:t>
       </w:r>
     </w:p>
@@ -2702,7 +2732,7 @@
           <w:sz w:val="16"/>
           <w:szCs w:val="16"/>
         </w:rPr>
-        <w:t xml:space="preserve">[REFERENCES] Vera is the character @Vera — keep her face, body, outfit and voice exactly the same in every frame. Use @loc_control_room as the setting.</w:t>
+        <w:t xml:space="preserve">[REFERENCES] Vera is the character @Vera — keep her face, body, outfit, art style and voice exactly as in the character images, in every frame. Do not make her more realistic than the character images. Use @loc_control_room as the setting, painted in the same animated style.</w:t>
       </w:r>
     </w:p>
     <w:p>
@@ -2792,7 +2822,7 @@
           <w:sz w:val="16"/>
           <w:szCs w:val="16"/>
         </w:rPr>
-        <w:t xml:space="preserve">[LIGHT] Cold fluorescent light, pale green-grey palette, flickering red and amber lamps, her wine-red scarf as the warm accent.</w:t>
+        <w:t xml:space="preserve">[LIGHT] Cold fluorescent light, pale green-grey palette, flickering red and amber lamps, her wine-red scarf as the warm accent — stylized, soft, like an animated film.</w:t>
       </w:r>
     </w:p>
     <w:p>
@@ -2822,7 +2852,7 @@
           <w:sz w:val="16"/>
           <w:szCs w:val="16"/>
         </w:rPr>
-        <w:t xml:space="preserve">[STYLE] Semi-realistic cinematic 3D/2.5D animation with a subtle painterly texture, natural adult proportions, expressive realistic facial acting, motivated lighting, atmospheric depth, historically plausible props and architecture. Not cartoonish, not photorealistic. Vertical 9:16.</w:t>
+        <w:t xml:space="preserve">[AVOID] No photorealism, no live-action look, no real-person faces, no skin pores or photographic detail, no film-camera realism; no shots without Vera; no static or frozen background; no English speech, no other voices speaking words, no extra lines, no music; no subtitles or on-screen text, no logos, no watermarks; no extra fingers, no face, style or outfit changes, no modern objects, no gratuitous gore.</w:t>
       </w:r>
     </w:p>
     <w:p>
@@ -2837,7 +2867,7 @@
           <w:sz w:val="16"/>
           <w:szCs w:val="16"/>
         </w:rPr>
-        <w:t xml:space="preserve">[AVOID] No shots without Vera, Vera never leaves the frame; no static or frozen background, no idle crowd; no English speech, no other voices speaking words, no extra lines, no music; no subtitles, captions or on-screen text, no logos, no watermarks; no extra fingers, no face, voice or outfit changes, no modern objects, no gratuitous gore.</w:t>
+        <w:t xml:space="preserve">[STYLE REMINDER] Whole clip in the same stylized painterly 3D animation style as the @Vera character images, not realistic; all other people are stylized animated characters too.</w:t>
       </w:r>
     </w:p>
     <w:p>
@@ -2887,6 +2917,21 @@
           <w:sz w:val="16"/>
           <w:szCs w:val="16"/>
         </w:rPr>
+        <w:t xml:space="preserve">[STYLE — MOST IMPORTANT] Stylized 3D animated feature-film look with a hand-painted, painterly texture — exactly the same drawn, illustrated style as the @Vera character images. Soft painted shading, slightly simplified stylized forms, smooth painted skin without pores, visible brush-like texture in hair, clothes and background. This is an animated cartoon-film frame, NOT live action, NOT a photograph, NOT photorealistic, NOT a real human actor.</w:t>
+      </w:r>
+    </w:p>
+    <w:p>
+      <w:pPr>
+        <w:shd w:fill="F2EFEA" w:color="auto" w:val="clear"/>
+        <w:spacing w:after="0"/>
+        <w:ind w:left="120" w:right="120"/>
+      </w:pPr>
+      <w:r>
+        <w:rPr>
+          <w:rFonts w:ascii="Consolas" w:cs="Consolas" w:eastAsia="Consolas" w:hAnsi="Consolas"/>
+          <w:sz w:val="16"/>
+          <w:szCs w:val="16"/>
+        </w:rPr>
         <w:t xml:space="preserve">[SCENE] Rising tension: warning signals multiply in the control room behind Vera as she explains the danger.</w:t>
       </w:r>
     </w:p>
@@ -2902,7 +2947,7 @@
           <w:sz w:val="16"/>
           <w:szCs w:val="16"/>
         </w:rPr>
-        <w:t xml:space="preserve">[REFERENCES] Vera is the character @Vera — keep her face, body, outfit and voice exactly the same in every frame. Use @loc_control_room as the setting.</w:t>
+        <w:t xml:space="preserve">[REFERENCES] Vera is the character @Vera — keep her face, body, outfit, art style and voice exactly as in the character images, in every frame. Do not make her more realistic than the character images. Use @loc_control_room as the setting, painted in the same animated style.</w:t>
       </w:r>
     </w:p>
     <w:p>
@@ -2992,7 +3037,7 @@
           <w:sz w:val="16"/>
           <w:szCs w:val="16"/>
         </w:rPr>
-        <w:t xml:space="preserve">[LIGHT] Cold fluorescent light, blinking amber warning lamps reflecting on her face.</w:t>
+        <w:t xml:space="preserve">[LIGHT] Cold fluorescent light, blinking amber warning lamps reflecting on her face — stylized, soft, like an animated film.</w:t>
       </w:r>
     </w:p>
     <w:p>
@@ -3022,7 +3067,7 @@
           <w:sz w:val="16"/>
           <w:szCs w:val="16"/>
         </w:rPr>
-        <w:t xml:space="preserve">[STYLE] Semi-realistic cinematic 3D/2.5D animation with a subtle painterly texture, natural adult proportions, expressive realistic facial acting, motivated lighting, atmospheric depth, historically plausible props and architecture. Not cartoonish, not photorealistic. Vertical 9:16.</w:t>
+        <w:t xml:space="preserve">[AVOID] No photorealism, no live-action look, no real-person faces, no skin pores or photographic detail, no film-camera realism; no shots without Vera; no static or frozen background; no English speech, no other voices speaking words, no extra lines, no music; no subtitles or on-screen text, no logos, no watermarks; no extra fingers, no face, style or outfit changes, no modern objects, no gratuitous gore.</w:t>
       </w:r>
     </w:p>
     <w:p>
@@ -3037,7 +3082,7 @@
           <w:sz w:val="16"/>
           <w:szCs w:val="16"/>
         </w:rPr>
-        <w:t xml:space="preserve">[AVOID] No shots without Vera, Vera never leaves the frame; no static or frozen background, no idle crowd; no English speech, no other voices speaking words, no extra lines, no music; no subtitles, captions or on-screen text, no logos, no watermarks; no extra fingers, no face, voice or outfit changes, no modern objects, no gratuitous gore.</w:t>
+        <w:t xml:space="preserve">[STYLE REMINDER] Whole clip in the same stylized painterly 3D animation style as the @Vera character images, not realistic; all other people are stylized animated characters too.</w:t>
       </w:r>
     </w:p>
     <w:p>
@@ -3087,6 +3132,21 @@
           <w:sz w:val="16"/>
           <w:szCs w:val="16"/>
         </w:rPr>
+        <w:t xml:space="preserve">[STYLE — MOST IMPORTANT] Stylized 3D animated feature-film look with a hand-painted, painterly texture — exactly the same drawn, illustrated style as the @Vera character images. Soft painted shading, slightly simplified stylized forms, smooth painted skin without pores, visible brush-like texture in hair, clothes and background. This is an animated cartoon-film frame, NOT live action, NOT a photograph, NOT photorealistic, NOT a real human actor.</w:t>
+      </w:r>
+    </w:p>
+    <w:p>
+      <w:pPr>
+        <w:shd w:fill="F2EFEA" w:color="auto" w:val="clear"/>
+        <w:spacing w:after="0"/>
+        <w:ind w:left="120" w:right="120"/>
+      </w:pPr>
+      <w:r>
+        <w:rPr>
+          <w:rFonts w:ascii="Consolas" w:cs="Consolas" w:eastAsia="Consolas" w:hAnsi="Consolas"/>
+          <w:sz w:val="16"/>
+          <w:szCs w:val="16"/>
+        </w:rPr>
         <w:t xml:space="preserve">[SCENE] Turning point: behind Vera an operator slams the emergency shutdown button and the room erupts.</w:t>
       </w:r>
     </w:p>
@@ -3102,7 +3162,7 @@
           <w:sz w:val="16"/>
           <w:szCs w:val="16"/>
         </w:rPr>
-        <w:t xml:space="preserve">[REFERENCES] Vera is the character @Vera — keep her face, body, outfit and voice exactly the same in every frame. Use @loc_control_room as the setting.</w:t>
+        <w:t xml:space="preserve">[REFERENCES] Vera is the character @Vera — keep her face, body, outfit, art style and voice exactly as in the character images, in every frame. Do not make her more realistic than the character images. Use @loc_control_room as the setting, painted in the same animated style.</w:t>
       </w:r>
     </w:p>
     <w:p>
@@ -3192,7 +3252,7 @@
           <w:sz w:val="16"/>
           <w:szCs w:val="16"/>
         </w:rPr>
-        <w:t xml:space="preserve">[LIGHT] Cold light suddenly washed with flashing red.</w:t>
+        <w:t xml:space="preserve">[LIGHT] Cold light suddenly washed with flashing red — stylized, soft, like an animated film.</w:t>
       </w:r>
     </w:p>
     <w:p>
@@ -3222,7 +3282,7 @@
           <w:sz w:val="16"/>
           <w:szCs w:val="16"/>
         </w:rPr>
-        <w:t xml:space="preserve">[STYLE] Semi-realistic cinematic 3D/2.5D animation with a subtle painterly texture, natural adult proportions, expressive realistic facial acting, motivated lighting, atmospheric depth, historically plausible props and architecture. Not cartoonish, not photorealistic. Vertical 9:16.</w:t>
+        <w:t xml:space="preserve">[AVOID] No photorealism, no live-action look, no real-person faces, no skin pores or photographic detail, no film-camera realism; no shots without Vera; no static or frozen background; no English speech, no other voices speaking words, no extra lines, no music; no subtitles or on-screen text, no logos, no watermarks; no extra fingers, no face, style or outfit changes, no modern objects, no gratuitous gore.</w:t>
       </w:r>
     </w:p>
     <w:p>
@@ -3237,7 +3297,7 @@
           <w:sz w:val="16"/>
           <w:szCs w:val="16"/>
         </w:rPr>
-        <w:t xml:space="preserve">[AVOID] No shots without Vera, Vera never leaves the frame; no static or frozen background, no idle crowd; no English speech, no other voices speaking words, no extra lines, no music; no subtitles, captions or on-screen text, no logos, no watermarks; no extra fingers, no face, voice or outfit changes, no modern objects, no gratuitous gore.</w:t>
+        <w:t xml:space="preserve">[STYLE REMINDER] Whole clip in the same stylized painterly 3D animation style as the @Vera character images, not realistic; all other people are stylized animated characters too.</w:t>
       </w:r>
     </w:p>
     <w:p>
@@ -3287,6 +3347,21 @@
           <w:sz w:val="16"/>
           <w:szCs w:val="16"/>
         </w:rPr>
+        <w:t xml:space="preserve">[STYLE — MOST IMPORTANT] Stylized 3D animated feature-film look with a hand-painted, painterly texture — exactly the same drawn, illustrated style as the @Vera character images. Soft painted shading, slightly simplified stylized forms, smooth painted skin without pores, visible brush-like texture in hair, clothes and background. This is an animated cartoon-film frame, NOT live action, NOT a photograph, NOT photorealistic, NOT a real human actor.</w:t>
+      </w:r>
+    </w:p>
+    <w:p>
+      <w:pPr>
+        <w:shd w:fill="F2EFEA" w:color="auto" w:val="clear"/>
+        <w:spacing w:after="0"/>
+        <w:ind w:left="120" w:right="120"/>
+      </w:pPr>
+      <w:r>
+        <w:rPr>
+          <w:rFonts w:ascii="Consolas" w:cs="Consolas" w:eastAsia="Consolas" w:hAnsi="Consolas"/>
+          <w:sz w:val="16"/>
+          <w:szCs w:val="16"/>
+        </w:rPr>
         <w:t xml:space="preserve">[SCENE] Escalation: the control room shakes violently as the power surges; Vera speaks while holding on.</w:t>
       </w:r>
     </w:p>
@@ -3302,7 +3377,7 @@
           <w:sz w:val="16"/>
           <w:szCs w:val="16"/>
         </w:rPr>
-        <w:t xml:space="preserve">[REFERENCES] Vera is the character @Vera — keep her face, body, outfit and voice exactly the same in every frame. Use @loc_control_room as the setting.</w:t>
+        <w:t xml:space="preserve">[REFERENCES] Vera is the character @Vera — keep her face, body, outfit, art style and voice exactly as in the character images, in every frame. Do not make her more realistic than the character images. Use @loc_control_room as the setting, painted in the same animated style.</w:t>
       </w:r>
     </w:p>
     <w:p>
@@ -3392,7 +3467,7 @@
           <w:sz w:val="16"/>
           <w:szCs w:val="16"/>
         </w:rPr>
-        <w:t xml:space="preserve">[LIGHT] Strobing fluorescent light, red alarm lamps, dust glowing in the light.</w:t>
+        <w:t xml:space="preserve">[LIGHT] Strobing fluorescent light, red alarm lamps, dust glowing in the light — stylized, soft, like an animated film.</w:t>
       </w:r>
     </w:p>
     <w:p>
@@ -3422,7 +3497,7 @@
           <w:sz w:val="16"/>
           <w:szCs w:val="16"/>
         </w:rPr>
-        <w:t xml:space="preserve">[STYLE] Semi-realistic cinematic 3D/2.5D animation with a subtle painterly texture, natural adult proportions, expressive realistic facial acting, motivated lighting, atmospheric depth, historically plausible props and architecture. Not cartoonish, not photorealistic. Vertical 9:16.</w:t>
+        <w:t xml:space="preserve">[AVOID] No photorealism, no live-action look, no real-person faces, no skin pores or photographic detail, no film-camera realism; no shots without Vera; no static or frozen background; no English speech, no other voices speaking words, no extra lines, no music; no subtitles or on-screen text, no logos, no watermarks; no extra fingers, no face, style or outfit changes, no modern objects, no gratuitous gore.</w:t>
       </w:r>
     </w:p>
     <w:p>
@@ -3437,7 +3512,7 @@
           <w:sz w:val="16"/>
           <w:szCs w:val="16"/>
         </w:rPr>
-        <w:t xml:space="preserve">[AVOID] No shots without Vera, Vera never leaves the frame; no static or frozen background, no idle crowd; no English speech, no other voices speaking words, no extra lines, no music; no subtitles, captions or on-screen text, no logos, no watermarks; no extra fingers, no face, voice or outfit changes, no modern objects, no gratuitous gore.</w:t>
+        <w:t xml:space="preserve">[STYLE REMINDER] Whole clip in the same stylized painterly 3D animation style as the @Vera character images, not realistic; all other people are stylized animated characters too.</w:t>
       </w:r>
     </w:p>
     <w:p>
@@ -3487,6 +3562,21 @@
           <w:sz w:val="16"/>
           <w:szCs w:val="16"/>
         </w:rPr>
+        <w:t xml:space="preserve">[STYLE — MOST IMPORTANT] Stylized 3D animated feature-film look with a hand-painted, painterly texture — exactly the same drawn, illustrated style as the @Vera character images. Soft painted shading, slightly simplified stylized forms, smooth painted skin without pores, visible brush-like texture in hair, clothes and background. This is an animated cartoon-film frame, NOT live action, NOT a photograph, NOT photorealistic, NOT a real human actor.</w:t>
+      </w:r>
+    </w:p>
+    <w:p>
+      <w:pPr>
+        <w:shd w:fill="F2EFEA" w:color="auto" w:val="clear"/>
+        <w:spacing w:after="0"/>
+        <w:ind w:left="120" w:right="120"/>
+      </w:pPr>
+      <w:r>
+        <w:rPr>
+          <w:rFonts w:ascii="Consolas" w:cs="Consolas" w:eastAsia="Consolas" w:hAnsi="Consolas"/>
+          <w:sz w:val="16"/>
+          <w:szCs w:val="16"/>
+        </w:rPr>
         <w:t xml:space="preserve">[SCENE] Climax: two explosions tear apart the unit 4 reactor building behind Vera.</w:t>
       </w:r>
     </w:p>
@@ -3502,7 +3592,7 @@
           <w:sz w:val="16"/>
           <w:szCs w:val="16"/>
         </w:rPr>
-        <w:t xml:space="preserve">[REFERENCES] Vera is the character @Vera — keep her face, body, outfit and voice exactly the same in every frame. Use @loc_unit4_night as the setting.</w:t>
+        <w:t xml:space="preserve">[REFERENCES] Vera is the character @Vera — keep her face, body, outfit, art style and voice exactly as in the character images, in every frame. Do not make her more realistic than the character images. Use @loc_unit4_night as the setting, painted in the same animated style.</w:t>
       </w:r>
     </w:p>
     <w:p>
@@ -3592,7 +3682,7 @@
           <w:sz w:val="16"/>
           <w:szCs w:val="16"/>
         </w:rPr>
-        <w:t xml:space="preserve">[LIGHT] Night blue broken by orange-white flashes, red glow on her face.</w:t>
+        <w:t xml:space="preserve">[LIGHT] Night blue broken by orange-white flashes, red glow on her face — stylized, soft, like an animated film.</w:t>
       </w:r>
     </w:p>
     <w:p>
@@ -3622,7 +3712,7 @@
           <w:sz w:val="16"/>
           <w:szCs w:val="16"/>
         </w:rPr>
-        <w:t xml:space="preserve">[STYLE] Semi-realistic cinematic 3D/2.5D animation with a subtle painterly texture, natural adult proportions, expressive realistic facial acting, motivated lighting, atmospheric depth, historically plausible props and architecture. Not cartoonish, not photorealistic. Vertical 9:16.</w:t>
+        <w:t xml:space="preserve">[AVOID] No photorealism, no live-action look, no real-person faces, no skin pores or photographic detail, no film-camera realism; no shots without Vera; no static or frozen background; no English speech, no other voices speaking words, no extra lines, no music; no subtitles or on-screen text, no logos, no watermarks; no extra fingers, no face, style or outfit changes, no modern objects, no gratuitous gore.</w:t>
       </w:r>
     </w:p>
     <w:p>
@@ -3637,7 +3727,7 @@
           <w:sz w:val="16"/>
           <w:szCs w:val="16"/>
         </w:rPr>
-        <w:t xml:space="preserve">[AVOID] No shots without Vera, Vera never leaves the frame; no static or frozen background, no idle crowd; no English speech, no other voices speaking words, no extra lines, no music; no subtitles, captions or on-screen text, no logos, no watermarks; no extra fingers, no face, voice or outfit changes, no modern objects, no gratuitous gore.</w:t>
+        <w:t xml:space="preserve">[STYLE REMINDER] Whole clip in the same stylized painterly 3D animation style as the @Vera character images, not realistic; all other people are stylized animated characters too.</w:t>
       </w:r>
     </w:p>
     <w:p>
@@ -3687,6 +3777,21 @@
           <w:sz w:val="16"/>
           <w:szCs w:val="16"/>
         </w:rPr>
+        <w:t xml:space="preserve">[STYLE — MOST IMPORTANT] Stylized 3D animated feature-film look with a hand-painted, painterly texture — exactly the same drawn, illustrated style as the @Vera character images. Soft painted shading, slightly simplified stylized forms, smooth painted skin without pores, visible brush-like texture in hair, clothes and background. This is an animated cartoon-film frame, NOT live action, NOT a photograph, NOT photorealistic, NOT a real human actor.</w:t>
+      </w:r>
+    </w:p>
+    <w:p>
+      <w:pPr>
+        <w:shd w:fill="F2EFEA" w:color="auto" w:val="clear"/>
+        <w:spacing w:after="0"/>
+        <w:ind w:left="120" w:right="120"/>
+      </w:pPr>
+      <w:r>
+        <w:rPr>
+          <w:rFonts w:ascii="Consolas" w:cs="Consolas" w:eastAsia="Consolas" w:hAnsi="Consolas"/>
+          <w:sz w:val="16"/>
+          <w:szCs w:val="16"/>
+        </w:rPr>
         <w:t xml:space="preserve">[SCENE] Aftermath of the blast: Vera walks through swirling embers in front of the wrecked, burning unit 4.</w:t>
       </w:r>
     </w:p>
@@ -3702,7 +3807,7 @@
           <w:sz w:val="16"/>
           <w:szCs w:val="16"/>
         </w:rPr>
-        <w:t xml:space="preserve">[REFERENCES] Vera is the character @Vera — keep her face, body, outfit and voice exactly the same in every frame. Use @loc_unit4_night as the setting.</w:t>
+        <w:t xml:space="preserve">[REFERENCES] Vera is the character @Vera — keep her face, body, outfit, art style and voice exactly as in the character images, in every frame. Do not make her more realistic than the character images. Use @loc_unit4_night as the setting, painted in the same animated style.</w:t>
       </w:r>
     </w:p>
     <w:p>
@@ -3792,7 +3897,7 @@
           <w:sz w:val="16"/>
           <w:szCs w:val="16"/>
         </w:rPr>
-        <w:t xml:space="preserve">[LIGHT] Red-orange firelight flickering on her face, black smoke, first blue flashes.</w:t>
+        <w:t xml:space="preserve">[LIGHT] Red-orange firelight flickering on her face, black smoke, first blue flashes — stylized, soft, like an animated film.</w:t>
       </w:r>
     </w:p>
     <w:p>
@@ -3822,7 +3927,7 @@
           <w:sz w:val="16"/>
           <w:szCs w:val="16"/>
         </w:rPr>
-        <w:t xml:space="preserve">[STYLE] Semi-realistic cinematic 3D/2.5D animation with a subtle painterly texture, natural adult proportions, expressive realistic facial acting, motivated lighting, atmospheric depth, historically plausible props and architecture. Not cartoonish, not photorealistic. Vertical 9:16.</w:t>
+        <w:t xml:space="preserve">[AVOID] No photorealism, no live-action look, no real-person faces, no skin pores or photographic detail, no film-camera realism; no shots without Vera; no static or frozen background; no English speech, no other voices speaking words, no extra lines, no music; no subtitles or on-screen text, no logos, no watermarks; no extra fingers, no face, style or outfit changes, no modern objects, no gratuitous gore.</w:t>
       </w:r>
     </w:p>
     <w:p>
@@ -3837,7 +3942,7 @@
           <w:sz w:val="16"/>
           <w:szCs w:val="16"/>
         </w:rPr>
-        <w:t xml:space="preserve">[AVOID] No shots without Vera, Vera never leaves the frame; no static or frozen background, no idle crowd; no English speech, no other voices speaking words, no extra lines, no music; no subtitles, captions or on-screen text, no logos, no watermarks; no extra fingers, no face, voice or outfit changes, no modern objects, no gratuitous gore.</w:t>
+        <w:t xml:space="preserve">[STYLE REMINDER] Whole clip in the same stylized painterly 3D animation style as the @Vera character images, not realistic; all other people are stylized animated characters too.</w:t>
       </w:r>
     </w:p>
     <w:p>
@@ -3887,6 +3992,21 @@
           <w:sz w:val="16"/>
           <w:szCs w:val="16"/>
         </w:rPr>
+        <w:t xml:space="preserve">[STYLE — MOST IMPORTANT] Stylized 3D animated feature-film look with a hand-painted, painterly texture — exactly the same drawn, illustrated style as the @Vera character images. Soft painted shading, slightly simplified stylized forms, smooth painted skin without pores, visible brush-like texture in hair, clothes and background. This is an animated cartoon-film frame, NOT live action, NOT a photograph, NOT photorealistic, NOT a real human actor.</w:t>
+      </w:r>
+    </w:p>
+    <w:p>
+      <w:pPr>
+        <w:shd w:fill="F2EFEA" w:color="auto" w:val="clear"/>
+        <w:spacing w:after="0"/>
+        <w:ind w:left="120" w:right="120"/>
+      </w:pPr>
+      <w:r>
+        <w:rPr>
+          <w:rFonts w:ascii="Consolas" w:cs="Consolas" w:eastAsia="Consolas" w:hAnsi="Consolas"/>
+          <w:sz w:val="16"/>
+          <w:szCs w:val="16"/>
+        </w:rPr>
         <w:t xml:space="preserve">[SCENE] Response: fire engines rush in and firefighters run past behind Vera toward the burning building.</w:t>
       </w:r>
     </w:p>
@@ -3902,7 +4022,7 @@
           <w:sz w:val="16"/>
           <w:szCs w:val="16"/>
         </w:rPr>
-        <w:t xml:space="preserve">[REFERENCES] Vera is the character @Vera — keep her face, body, outfit and voice exactly the same in every frame. Use @loc_unit4_night as the setting. Use @ref_firefighter as the exact look of the firefighters.</w:t>
+        <w:t xml:space="preserve">[REFERENCES] Vera is the character @Vera — keep her face, body, outfit, art style and voice exactly as in the character images, in every frame. Do not make her more realistic than the character images. Use @loc_unit4_night as the setting, painted in the same animated style. Use @ref_firefighter as the exact look of the firefighters, in the same animated style.</w:t>
       </w:r>
     </w:p>
     <w:p>
@@ -3992,7 +4112,7 @@
           <w:sz w:val="16"/>
           <w:szCs w:val="16"/>
         </w:rPr>
-        <w:t xml:space="preserve">[LIGHT] Blue flashing lights mixed with orange firelight from above.</w:t>
+        <w:t xml:space="preserve">[LIGHT] Blue flashing lights mixed with orange firelight from above — stylized, soft, like an animated film.</w:t>
       </w:r>
     </w:p>
     <w:p>
@@ -4022,7 +4142,7 @@
           <w:sz w:val="16"/>
           <w:szCs w:val="16"/>
         </w:rPr>
-        <w:t xml:space="preserve">[STYLE] Semi-realistic cinematic 3D/2.5D animation with a subtle painterly texture, natural adult proportions, expressive realistic facial acting, motivated lighting, atmospheric depth, historically plausible props and architecture. Not cartoonish, not photorealistic. Vertical 9:16.</w:t>
+        <w:t xml:space="preserve">[AVOID] No photorealism, no live-action look, no real-person faces, no skin pores or photographic detail, no film-camera realism; no shots without Vera; no static or frozen background; no English speech, no other voices speaking words, no extra lines, no music; no subtitles or on-screen text, no logos, no watermarks; no extra fingers, no face, style or outfit changes, no modern objects, no gratuitous gore.</w:t>
       </w:r>
     </w:p>
     <w:p>
@@ -4037,7 +4157,7 @@
           <w:sz w:val="16"/>
           <w:szCs w:val="16"/>
         </w:rPr>
-        <w:t xml:space="preserve">[AVOID] No shots without Vera, Vera never leaves the frame; no static or frozen background, no idle crowd; no English speech, no other voices speaking words, no extra lines, no music; no subtitles, captions or on-screen text, no logos, no watermarks; no extra fingers, no face, voice or outfit changes, no modern objects, no gratuitous gore.</w:t>
+        <w:t xml:space="preserve">[STYLE REMINDER] Whole clip in the same stylized painterly 3D animation style as the @Vera character images, not realistic; all other people are stylized animated characters too.</w:t>
       </w:r>
     </w:p>
     <w:p>
@@ -4087,6 +4207,21 @@
           <w:sz w:val="16"/>
           <w:szCs w:val="16"/>
         </w:rPr>
+        <w:t xml:space="preserve">[STYLE — MOST IMPORTANT] Stylized 3D animated feature-film look with a hand-painted, painterly texture — exactly the same drawn, illustrated style as the @Vera character images. Soft painted shading, slightly simplified stylized forms, smooth painted skin without pores, visible brush-like texture in hair, clothes and background. This is an animated cartoon-film frame, NOT live action, NOT a photograph, NOT photorealistic, NOT a real human actor.</w:t>
+      </w:r>
+    </w:p>
+    <w:p>
+      <w:pPr>
+        <w:shd w:fill="F2EFEA" w:color="auto" w:val="clear"/>
+        <w:spacing w:after="0"/>
+        <w:ind w:left="120" w:right="120"/>
+      </w:pPr>
+      <w:r>
+        <w:rPr>
+          <w:rFonts w:ascii="Consolas" w:cs="Consolas" w:eastAsia="Consolas" w:hAnsi="Consolas"/>
+          <w:sz w:val="16"/>
+          <w:szCs w:val="16"/>
+        </w:rPr>
         <w:t xml:space="preserve">[SCENE] Resolution of the night: firefighters fight the fire on the roof above Vera as dawn approaches.</w:t>
       </w:r>
     </w:p>
@@ -4102,7 +4237,7 @@
           <w:sz w:val="16"/>
           <w:szCs w:val="16"/>
         </w:rPr>
-        <w:t xml:space="preserve">[REFERENCES] Vera is the character @Vera — keep her face, body, outfit and voice exactly the same in every frame. Use @loc_unit4_night as the setting. Use @ref_firefighter as the exact look of the firefighters.</w:t>
+        <w:t xml:space="preserve">[REFERENCES] Vera is the character @Vera — keep her face, body, outfit, art style and voice exactly as in the character images, in every frame. Do not make her more realistic than the character images. Use @loc_unit4_night as the setting, painted in the same animated style. Use @ref_firefighter as the exact look of the firefighters, in the same animated style.</w:t>
       </w:r>
     </w:p>
     <w:p>
@@ -4192,7 +4327,7 @@
           <w:sz w:val="16"/>
           <w:szCs w:val="16"/>
         </w:rPr>
-        <w:t xml:space="preserve">[LIGHT] Fading red glow turning into cold pre-dawn blue, water jets catching the light.</w:t>
+        <w:t xml:space="preserve">[LIGHT] Fading red glow turning into cold pre-dawn blue, water jets catching the light — stylized, soft, like an animated film.</w:t>
       </w:r>
     </w:p>
     <w:p>
@@ -4222,7 +4357,7 @@
           <w:sz w:val="16"/>
           <w:szCs w:val="16"/>
         </w:rPr>
-        <w:t xml:space="preserve">[STYLE] Semi-realistic cinematic 3D/2.5D animation with a subtle painterly texture, natural adult proportions, expressive realistic facial acting, motivated lighting, atmospheric depth, historically plausible props and architecture. Not cartoonish, not photorealistic. Vertical 9:16.</w:t>
+        <w:t xml:space="preserve">[AVOID] No photorealism, no live-action look, no real-person faces, no skin pores or photographic detail, no film-camera realism; no shots without Vera; no static or frozen background; no English speech, no other voices speaking words, no extra lines, no music; no subtitles or on-screen text, no logos, no watermarks; no extra fingers, no face, style or outfit changes, no modern objects, no gratuitous gore.</w:t>
       </w:r>
     </w:p>
     <w:p>
@@ -4237,7 +4372,7 @@
           <w:sz w:val="16"/>
           <w:szCs w:val="16"/>
         </w:rPr>
-        <w:t xml:space="preserve">[AVOID] No shots without Vera, Vera never leaves the frame; no static or frozen background, no idle crowd; no English speech, no other voices speaking words, no extra lines, no music; no subtitles, captions or on-screen text, no logos, no watermarks; no extra fingers, no face, voice or outfit changes, no modern objects, no gratuitous gore.</w:t>
+        <w:t xml:space="preserve">[STYLE REMINDER] Whole clip in the same stylized painterly 3D animation style as the @Vera character images, not realistic; all other people are stylized animated characters too.</w:t>
       </w:r>
     </w:p>
     <w:p>
@@ -4287,6 +4422,21 @@
           <w:sz w:val="16"/>
           <w:szCs w:val="16"/>
         </w:rPr>
+        <w:t xml:space="preserve">[STYLE — MOST IMPORTANT] Stylized 3D animated feature-film look with a hand-painted, painterly texture — exactly the same drawn, illustrated style as the @Vera character images. Soft painted shading, slightly simplified stylized forms, smooth painted skin without pores, visible brush-like texture in hair, clothes and background. This is an animated cartoon-film frame, NOT live action, NOT a photograph, NOT photorealistic, NOT a real human actor.</w:t>
+      </w:r>
+    </w:p>
+    <w:p>
+      <w:pPr>
+        <w:shd w:fill="F2EFEA" w:color="auto" w:val="clear"/>
+        <w:spacing w:after="0"/>
+        <w:ind w:left="120" w:right="120"/>
+      </w:pPr>
+      <w:r>
+        <w:rPr>
+          <w:rFonts w:ascii="Consolas" w:cs="Consolas" w:eastAsia="Consolas" w:hAnsi="Consolas"/>
+          <w:sz w:val="16"/>
+          <w:szCs w:val="16"/>
+        </w:rPr>
         <w:t xml:space="preserve">[SCENE] Contrast: a lively ordinary Saturday morning in Pripyat while smoke rises over the distant plant.</w:t>
       </w:r>
     </w:p>
@@ -4302,7 +4452,7 @@
           <w:sz w:val="16"/>
           <w:szCs w:val="16"/>
         </w:rPr>
-        <w:t xml:space="preserve">[REFERENCES] Vera is the character @Vera — keep her face, body, outfit and voice exactly the same in every frame. Use @loc_pripyat_street as the setting.</w:t>
+        <w:t xml:space="preserve">[REFERENCES] Vera is the character @Vera — keep her face, body, outfit, art style and voice exactly as in the character images, in every frame. Do not make her more realistic than the character images. Use @loc_pripyat_street as the setting, painted in the same animated style.</w:t>
       </w:r>
     </w:p>
     <w:p>
@@ -4392,7 +4542,7 @@
           <w:sz w:val="16"/>
           <w:szCs w:val="16"/>
         </w:rPr>
-        <w:t xml:space="preserve">[LIGHT] Soft warm morning sun, pale blue sky, her wine-red scarf as the accent.</w:t>
+        <w:t xml:space="preserve">[LIGHT] Soft warm morning sun, pale blue sky, her wine-red scarf as the accent — stylized, soft, like an animated film.</w:t>
       </w:r>
     </w:p>
     <w:p>
@@ -4422,7 +4572,7 @@
           <w:sz w:val="16"/>
           <w:szCs w:val="16"/>
         </w:rPr>
-        <w:t xml:space="preserve">[STYLE] Semi-realistic cinematic 3D/2.5D animation with a subtle painterly texture, natural adult proportions, expressive realistic facial acting, motivated lighting, atmospheric depth, historically plausible props and architecture. Not cartoonish, not photorealistic. Vertical 9:16.</w:t>
+        <w:t xml:space="preserve">[AVOID] No photorealism, no live-action look, no real-person faces, no skin pores or photographic detail, no film-camera realism; no shots without Vera; no static or frozen background; no English speech, no other voices speaking words, no extra lines, no music; no subtitles or on-screen text, no logos, no watermarks; no extra fingers, no face, style or outfit changes, no modern objects, no gratuitous gore.</w:t>
       </w:r>
     </w:p>
     <w:p>
@@ -4437,7 +4587,7 @@
           <w:sz w:val="16"/>
           <w:szCs w:val="16"/>
         </w:rPr>
-        <w:t xml:space="preserve">[AVOID] No shots without Vera, Vera never leaves the frame; no static or frozen background, no idle crowd; no English speech, no other voices speaking words, no extra lines, no music; no subtitles, captions or on-screen text, no logos, no watermarks; no extra fingers, no face, voice or outfit changes, no modern objects, no gratuitous gore.</w:t>
+        <w:t xml:space="preserve">[STYLE REMINDER] Whole clip in the same stylized painterly 3D animation style as the @Vera character images, not realistic; all other people are stylized animated characters too.</w:t>
       </w:r>
     </w:p>
     <w:p>
@@ -4487,6 +4637,21 @@
           <w:sz w:val="16"/>
           <w:szCs w:val="16"/>
         </w:rPr>
+        <w:t xml:space="preserve">[STYLE — MOST IMPORTANT] Stylized 3D animated feature-film look with a hand-painted, painterly texture — exactly the same drawn, illustrated style as the @Vera character images. Soft painted shading, slightly simplified stylized forms, smooth painted skin without pores, visible brush-like texture in hair, clothes and background. This is an animated cartoon-film frame, NOT live action, NOT a photograph, NOT photorealistic, NOT a real human actor.</w:t>
+      </w:r>
+    </w:p>
+    <w:p>
+      <w:pPr>
+        <w:shd w:fill="F2EFEA" w:color="auto" w:val="clear"/>
+        <w:spacing w:after="0"/>
+        <w:ind w:left="120" w:right="120"/>
+      </w:pPr>
+      <w:r>
+        <w:rPr>
+          <w:rFonts w:ascii="Consolas" w:cs="Consolas" w:eastAsia="Consolas" w:hAnsi="Consolas"/>
+          <w:sz w:val="16"/>
+          <w:szCs w:val="16"/>
+        </w:rPr>
         <w:t xml:space="preserve">[SCENE] Consequence: the evacuation of Pripyat in full motion around Vera.</w:t>
       </w:r>
     </w:p>
@@ -4502,7 +4667,7 @@
           <w:sz w:val="16"/>
           <w:szCs w:val="16"/>
         </w:rPr>
-        <w:t xml:space="preserve">[REFERENCES] Vera is the character @Vera — keep her face, body, outfit and voice exactly the same in every frame. Use @loc_pripyat_street as the setting.</w:t>
+        <w:t xml:space="preserve">[REFERENCES] Vera is the character @Vera — keep her face, body, outfit, art style and voice exactly as in the character images, in every frame. Do not make her more realistic than the character images. Use @loc_pripyat_street as the setting, painted in the same animated style.</w:t>
       </w:r>
     </w:p>
     <w:p>
@@ -4592,7 +4757,7 @@
           <w:sz w:val="16"/>
           <w:szCs w:val="16"/>
         </w:rPr>
-        <w:t xml:space="preserve">[LIGHT] Bright spring daylight, dust in the sunbeams, muted pastel colours.</w:t>
+        <w:t xml:space="preserve">[LIGHT] Bright spring daylight, dust in the sunbeams, muted pastel colours — stylized, soft, like an animated film.</w:t>
       </w:r>
     </w:p>
     <w:p>
@@ -4622,7 +4787,7 @@
           <w:sz w:val="16"/>
           <w:szCs w:val="16"/>
         </w:rPr>
-        <w:t xml:space="preserve">[STYLE] Semi-realistic cinematic 3D/2.5D animation with a subtle painterly texture, natural adult proportions, expressive realistic facial acting, motivated lighting, atmospheric depth, historically plausible props and architecture. Not cartoonish, not photorealistic. Vertical 9:16.</w:t>
+        <w:t xml:space="preserve">[AVOID] No photorealism, no live-action look, no real-person faces, no skin pores or photographic detail, no film-camera realism; no shots without Vera; no static or frozen background; no English speech, no other voices speaking words, no extra lines, no music; no subtitles or on-screen text, no logos, no watermarks; no extra fingers, no face, style or outfit changes, no modern objects, no gratuitous gore.</w:t>
       </w:r>
     </w:p>
     <w:p>
@@ -4637,7 +4802,7 @@
           <w:sz w:val="16"/>
           <w:szCs w:val="16"/>
         </w:rPr>
-        <w:t xml:space="preserve">[AVOID] No shots without Vera, Vera never leaves the frame; no static or frozen background, no idle crowd; no English speech, no other voices speaking words, no extra lines, no music; no subtitles, captions or on-screen text, no logos, no watermarks; no extra fingers, no face, voice or outfit changes, no modern objects, no gratuitous gore.</w:t>
+        <w:t xml:space="preserve">[STYLE REMINDER] Whole clip in the same stylized painterly 3D animation style as the @Vera character images, not realistic; all other people are stylized animated characters too.</w:t>
       </w:r>
     </w:p>
     <w:p>
@@ -4687,6 +4852,21 @@
           <w:sz w:val="16"/>
           <w:szCs w:val="16"/>
         </w:rPr>
+        <w:t xml:space="preserve">[STYLE — MOST IMPORTANT] Stylized 3D animated feature-film look with a hand-painted, painterly texture — exactly the same drawn, illustrated style as the @Vera character images. Soft painted shading, slightly simplified stylized forms, smooth painted skin without pores, visible brush-like texture in hair, clothes and background. This is an animated cartoon-film frame, NOT live action, NOT a photograph, NOT photorealistic, NOT a real human actor.</w:t>
+      </w:r>
+    </w:p>
+    <w:p>
+      <w:pPr>
+        <w:shd w:fill="F2EFEA" w:color="auto" w:val="clear"/>
+        <w:spacing w:after="0"/>
+        <w:ind w:left="120" w:right="120"/>
+      </w:pPr>
+      <w:r>
+        <w:rPr>
+          <w:rFonts w:ascii="Consolas" w:cs="Consolas" w:eastAsia="Consolas" w:hAnsi="Consolas"/>
+          <w:sz w:val="16"/>
+          <w:szCs w:val="16"/>
+        </w:rPr>
         <w:t xml:space="preserve">[SCENE] Final: Vera alone in the empty, evacuated city; the wind is the only movement left.</w:t>
       </w:r>
     </w:p>
@@ -4702,7 +4882,7 @@
           <w:sz w:val="16"/>
           <w:szCs w:val="16"/>
         </w:rPr>
-        <w:t xml:space="preserve">[REFERENCES] Vera is the character @Vera — keep her face, body, outfit and voice exactly the same in every frame. Use @loc_pripyat_street as the setting.</w:t>
+        <w:t xml:space="preserve">[REFERENCES] Vera is the character @Vera — keep her face, body, outfit, art style and voice exactly as in the character images, in every frame. Do not make her more realistic than the character images. Use @loc_pripyat_street as the setting, painted in the same animated style.</w:t>
       </w:r>
     </w:p>
     <w:p>
@@ -4792,7 +4972,7 @@
           <w:sz w:val="16"/>
           <w:szCs w:val="16"/>
         </w:rPr>
-        <w:t xml:space="preserve">[LIGHT] Cold grey-blue overcast light, desaturated, her wine-red scarf the only warm colour.</w:t>
+        <w:t xml:space="preserve">[LIGHT] Cold grey-blue overcast light, desaturated, her wine-red scarf the only warm colour — stylized, soft, like an animated film.</w:t>
       </w:r>
     </w:p>
     <w:p>
@@ -4822,7 +5002,7 @@
           <w:sz w:val="16"/>
           <w:szCs w:val="16"/>
         </w:rPr>
-        <w:t xml:space="preserve">[STYLE] Semi-realistic cinematic 3D/2.5D animation with a subtle painterly texture, natural adult proportions, expressive realistic facial acting, motivated lighting, atmospheric depth, historically plausible props and architecture. Not cartoonish, not photorealistic. Vertical 9:16.</w:t>
+        <w:t xml:space="preserve">[AVOID] No photorealism, no live-action look, no real-person faces, no skin pores or photographic detail, no film-camera realism; no shots without Vera; no static or frozen background; no English speech, no other voices speaking words, no extra lines, no music; no subtitles or on-screen text, no logos, no watermarks; no extra fingers, no face, style or outfit changes, no modern objects, no gratuitous gore.</w:t>
       </w:r>
     </w:p>
     <w:p>
@@ -4837,7 +5017,7 @@
           <w:sz w:val="16"/>
           <w:szCs w:val="16"/>
         </w:rPr>
-        <w:t xml:space="preserve">[AVOID] No shots without Vera, Vera never leaves the frame; no static or frozen background, no idle crowd; no English speech, no other voices speaking words, no extra lines, no music; no subtitles, captions or on-screen text, no logos, no watermarks; no extra fingers, no face, voice or outfit changes, no modern objects, no gratuitous gore.</w:t>
+        <w:t xml:space="preserve">[STYLE REMINDER] Whole clip in the same stylized painterly 3D animation style as the @Vera character images, not realistic; all other people are stylized animated characters too.</w:t>
       </w:r>
     </w:p>
     <w:p>
@@ -4846,6 +5026,14 @@
       </w:pPr>
       <w:r>
         <w:t xml:space="preserve">6. Проверка каждого клипа</w:t>
+      </w:r>
+    </w:p>
+    <w:p>
+      <w:pPr>
+        <w:spacing w:after="80"/>
+      </w:pPr>
+      <w:r>
+        <w:t xml:space="preserve">Все промпты начинаются с блока [STYLE — MOST IMPORTANT]: Omni Flash по умолчанию делает реалистично, этот блок держит рисованный стиль персонажа. Если всё равно реалистично — замените картинки персонажа на исходный нарисованный vera_face_reference.png или запустите клип в режиме Frames со стартовым кадром в нужном стиле.</w:t>
       </w:r>
     </w:p>
     <w:p>

</xml_diff>

<commit_message>
EP01 v7: eerie mood in all 12 prompts, new hook and finale lines
Co-Authored-By: Claude Opus 5.5 <noreply@anthropic.com>
Claude-Session: https://claude.ai/code/session_01VAADPC5RMETnb7oPTVQosk
</commit_message>
<xml_diff>
--- a/episodes/EP01_chernobyl_night/EP01_Чернобыль_Рабочие_промпты.docx
+++ b/episodes/EP01_chernobyl_night/EP01_Чернобыль_Рабочие_промпты.docx
@@ -907,7 +907,7 @@
                 <w:b w:val="false"/>
                 <w:bCs w:val="false"/>
               </w:rPr>
-              <w:t xml:space="preserve">Видите здание за моей спиной? Через несколько минут реактор в нём взорвётся.</w:t>
+              <w:t xml:space="preserve">Видите здание за спиной? Там ещё никто не знает: через несколько минут реактор взорвётся.</w:t>
             </w:r>
           </w:p>
         </w:tc>
@@ -2403,7 +2403,7 @@
                 <w:b w:val="false"/>
                 <w:bCs w:val="false"/>
               </w:rPr>
-              <w:t xml:space="preserve">Виновата не одна кнопка, а изъян реактора и нарушения при испытании. Город, которому было шестнадцать лет, пустует до сих пор.</w:t>
+              <w:t xml:space="preserve">Виновата не одна кнопка, а изъян реактора и нарушения при испытании. Город пустует уже сорок лет. Такой была ночь Чернобыля.</w:t>
             </w:r>
           </w:p>
         </w:tc>
@@ -2472,37 +2472,37 @@
         <w:t xml:space="preserve">Реплика:</w:t>
       </w:r>
       <w:r>
-        <w:t xml:space="preserve"> «Видите здание за моей спиной? Через несколько минут реактор в нём взорвётся.»</w:t>
-      </w:r>
-    </w:p>
-    <w:p>
-      <w:pPr>
-        <w:shd w:fill="F2EFEA" w:color="auto" w:val="clear"/>
-        <w:spacing w:after="0"/>
-        <w:ind w:left="120" w:right="120"/>
-      </w:pPr>
-      <w:r>
-        <w:rPr>
-          <w:rFonts w:ascii="Consolas" w:cs="Consolas" w:eastAsia="Consolas" w:hAnsi="Consolas"/>
-          <w:sz w:val="16"/>
-          <w:szCs w:val="16"/>
-        </w:rPr>
-        <w:t xml:space="preserve">[STYLE — MOST IMPORTANT] Stylized 3D animated feature-film look with a hand-painted, painterly texture — exactly the same drawn, illustrated style as the @Vera character images. Soft painted shading, slightly simplified stylized forms, smooth painted skin without pores, visible brush-like texture in hair, clothes and background. This is an animated cartoon-film frame, NOT live action, NOT a photograph, NOT photorealistic, NOT a real human actor.</w:t>
-      </w:r>
-    </w:p>
-    <w:p>
-      <w:pPr>
-        <w:shd w:fill="F2EFEA" w:color="auto" w:val="clear"/>
-        <w:spacing w:after="0"/>
-        <w:ind w:left="120" w:right="120"/>
-      </w:pPr>
-      <w:r>
-        <w:rPr>
-          <w:rFonts w:ascii="Consolas" w:cs="Consolas" w:eastAsia="Consolas" w:hAnsi="Consolas"/>
-          <w:sz w:val="16"/>
-          <w:szCs w:val="16"/>
-        </w:rPr>
-        <w:t xml:space="preserve">[SCENE] Hook: Vera walks toward the camera along the access road of the Chernobyl plant minutes before the accident while the night shift moves all around her.</w:t>
+        <w:t xml:space="preserve"> «Видите здание за спиной? Там ещё никто не знает: через несколько минут реактор взорвётся.»</w:t>
+      </w:r>
+    </w:p>
+    <w:p>
+      <w:pPr>
+        <w:shd w:fill="F2EFEA" w:color="auto" w:val="clear"/>
+        <w:spacing w:after="0"/>
+        <w:ind w:left="120" w:right="120"/>
+      </w:pPr>
+      <w:r>
+        <w:rPr>
+          <w:rFonts w:ascii="Consolas" w:cs="Consolas" w:eastAsia="Consolas" w:hAnsi="Consolas"/>
+          <w:sz w:val="16"/>
+          <w:szCs w:val="16"/>
+        </w:rPr>
+        <w:t xml:space="preserve">[STYLE — MOST IMPORTANT] Stylized 3D animated feature-film look with a hand-painted, painterly texture — exactly the same drawn, illustrated style as the @Vera character images. Soft painted shading, slightly simplified stylized forms, smooth painted skin without pores, visible brush-like texture in hair, clothes and background. This is an animated cartoon-film frame, NOT live action, NOT a photograph, NOT photorealistic, NOT a real human actor. Mood: eerie, ominous, slow-building dread, like the quiet opening of a mystery thriller.</w:t>
+      </w:r>
+    </w:p>
+    <w:p>
+      <w:pPr>
+        <w:shd w:fill="F2EFEA" w:color="auto" w:val="clear"/>
+        <w:spacing w:after="0"/>
+        <w:ind w:left="120" w:right="120"/>
+      </w:pPr>
+      <w:r>
+        <w:rPr>
+          <w:rFonts w:ascii="Consolas" w:cs="Consolas" w:eastAsia="Consolas" w:hAnsi="Consolas"/>
+          <w:sz w:val="16"/>
+          <w:szCs w:val="16"/>
+        </w:rPr>
+        <w:t xml:space="preserve">[SCENE] Hook: minutes before the accident, Vera stands in the eerie stillness outside the Chernobyl unit 4 building and quietly warns the viewer.</w:t>
       </w:r>
     </w:p>
     <w:p>
@@ -2532,112 +2532,112 @@
           <w:sz w:val="16"/>
           <w:szCs w:val="16"/>
         </w:rPr>
-        <w:t xml:space="preserve">[VERA] Vera is the main character and stays clearly visible from the first to the last frame, face readable. Vera walks slowly toward the camera in the lower half of the frame, then stops and looks straight into the lens; the wind moves her hair and scarf.</w:t>
-      </w:r>
-    </w:p>
-    <w:p>
-      <w:pPr>
-        <w:shd w:fill="F2EFEA" w:color="auto" w:val="clear"/>
-        <w:spacing w:after="0"/>
-        <w:ind w:left="120" w:right="120"/>
-      </w:pPr>
-      <w:r>
-        <w:rPr>
-          <w:rFonts w:ascii="Consolas" w:cs="Consolas" w:eastAsia="Consolas" w:hAnsi="Consolas"/>
-          <w:sz w:val="16"/>
-          <w:szCs w:val="16"/>
-        </w:rPr>
-        <w:t xml:space="preserve">[SPEECH] Vera says aloud in Russian, once, in her own character voice, quiet and tense, almost confidential: "Видите здание за моей спиной? Через несколько минут реактор в нём взорвётся." Russian only. Her lips and jaw move naturally with every Russian word. She starts at about 0.5 seconds and finishes before the end of the clip.</w:t>
-      </w:r>
-    </w:p>
-    <w:p>
-      <w:pPr>
-        <w:shd w:fill="F2EFEA" w:color="auto" w:val="clear"/>
-        <w:spacing w:after="0"/>
-        <w:ind w:left="120" w:right="120"/>
-      </w:pPr>
-      <w:r>
-        <w:rPr>
-          <w:rFonts w:ascii="Consolas" w:cs="Consolas" w:eastAsia="Consolas" w:hAnsi="Consolas"/>
-          <w:sz w:val="16"/>
-          <w:szCs w:val="16"/>
-        </w:rPr>
-        <w:t xml:space="preserve">[BACKGROUND ACTION — constant movement] Behind her the unit 4 building and the red-and-white striped ventilation stack: steam bursts rhythmically from roof vents and drifts across the floodlights; a column of shift workers in dark work clothes walks past behind her toward the gate; a 1980s Soviet bus with glowing headlights pulls up and its doors open; a lattice crane light blinks; moths swirl around the sodium lamps.</w:t>
-      </w:r>
-    </w:p>
-    <w:p>
-      <w:pPr>
-        <w:shd w:fill="F2EFEA" w:color="auto" w:val="clear"/>
-        <w:spacing w:after="0"/>
-        <w:ind w:left="120" w:right="120"/>
-      </w:pPr>
-      <w:r>
-        <w:rPr>
-          <w:rFonts w:ascii="Consolas" w:cs="Consolas" w:eastAsia="Consolas" w:hAnsi="Consolas"/>
-          <w:sz w:val="16"/>
-          <w:szCs w:val="16"/>
-        </w:rPr>
-        <w:t xml:space="preserve">[SETTING &amp; ERA] Night of 26 April 1986, about 1 a.m., Chernobyl nuclear power plant, Ukrainian SSR, USSR, clear windy spring night.</w:t>
-      </w:r>
-    </w:p>
-    <w:p>
-      <w:pPr>
-        <w:shd w:fill="F2EFEA" w:color="auto" w:val="clear"/>
-        <w:spacing w:after="0"/>
-        <w:ind w:left="120" w:right="120"/>
-      </w:pPr>
-      <w:r>
-        <w:rPr>
-          <w:rFonts w:ascii="Consolas" w:cs="Consolas" w:eastAsia="Consolas" w:hAnsi="Consolas"/>
-          <w:sz w:val="16"/>
-          <w:szCs w:val="16"/>
-        </w:rPr>
-        <w:t xml:space="preserve">[CAMERA] Handheld tracking shot moving backward in front of Vera as she walks, then a slow push-in when she stops. Vertical 9:16, Vera and the action both clearly visible.</w:t>
-      </w:r>
-    </w:p>
-    <w:p>
-      <w:pPr>
-        <w:shd w:fill="F2EFEA" w:color="auto" w:val="clear"/>
-        <w:spacing w:after="0"/>
-        <w:ind w:left="120" w:right="120"/>
-      </w:pPr>
-      <w:r>
-        <w:rPr>
-          <w:rFonts w:ascii="Consolas" w:cs="Consolas" w:eastAsia="Consolas" w:hAnsi="Consolas"/>
-          <w:sz w:val="16"/>
-          <w:szCs w:val="16"/>
-        </w:rPr>
-        <w:t xml:space="preserve">[LIGHT] Orange sodium light, cold blue sky, headlight beams sweeping across her face — stylized, soft, like an animated film.</w:t>
-      </w:r>
-    </w:p>
-    <w:p>
-      <w:pPr>
-        <w:shd w:fill="F2EFEA" w:color="auto" w:val="clear"/>
-        <w:spacing w:after="0"/>
-        <w:ind w:left="120" w:right="120"/>
-      </w:pPr>
-      <w:r>
-        <w:rPr>
-          <w:rFonts w:ascii="Consolas" w:cs="Consolas" w:eastAsia="Consolas" w:hAnsi="Consolas"/>
-          <w:sz w:val="16"/>
-          <w:szCs w:val="16"/>
-        </w:rPr>
-        <w:t xml:space="preserve">[AUDIO] Only Vera's Russian line in her character voice, plus layered ambient sound: crickets, transformer hum, footsteps, bus engine idling and doors hissing.</w:t>
-      </w:r>
-    </w:p>
-    <w:p>
-      <w:pPr>
-        <w:shd w:fill="F2EFEA" w:color="auto" w:val="clear"/>
-        <w:spacing w:after="0"/>
-        <w:ind w:left="120" w:right="120"/>
-      </w:pPr>
-      <w:r>
-        <w:rPr>
-          <w:rFonts w:ascii="Consolas" w:cs="Consolas" w:eastAsia="Consolas" w:hAnsi="Consolas"/>
-          <w:sz w:val="16"/>
-          <w:szCs w:val="16"/>
-        </w:rPr>
-        <w:t xml:space="preserve">[AVOID] No photorealism, no live-action look, no real-person faces, no skin pores or photographic detail, no film-camera realism; no shots without Vera; no static or frozen background; no English speech, no other voices speaking words, no extra lines, no music; no subtitles or on-screen text, no logos, no watermarks; no extra fingers, no face, style or outfit changes, no modern objects, no gratuitous gore.</w:t>
+        <w:t xml:space="preserve">[VERA] Vera is the main character and stays clearly visible from the first to the last frame, face readable. She stands in the lower half of the frame, half-lit by a flickering street lamp; she slowly glances back over her shoulder at the building, then turns her face to the camera and leans slightly closer to the lens, eyes wide and serious. Long dark worn coat, wine-red scarf, brass compass-rose brooch, dark waistcoat, light shirt.</w:t>
+      </w:r>
+    </w:p>
+    <w:p>
+      <w:pPr>
+        <w:shd w:fill="F2EFEA" w:color="auto" w:val="clear"/>
+        <w:spacing w:after="0"/>
+        <w:ind w:left="120" w:right="120"/>
+      </w:pPr>
+      <w:r>
+        <w:rPr>
+          <w:rFonts w:ascii="Consolas" w:cs="Consolas" w:eastAsia="Consolas" w:hAnsi="Consolas"/>
+          <w:sz w:val="16"/>
+          <w:szCs w:val="16"/>
+        </w:rPr>
+        <w:t xml:space="preserve">[SPEECH] Vera says aloud in Russian, once, in her own character voice, in a low half-whisper, tense and secretive, with a short pause after the question: "Видите здание за спиной? Там ещё никто не знает: через несколько минут реактор взорвётся." Russian only. Her lips and jaw move naturally with every Russian word. She starts at about 0.7 seconds and finishes before the end of the clip.</w:t>
+      </w:r>
+    </w:p>
+    <w:p>
+      <w:pPr>
+        <w:shd w:fill="F2EFEA" w:color="auto" w:val="clear"/>
+        <w:spacing w:after="0"/>
+        <w:ind w:left="120" w:right="120"/>
+      </w:pPr>
+      <w:r>
+        <w:rPr>
+          <w:rFonts w:ascii="Consolas" w:cs="Consolas" w:eastAsia="Consolas" w:hAnsi="Consolas"/>
+          <w:sz w:val="16"/>
+          <w:szCs w:val="16"/>
+        </w:rPr>
+        <w:t xml:space="preserve">[BACKGROUND ACTION — constant, unsettling movement] Behind her the unit 4 building and the red-and-white striped ventilation stack loom against the night sky; low fog creeps slowly across the ground toward the camera; sodium street lamps flicker and buzz, one goes dark and comes back; thick steam rises from the roof vents and drifts unnaturally slowly; a line of shift workers in dark work clothes walks silently past behind her without noticing her; a crow on a power line turns its head toward the building and flies off; the lit windows of the plant glow cold and empty.</w:t>
+      </w:r>
+    </w:p>
+    <w:p>
+      <w:pPr>
+        <w:shd w:fill="F2EFEA" w:color="auto" w:val="clear"/>
+        <w:spacing w:after="0"/>
+        <w:ind w:left="120" w:right="120"/>
+      </w:pPr>
+      <w:r>
+        <w:rPr>
+          <w:rFonts w:ascii="Consolas" w:cs="Consolas" w:eastAsia="Consolas" w:hAnsi="Consolas"/>
+          <w:sz w:val="16"/>
+          <w:szCs w:val="16"/>
+        </w:rPr>
+        <w:t xml:space="preserve">[SETTING &amp; ERA] Night of 26 April 1986, about 1 a.m., Chernobyl nuclear power plant, Ukrainian SSR, USSR, cold still spring night.</w:t>
+      </w:r>
+    </w:p>
+    <w:p>
+      <w:pPr>
+        <w:shd w:fill="F2EFEA" w:color="auto" w:val="clear"/>
+        <w:spacing w:after="0"/>
+        <w:ind w:left="120" w:right="120"/>
+      </w:pPr>
+      <w:r>
+        <w:rPr>
+          <w:rFonts w:ascii="Consolas" w:cs="Consolas" w:eastAsia="Consolas" w:hAnsi="Consolas"/>
+          <w:sz w:val="16"/>
+          <w:szCs w:val="16"/>
+        </w:rPr>
+        <w:t xml:space="preserve">[CAMERA] Very slow creeping push-in toward Vera from a low angle, with a barely noticeable tilt; the building towers over her. Vertical 9:16, Vera and the action both clearly visible.</w:t>
+      </w:r>
+    </w:p>
+    <w:p>
+      <w:pPr>
+        <w:shd w:fill="F2EFEA" w:color="auto" w:val="clear"/>
+        <w:spacing w:after="0"/>
+        <w:ind w:left="120" w:right="120"/>
+      </w:pPr>
+      <w:r>
+        <w:rPr>
+          <w:rFonts w:ascii="Consolas" w:cs="Consolas" w:eastAsia="Consolas" w:hAnsi="Consolas"/>
+          <w:sz w:val="16"/>
+          <w:szCs w:val="16"/>
+        </w:rPr>
+        <w:t xml:space="preserve">[LIGHT] Low-key painted lighting: sickly orange flicker of the sodium lamps on one side of her face, cold blue shadow on the other, long shadows stretching toward the camera, the stack lit from below — stylized, soft, like an animated film.</w:t>
+      </w:r>
+    </w:p>
+    <w:p>
+      <w:pPr>
+        <w:shd w:fill="F2EFEA" w:color="auto" w:val="clear"/>
+        <w:spacing w:after="0"/>
+        <w:ind w:left="120" w:right="120"/>
+      </w:pPr>
+      <w:r>
+        <w:rPr>
+          <w:rFonts w:ascii="Consolas" w:cs="Consolas" w:eastAsia="Consolas" w:hAnsi="Consolas"/>
+          <w:sz w:val="16"/>
+          <w:szCs w:val="16"/>
+        </w:rPr>
+        <w:t xml:space="preserve">[AUDIO] Only Vera's Russian line in her character voice, plus eerie ambient sound: a deep low hum of the power plant, buzzing of flickering lamps, a distant metallic creak, footsteps of the passing workers, crickets that suddenly fall silent just before she speaks.</w:t>
+      </w:r>
+    </w:p>
+    <w:p>
+      <w:pPr>
+        <w:shd w:fill="F2EFEA" w:color="auto" w:val="clear"/>
+        <w:spacing w:after="0"/>
+        <w:ind w:left="120" w:right="120"/>
+      </w:pPr>
+      <w:r>
+        <w:rPr>
+          <w:rFonts w:ascii="Consolas" w:cs="Consolas" w:eastAsia="Consolas" w:hAnsi="Consolas"/>
+          <w:sz w:val="16"/>
+          <w:szCs w:val="16"/>
+        </w:rPr>
+        <w:t xml:space="preserve">[AVOID] No photorealism, no live-action look, no real-person faces, no skin pores or photographic detail; no shots without Vera; no static or frozen background; no monsters, no supernatural creatures, no fire or explosion yet; no English speech, no other voices speaking words, no extra lines, no music; no subtitles or on-screen text, no logos, no watermarks; no extra fingers, no face, style or outfit changes, no gratuitous gore.</w:t>
       </w:r>
     </w:p>
     <w:p>
@@ -2652,7 +2652,7 @@
           <w:sz w:val="16"/>
           <w:szCs w:val="16"/>
         </w:rPr>
-        <w:t xml:space="preserve">[STYLE REMINDER] Whole clip in the same stylized painterly 3D animation style as the @Vera character images, not realistic; all other people are stylized animated characters too.</w:t>
+        <w:t xml:space="preserve">[STYLE REMINDER] Whole clip in the same stylized painterly 3D animation style as the @Vera character images, not realistic; all other people are stylized animated characters too; eerie, quiet, ominous mood.</w:t>
       </w:r>
     </w:p>
     <w:p>
@@ -2702,22 +2702,22 @@
           <w:sz w:val="16"/>
           <w:szCs w:val="16"/>
         </w:rPr>
-        <w:t xml:space="preserve">[STYLE — MOST IMPORTANT] Stylized 3D animated feature-film look with a hand-painted, painterly texture — exactly the same drawn, illustrated style as the @Vera character images. Soft painted shading, slightly simplified stylized forms, smooth painted skin without pores, visible brush-like texture in hair, clothes and background. This is an animated cartoon-film frame, NOT live action, NOT a photograph, NOT photorealistic, NOT a real human actor.</w:t>
-      </w:r>
-    </w:p>
-    <w:p>
-      <w:pPr>
-        <w:shd w:fill="F2EFEA" w:color="auto" w:val="clear"/>
-        <w:spacing w:after="0"/>
-        <w:ind w:left="120" w:right="120"/>
-      </w:pPr>
-      <w:r>
-        <w:rPr>
-          <w:rFonts w:ascii="Consolas" w:cs="Consolas" w:eastAsia="Consolas" w:hAnsi="Consolas"/>
-          <w:sz w:val="16"/>
-          <w:szCs w:val="16"/>
-        </w:rPr>
-        <w:t xml:space="preserve">[SCENE] Immersion: Vera walks along the busy unit 4 control room during the night shift as the test is being prepared; nobody notices her.</w:t>
+        <w:t xml:space="preserve">[STYLE — MOST IMPORTANT] Stylized 3D animated feature-film look with a hand-painted, painterly texture — exactly the same drawn, illustrated style as the @Vera character images. Soft painted shading, slightly simplified stylized forms, smooth painted skin without pores, visible brush-like texture in hair, clothes and background. This is an animated cartoon-film frame, NOT live action, NOT a photograph, NOT photorealistic, NOT a real human actor. Mood: uneasy, claustrophobic, quietly wrong — an ordinary night shift that feels like the calm before a disaster.</w:t>
+      </w:r>
+    </w:p>
+    <w:p>
+      <w:pPr>
+        <w:shd w:fill="F2EFEA" w:color="auto" w:val="clear"/>
+        <w:spacing w:after="0"/>
+        <w:ind w:left="120" w:right="120"/>
+      </w:pPr>
+      <w:r>
+        <w:rPr>
+          <w:rFonts w:ascii="Consolas" w:cs="Consolas" w:eastAsia="Consolas" w:hAnsi="Consolas"/>
+          <w:sz w:val="16"/>
+          <w:szCs w:val="16"/>
+        </w:rPr>
+        <w:t xml:space="preserve">[SCENE] Immersion: Vera moves through the dim unit 4 control room during the night shift; nobody sees her, and something feels wrong.</w:t>
       </w:r>
     </w:p>
     <w:p>
@@ -2747,112 +2747,112 @@
           <w:sz w:val="16"/>
           <w:szCs w:val="16"/>
         </w:rPr>
-        <w:t xml:space="preserve">[VERA] Vera is the main character and stays clearly visible from the first to the last frame, face readable. Vera walks along the long control desks toward the camera, glancing at the operators, then turns her face to the lens.</w:t>
-      </w:r>
-    </w:p>
-    <w:p>
-      <w:pPr>
-        <w:shd w:fill="F2EFEA" w:color="auto" w:val="clear"/>
-        <w:spacing w:after="0"/>
-        <w:ind w:left="120" w:right="120"/>
-      </w:pPr>
-      <w:r>
-        <w:rPr>
-          <w:rFonts w:ascii="Consolas" w:cs="Consolas" w:eastAsia="Consolas" w:hAnsi="Consolas"/>
-          <w:sz w:val="16"/>
-          <w:szCs w:val="16"/>
-        </w:rPr>
-        <w:t xml:space="preserve">[SPEECH] Vera says aloud in Russian, once, in her own character voice, calm and matter-of-fact, with a hint of unease: "Двадцать шестое апреля восемьдесят шестого. Четвёртый блок перед ремонтом, и ночью на нём проводят испытание." Russian only. Her lips and jaw move naturally with every Russian word. She starts at about 0.5 seconds and finishes before the end of the clip.</w:t>
-      </w:r>
-    </w:p>
-    <w:p>
-      <w:pPr>
-        <w:shd w:fill="F2EFEA" w:color="auto" w:val="clear"/>
-        <w:spacing w:after="0"/>
-        <w:ind w:left="120" w:right="120"/>
-      </w:pPr>
-      <w:r>
-        <w:rPr>
-          <w:rFonts w:ascii="Consolas" w:cs="Consolas" w:eastAsia="Consolas" w:hAnsi="Consolas"/>
-          <w:sz w:val="16"/>
-          <w:szCs w:val="16"/>
-        </w:rPr>
-        <w:t xml:space="preserve">[BACKGROUND ACTION — constant movement] Operators in white lab coats and caps are constantly busy behind her: one hurries past with a thick logbook, one turns large switches, one speaks into a desk telephone without audible words, one leans over a recorder chart as its paper scrolls; waves of indicator lamps blink across the circular wall panel; gauge needles twitch.</w:t>
-      </w:r>
-    </w:p>
-    <w:p>
-      <w:pPr>
-        <w:shd w:fill="F2EFEA" w:color="auto" w:val="clear"/>
-        <w:spacing w:after="0"/>
-        <w:ind w:left="120" w:right="120"/>
-      </w:pPr>
-      <w:r>
-        <w:rPr>
-          <w:rFonts w:ascii="Consolas" w:cs="Consolas" w:eastAsia="Consolas" w:hAnsi="Consolas"/>
-          <w:sz w:val="16"/>
-          <w:szCs w:val="16"/>
-        </w:rPr>
-        <w:t xml:space="preserve">[SETTING &amp; ERA] Night of 26 April 1986, about 1 a.m., unit 4 control room of the Chernobyl plant, long grey-green control desks.</w:t>
-      </w:r>
-    </w:p>
-    <w:p>
-      <w:pPr>
-        <w:shd w:fill="F2EFEA" w:color="auto" w:val="clear"/>
-        <w:spacing w:after="0"/>
-        <w:ind w:left="120" w:right="120"/>
-      </w:pPr>
-      <w:r>
-        <w:rPr>
-          <w:rFonts w:ascii="Consolas" w:cs="Consolas" w:eastAsia="Consolas" w:hAnsi="Consolas"/>
-          <w:sz w:val="16"/>
-          <w:szCs w:val="16"/>
-        </w:rPr>
-        <w:t xml:space="preserve">[CAMERA] Smooth dolly moving backward in front of Vera as she walks along the desks. Vertical 9:16, Vera and the action both clearly visible.</w:t>
-      </w:r>
-    </w:p>
-    <w:p>
-      <w:pPr>
-        <w:shd w:fill="F2EFEA" w:color="auto" w:val="clear"/>
-        <w:spacing w:after="0"/>
-        <w:ind w:left="120" w:right="120"/>
-      </w:pPr>
-      <w:r>
-        <w:rPr>
-          <w:rFonts w:ascii="Consolas" w:cs="Consolas" w:eastAsia="Consolas" w:hAnsi="Consolas"/>
-          <w:sz w:val="16"/>
-          <w:szCs w:val="16"/>
-        </w:rPr>
-        <w:t xml:space="preserve">[LIGHT] Cold fluorescent light, pale green-grey palette, flickering red and amber lamps, her wine-red scarf as the warm accent — stylized, soft, like an animated film.</w:t>
-      </w:r>
-    </w:p>
-    <w:p>
-      <w:pPr>
-        <w:shd w:fill="F2EFEA" w:color="auto" w:val="clear"/>
-        <w:spacing w:after="0"/>
-        <w:ind w:left="120" w:right="120"/>
-      </w:pPr>
-      <w:r>
-        <w:rPr>
-          <w:rFonts w:ascii="Consolas" w:cs="Consolas" w:eastAsia="Consolas" w:hAnsi="Consolas"/>
-          <w:sz w:val="16"/>
-          <w:szCs w:val="16"/>
-        </w:rPr>
-        <w:t xml:space="preserve">[AUDIO] Only Vera's Russian line in her character voice, plus layered ambient sound: electrical hum, relay clicks, telephone ring, footsteps on linoleum.</w:t>
-      </w:r>
-    </w:p>
-    <w:p>
-      <w:pPr>
-        <w:shd w:fill="F2EFEA" w:color="auto" w:val="clear"/>
-        <w:spacing w:after="0"/>
-        <w:ind w:left="120" w:right="120"/>
-      </w:pPr>
-      <w:r>
-        <w:rPr>
-          <w:rFonts w:ascii="Consolas" w:cs="Consolas" w:eastAsia="Consolas" w:hAnsi="Consolas"/>
-          <w:sz w:val="16"/>
-          <w:szCs w:val="16"/>
-        </w:rPr>
-        <w:t xml:space="preserve">[AVOID] No photorealism, no live-action look, no real-person faces, no skin pores or photographic detail, no film-camera realism; no shots without Vera; no static or frozen background; no English speech, no other voices speaking words, no extra lines, no music; no subtitles or on-screen text, no logos, no watermarks; no extra fingers, no face, style or outfit changes, no modern objects, no gratuitous gore.</w:t>
+        <w:t xml:space="preserve">[VERA] Vera is the main character and stays clearly visible from the first to the last frame, face readable. She walks slowly along the control desks toward the camera, looking at the operators with a worried frown, then stops and turns her face to the lens. Long dark worn coat, wine-red scarf, brass compass-rose brooch, dark waistcoat, light shirt.</w:t>
+      </w:r>
+    </w:p>
+    <w:p>
+      <w:pPr>
+        <w:shd w:fill="F2EFEA" w:color="auto" w:val="clear"/>
+        <w:spacing w:after="0"/>
+        <w:ind w:left="120" w:right="120"/>
+      </w:pPr>
+      <w:r>
+        <w:rPr>
+          <w:rFonts w:ascii="Consolas" w:cs="Consolas" w:eastAsia="Consolas" w:hAnsi="Consolas"/>
+          <w:sz w:val="16"/>
+          <w:szCs w:val="16"/>
+        </w:rPr>
+        <w:t xml:space="preserve">[SPEECH] Vera says aloud in Russian, once, in her own character voice, quietly, in a low tense voice, like someone telling a secret: "Двадцать шестое апреля восемьдесят шестого. Четвёртый блок перед ремонтом, и ночью на нём проводят испытание." Russian only. Her lips and jaw move naturally with every Russian word. She starts at about 0.4 seconds and finishes before the end of the clip.</w:t>
+      </w:r>
+    </w:p>
+    <w:p>
+      <w:pPr>
+        <w:shd w:fill="F2EFEA" w:color="auto" w:val="clear"/>
+        <w:spacing w:after="0"/>
+        <w:ind w:left="120" w:right="120"/>
+      </w:pPr>
+      <w:r>
+        <w:rPr>
+          <w:rFonts w:ascii="Consolas" w:cs="Consolas" w:eastAsia="Consolas" w:hAnsi="Consolas"/>
+          <w:sz w:val="16"/>
+          <w:szCs w:val="16"/>
+        </w:rPr>
+        <w:t xml:space="preserve">[BACKGROUND ACTION — constant, unsettling movement] Behind her the night shift works under buzzing fluorescent tubes, one of them flickering: an operator in a white coat hurries past with a thick logbook, another turns heavy switches, another listens to a desk telephone with a tense face without audible words; a recorder pen scratches across scrolling paper; rows of indicator lamps blink in an irregular rhythm across the circular wall panel; long shadows of the operators slide across the wall.</w:t>
+      </w:r>
+    </w:p>
+    <w:p>
+      <w:pPr>
+        <w:shd w:fill="F2EFEA" w:color="auto" w:val="clear"/>
+        <w:spacing w:after="0"/>
+        <w:ind w:left="120" w:right="120"/>
+      </w:pPr>
+      <w:r>
+        <w:rPr>
+          <w:rFonts w:ascii="Consolas" w:cs="Consolas" w:eastAsia="Consolas" w:hAnsi="Consolas"/>
+          <w:sz w:val="16"/>
+          <w:szCs w:val="16"/>
+        </w:rPr>
+        <w:t xml:space="preserve">[SETTING &amp; ERA] Night of 26 April 1986, about 1 a.m., unit 4 control room of the Chernobyl plant, long grey-green control desks, no windows.</w:t>
+      </w:r>
+    </w:p>
+    <w:p>
+      <w:pPr>
+        <w:shd w:fill="F2EFEA" w:color="auto" w:val="clear"/>
+        <w:spacing w:after="0"/>
+        <w:ind w:left="120" w:right="120"/>
+      </w:pPr>
+      <w:r>
+        <w:rPr>
+          <w:rFonts w:ascii="Consolas" w:cs="Consolas" w:eastAsia="Consolas" w:hAnsi="Consolas"/>
+          <w:sz w:val="16"/>
+          <w:szCs w:val="16"/>
+        </w:rPr>
+        <w:t xml:space="preserve">[CAMERA] Slow dolly moving backward in front of Vera; slightly low angle, the long room stretching into darkness behind her. Vertical 9:16, Vera and the action both clearly visible.</w:t>
+      </w:r>
+    </w:p>
+    <w:p>
+      <w:pPr>
+        <w:shd w:fill="F2EFEA" w:color="auto" w:val="clear"/>
+        <w:spacing w:after="0"/>
+        <w:ind w:left="120" w:right="120"/>
+      </w:pPr>
+      <w:r>
+        <w:rPr>
+          <w:rFonts w:ascii="Consolas" w:cs="Consolas" w:eastAsia="Consolas" w:hAnsi="Consolas"/>
+          <w:sz w:val="16"/>
+          <w:szCs w:val="16"/>
+        </w:rPr>
+        <w:t xml:space="preserve">[LIGHT] Cold greenish fluorescent light with one flickering tube, deep shadows in the corners, small red and amber lamps glowing like eyes — stylized, soft, like an animated film.</w:t>
+      </w:r>
+    </w:p>
+    <w:p>
+      <w:pPr>
+        <w:shd w:fill="F2EFEA" w:color="auto" w:val="clear"/>
+        <w:spacing w:after="0"/>
+        <w:ind w:left="120" w:right="120"/>
+      </w:pPr>
+      <w:r>
+        <w:rPr>
+          <w:rFonts w:ascii="Consolas" w:cs="Consolas" w:eastAsia="Consolas" w:hAnsi="Consolas"/>
+          <w:sz w:val="16"/>
+          <w:szCs w:val="16"/>
+        </w:rPr>
+        <w:t xml:space="preserve">[AUDIO] Only Vera's Russian line in her character voice, plus eerie ambient sound: electrical hum, buzzing flickering tube, relay clicks, scratching recorder, a telephone ringing once and stopping.</w:t>
+      </w:r>
+    </w:p>
+    <w:p>
+      <w:pPr>
+        <w:shd w:fill="F2EFEA" w:color="auto" w:val="clear"/>
+        <w:spacing w:after="0"/>
+        <w:ind w:left="120" w:right="120"/>
+      </w:pPr>
+      <w:r>
+        <w:rPr>
+          <w:rFonts w:ascii="Consolas" w:cs="Consolas" w:eastAsia="Consolas" w:hAnsi="Consolas"/>
+          <w:sz w:val="16"/>
+          <w:szCs w:val="16"/>
+        </w:rPr>
+        <w:t xml:space="preserve">[AVOID] No photorealism, no live-action look, no real-person faces, no skin pores or photographic detail; no shots without Vera; no static or frozen background; no monsters, no supernatural creatures; no English speech, no other voices speaking words, no extra lines, no music; no subtitles or on-screen text, no logos, no watermarks; no extra fingers, no face, style or outfit changes, no gratuitous gore.</w:t>
       </w:r>
     </w:p>
     <w:p>
@@ -2867,7 +2867,7 @@
           <w:sz w:val="16"/>
           <w:szCs w:val="16"/>
         </w:rPr>
-        <w:t xml:space="preserve">[STYLE REMINDER] Whole clip in the same stylized painterly 3D animation style as the @Vera character images, not realistic; all other people are stylized animated characters too.</w:t>
+        <w:t xml:space="preserve">[STYLE REMINDER] Whole clip in the same stylized painterly 3D animation style as the @Vera character images, not realistic; all other people are stylized animated characters too; uneasy, claustrophobic mood.</w:t>
       </w:r>
     </w:p>
     <w:p>
@@ -2917,22 +2917,22 @@
           <w:sz w:val="16"/>
           <w:szCs w:val="16"/>
         </w:rPr>
-        <w:t xml:space="preserve">[STYLE — MOST IMPORTANT] Stylized 3D animated feature-film look with a hand-painted, painterly texture — exactly the same drawn, illustrated style as the @Vera character images. Soft painted shading, slightly simplified stylized forms, smooth painted skin without pores, visible brush-like texture in hair, clothes and background. This is an animated cartoon-film frame, NOT live action, NOT a photograph, NOT photorealistic, NOT a real human actor.</w:t>
-      </w:r>
-    </w:p>
-    <w:p>
-      <w:pPr>
-        <w:shd w:fill="F2EFEA" w:color="auto" w:val="clear"/>
-        <w:spacing w:after="0"/>
-        <w:ind w:left="120" w:right="120"/>
-      </w:pPr>
-      <w:r>
-        <w:rPr>
-          <w:rFonts w:ascii="Consolas" w:cs="Consolas" w:eastAsia="Consolas" w:hAnsi="Consolas"/>
-          <w:sz w:val="16"/>
-          <w:szCs w:val="16"/>
-        </w:rPr>
-        <w:t xml:space="preserve">[SCENE] Rising tension: warning signals multiply in the control room behind Vera as she explains the danger.</w:t>
+        <w:t xml:space="preserve">[STYLE — MOST IMPORTANT] Stylized 3D animated feature-film look with a hand-painted, painterly texture — exactly the same drawn, illustrated style as the @Vera character images. Soft painted shading, slightly simplified stylized forms, smooth painted skin without pores, visible brush-like texture in hair, clothes and background. This is an animated cartoon-film frame, NOT live action, NOT a photograph, NOT photorealistic, NOT a real human actor. Mood: growing dread, tension tightening like a wire.</w:t>
+      </w:r>
+    </w:p>
+    <w:p>
+      <w:pPr>
+        <w:shd w:fill="F2EFEA" w:color="auto" w:val="clear"/>
+        <w:spacing w:after="0"/>
+        <w:ind w:left="120" w:right="120"/>
+      </w:pPr>
+      <w:r>
+        <w:rPr>
+          <w:rFonts w:ascii="Consolas" w:cs="Consolas" w:eastAsia="Consolas" w:hAnsi="Consolas"/>
+          <w:sz w:val="16"/>
+          <w:szCs w:val="16"/>
+        </w:rPr>
+        <w:t xml:space="preserve">[SCENE] Rising tension: warning signals multiply in the control room behind Vera while she explains the danger in a low voice.</w:t>
       </w:r>
     </w:p>
     <w:p>
@@ -2962,37 +2962,37 @@
           <w:sz w:val="16"/>
           <w:szCs w:val="16"/>
         </w:rPr>
-        <w:t xml:space="preserve">[VERA] Vera is the main character and stays clearly visible from the first to the last frame, face readable. Vera stands in a medium close-up facing the camera; behind her shoulder the room grows restless; once she glances back at a flashing panel, then looks into the lens again.</w:t>
-      </w:r>
-    </w:p>
-    <w:p>
-      <w:pPr>
-        <w:shd w:fill="F2EFEA" w:color="auto" w:val="clear"/>
-        <w:spacing w:after="0"/>
-        <w:ind w:left="120" w:right="120"/>
-      </w:pPr>
-      <w:r>
-        <w:rPr>
-          <w:rFonts w:ascii="Consolas" w:cs="Consolas" w:eastAsia="Consolas" w:hAnsi="Consolas"/>
-          <w:sz w:val="16"/>
-          <w:szCs w:val="16"/>
-        </w:rPr>
-        <w:t xml:space="preserve">[SPEECH] Vera says aloud in Russian, once, in her own character voice, worried, explaining simply and clearly: "Но реактор уже в опасном режиме: мощность упала слишком низко. А в этом режиме такой реактор может резко разогнаться." Russian only. Her lips and jaw move naturally with every Russian word. She starts at about 0.5 seconds and finishes before the end of the clip.</w:t>
-      </w:r>
-    </w:p>
-    <w:p>
-      <w:pPr>
-        <w:shd w:fill="F2EFEA" w:color="auto" w:val="clear"/>
-        <w:spacing w:after="0"/>
-        <w:ind w:left="120" w:right="120"/>
-      </w:pPr>
-      <w:r>
-        <w:rPr>
-          <w:rFonts w:ascii="Consolas" w:cs="Consolas" w:eastAsia="Consolas" w:hAnsi="Consolas"/>
-          <w:sz w:val="16"/>
-          <w:szCs w:val="16"/>
-        </w:rPr>
-        <w:t xml:space="preserve">[BACKGROUND ACTION — constant movement] Behind her more and more warning lamps light up across the wall panel, a recorder pen scratches wild zigzags, two operators lean over the desk arguing with sharp gestures without audible words, a third runs from one desk to another, a shift supervisor points at a gauge.</w:t>
+        <w:t xml:space="preserve">[VERA] Vera is the main character and stays clearly visible from the first to the last frame, face readable. She stands in a medium close-up facing the camera, very still while the room behind her grows restless; once she glances back at a flashing panel, then looks into the lens again, pale and serious. Long dark worn coat, wine-red scarf, brass compass-rose brooch, dark waistcoat, light shirt.</w:t>
+      </w:r>
+    </w:p>
+    <w:p>
+      <w:pPr>
+        <w:shd w:fill="F2EFEA" w:color="auto" w:val="clear"/>
+        <w:spacing w:after="0"/>
+        <w:ind w:left="120" w:right="120"/>
+      </w:pPr>
+      <w:r>
+        <w:rPr>
+          <w:rFonts w:ascii="Consolas" w:cs="Consolas" w:eastAsia="Consolas" w:hAnsi="Consolas"/>
+          <w:sz w:val="16"/>
+          <w:szCs w:val="16"/>
+        </w:rPr>
+        <w:t xml:space="preserve">[SPEECH] Vera says aloud in Russian, once, in her own character voice, low and tense, explaining simply, with growing worry: "Но реактор уже в опасном режиме: мощность упала слишком низко. А в этом режиме такой реактор может резко разогнаться." Russian only. Her lips and jaw move naturally with every Russian word. She starts at about 0.5 seconds and finishes before the end of the clip.</w:t>
+      </w:r>
+    </w:p>
+    <w:p>
+      <w:pPr>
+        <w:shd w:fill="F2EFEA" w:color="auto" w:val="clear"/>
+        <w:spacing w:after="0"/>
+        <w:ind w:left="120" w:right="120"/>
+      </w:pPr>
+      <w:r>
+        <w:rPr>
+          <w:rFonts w:ascii="Consolas" w:cs="Consolas" w:eastAsia="Consolas" w:hAnsi="Consolas"/>
+          <w:sz w:val="16"/>
+          <w:szCs w:val="16"/>
+        </w:rPr>
+        <w:t xml:space="preserve">[BACKGROUND ACTION — constant, unsettling movement] Behind her more and more warning lamps light up one by one across the wall panel like spreading red eyes; a recorder pen jerks into wild zigzags; two operators lean over the desk arguing with sharp gestures without audible words; a third runs from one desk to another; a gauge needle trembles and slowly climbs.</w:t>
       </w:r>
     </w:p>
     <w:p>
@@ -3022,52 +3022,52 @@
           <w:sz w:val="16"/>
           <w:szCs w:val="16"/>
         </w:rPr>
-        <w:t xml:space="preserve">[CAMERA] Slow handheld push-in toward Vera, slightly unsteady, the busy room behind her in focus. Vertical 9:16, Vera and the action both clearly visible.</w:t>
-      </w:r>
-    </w:p>
-    <w:p>
-      <w:pPr>
-        <w:shd w:fill="F2EFEA" w:color="auto" w:val="clear"/>
-        <w:spacing w:after="0"/>
-        <w:ind w:left="120" w:right="120"/>
-      </w:pPr>
-      <w:r>
-        <w:rPr>
-          <w:rFonts w:ascii="Consolas" w:cs="Consolas" w:eastAsia="Consolas" w:hAnsi="Consolas"/>
-          <w:sz w:val="16"/>
-          <w:szCs w:val="16"/>
-        </w:rPr>
-        <w:t xml:space="preserve">[LIGHT] Cold fluorescent light, blinking amber warning lamps reflecting on her face — stylized, soft, like an animated film.</w:t>
-      </w:r>
-    </w:p>
-    <w:p>
-      <w:pPr>
-        <w:shd w:fill="F2EFEA" w:color="auto" w:val="clear"/>
-        <w:spacing w:after="0"/>
-        <w:ind w:left="120" w:right="120"/>
-      </w:pPr>
-      <w:r>
-        <w:rPr>
-          <w:rFonts w:ascii="Consolas" w:cs="Consolas" w:eastAsia="Consolas" w:hAnsi="Consolas"/>
-          <w:sz w:val="16"/>
-          <w:szCs w:val="16"/>
-        </w:rPr>
-        <w:t xml:space="preserve">[AUDIO] Only Vera's Russian line in her character voice, plus layered ambient sound: electrical hum, irregular beeping, scratching recorder, rising tension in the room.</w:t>
-      </w:r>
-    </w:p>
-    <w:p>
-      <w:pPr>
-        <w:shd w:fill="F2EFEA" w:color="auto" w:val="clear"/>
-        <w:spacing w:after="0"/>
-        <w:ind w:left="120" w:right="120"/>
-      </w:pPr>
-      <w:r>
-        <w:rPr>
-          <w:rFonts w:ascii="Consolas" w:cs="Consolas" w:eastAsia="Consolas" w:hAnsi="Consolas"/>
-          <w:sz w:val="16"/>
-          <w:szCs w:val="16"/>
-        </w:rPr>
-        <w:t xml:space="preserve">[AVOID] No photorealism, no live-action look, no real-person faces, no skin pores or photographic detail, no film-camera realism; no shots without Vera; no static or frozen background; no English speech, no other voices speaking words, no extra lines, no music; no subtitles or on-screen text, no logos, no watermarks; no extra fingers, no face, style or outfit changes, no modern objects, no gratuitous gore.</w:t>
+        <w:t xml:space="preserve">[CAMERA] Slow, slightly unsteady handheld push-in toward Vera; the busy room behind her stays in focus. Vertical 9:16, Vera and the action both clearly visible.</w:t>
+      </w:r>
+    </w:p>
+    <w:p>
+      <w:pPr>
+        <w:shd w:fill="F2EFEA" w:color="auto" w:val="clear"/>
+        <w:spacing w:after="0"/>
+        <w:ind w:left="120" w:right="120"/>
+      </w:pPr>
+      <w:r>
+        <w:rPr>
+          <w:rFonts w:ascii="Consolas" w:cs="Consolas" w:eastAsia="Consolas" w:hAnsi="Consolas"/>
+          <w:sz w:val="16"/>
+          <w:szCs w:val="16"/>
+        </w:rPr>
+        <w:t xml:space="preserve">[LIGHT] Cold fluorescent light, more and more amber and red warning lamps reflecting on her face, shadows deepening — stylized, soft, like an animated film.</w:t>
+      </w:r>
+    </w:p>
+    <w:p>
+      <w:pPr>
+        <w:shd w:fill="F2EFEA" w:color="auto" w:val="clear"/>
+        <w:spacing w:after="0"/>
+        <w:ind w:left="120" w:right="120"/>
+      </w:pPr>
+      <w:r>
+        <w:rPr>
+          <w:rFonts w:ascii="Consolas" w:cs="Consolas" w:eastAsia="Consolas" w:hAnsi="Consolas"/>
+          <w:sz w:val="16"/>
+          <w:szCs w:val="16"/>
+        </w:rPr>
+        <w:t xml:space="preserve">[AUDIO] Only Vera's Russian line in her character voice, plus eerie ambient sound: low electrical hum rising slowly in pitch, irregular warning beeps getting faster, scratching recorder.</w:t>
+      </w:r>
+    </w:p>
+    <w:p>
+      <w:pPr>
+        <w:shd w:fill="F2EFEA" w:color="auto" w:val="clear"/>
+        <w:spacing w:after="0"/>
+        <w:ind w:left="120" w:right="120"/>
+      </w:pPr>
+      <w:r>
+        <w:rPr>
+          <w:rFonts w:ascii="Consolas" w:cs="Consolas" w:eastAsia="Consolas" w:hAnsi="Consolas"/>
+          <w:sz w:val="16"/>
+          <w:szCs w:val="16"/>
+        </w:rPr>
+        <w:t xml:space="preserve">[AVOID] No photorealism, no live-action look, no real-person faces, no skin pores or photographic detail; no shots without Vera; no static or frozen background; no monsters, no supernatural creatures; no English speech, no other voices speaking words, no extra lines, no music; no subtitles or on-screen text, no logos, no watermarks; no extra fingers, no face, style or outfit changes, no gratuitous gore.</w:t>
       </w:r>
     </w:p>
     <w:p>
@@ -3082,7 +3082,7 @@
           <w:sz w:val="16"/>
           <w:szCs w:val="16"/>
         </w:rPr>
-        <w:t xml:space="preserve">[STYLE REMINDER] Whole clip in the same stylized painterly 3D animation style as the @Vera character images, not realistic; all other people are stylized animated characters too.</w:t>
+        <w:t xml:space="preserve">[STYLE REMINDER] Whole clip in the same stylized painterly 3D animation style as the @Vera character images, not realistic; all other people are stylized animated characters too; growing dread.</w:t>
       </w:r>
     </w:p>
     <w:p>
@@ -3132,22 +3132,22 @@
           <w:sz w:val="16"/>
           <w:szCs w:val="16"/>
         </w:rPr>
-        <w:t xml:space="preserve">[STYLE — MOST IMPORTANT] Stylized 3D animated feature-film look with a hand-painted, painterly texture — exactly the same drawn, illustrated style as the @Vera character images. Soft painted shading, slightly simplified stylized forms, smooth painted skin without pores, visible brush-like texture in hair, clothes and background. This is an animated cartoon-film frame, NOT live action, NOT a photograph, NOT photorealistic, NOT a real human actor.</w:t>
-      </w:r>
-    </w:p>
-    <w:p>
-      <w:pPr>
-        <w:shd w:fill="F2EFEA" w:color="auto" w:val="clear"/>
-        <w:spacing w:after="0"/>
-        <w:ind w:left="120" w:right="120"/>
-      </w:pPr>
-      <w:r>
-        <w:rPr>
-          <w:rFonts w:ascii="Consolas" w:cs="Consolas" w:eastAsia="Consolas" w:hAnsi="Consolas"/>
-          <w:sz w:val="16"/>
-          <w:szCs w:val="16"/>
-        </w:rPr>
-        <w:t xml:space="preserve">[SCENE] Turning point: behind Vera an operator slams the emergency shutdown button and the room erupts.</w:t>
+        <w:t xml:space="preserve">[STYLE — MOST IMPORTANT] Stylized 3D animated feature-film look with a hand-painted, painterly texture — exactly the same drawn, illustrated style as the @Vera character images. Soft painted shading, slightly simplified stylized forms, smooth painted skin without pores, visible brush-like texture in hair, clothes and background. This is an animated cartoon-film frame, NOT live action, NOT a photograph, NOT photorealistic, NOT a real human actor. Mood: breath-holding suspense, the last second of silence before catastrophe.</w:t>
+      </w:r>
+    </w:p>
+    <w:p>
+      <w:pPr>
+        <w:shd w:fill="F2EFEA" w:color="auto" w:val="clear"/>
+        <w:spacing w:after="0"/>
+        <w:ind w:left="120" w:right="120"/>
+      </w:pPr>
+      <w:r>
+        <w:rPr>
+          <w:rFonts w:ascii="Consolas" w:cs="Consolas" w:eastAsia="Consolas" w:hAnsi="Consolas"/>
+          <w:sz w:val="16"/>
+          <w:szCs w:val="16"/>
+        </w:rPr>
+        <w:t xml:space="preserve">[SCENE] Turning point: behind Vera an operator slams the emergency shutdown button — and for a second everything goes silent.</w:t>
       </w:r>
     </w:p>
     <w:p>
@@ -3177,37 +3177,37 @@
           <w:sz w:val="16"/>
           <w:szCs w:val="16"/>
         </w:rPr>
-        <w:t xml:space="preserve">[VERA] Vera is the main character and stays clearly visible from the first to the last frame, face readable. Vera faces the camera in the left foreground; on the button press she flinches and half-turns toward the desk, then looks back into the lens.</w:t>
-      </w:r>
-    </w:p>
-    <w:p>
-      <w:pPr>
-        <w:shd w:fill="F2EFEA" w:color="auto" w:val="clear"/>
-        <w:spacing w:after="0"/>
-        <w:ind w:left="120" w:right="120"/>
-      </w:pPr>
-      <w:r>
-        <w:rPr>
-          <w:rFonts w:ascii="Consolas" w:cs="Consolas" w:eastAsia="Consolas" w:hAnsi="Consolas"/>
-          <w:sz w:val="16"/>
-          <w:szCs w:val="16"/>
-        </w:rPr>
-        <w:t xml:space="preserve">[SPEECH] Vera says aloud in Russian, once, in her own character voice, tense and quiet: "Час двадцать три. Оператор нажимает кнопку аварийной остановки. Почему именно сейчас — так и не выяснили." Russian only. Her lips and jaw move naturally with every Russian word. She starts at about 0.5 seconds and finishes before the end of the clip.</w:t>
-      </w:r>
-    </w:p>
-    <w:p>
-      <w:pPr>
-        <w:shd w:fill="F2EFEA" w:color="auto" w:val="clear"/>
-        <w:spacing w:after="0"/>
-        <w:ind w:left="120" w:right="120"/>
-      </w:pPr>
-      <w:r>
-        <w:rPr>
-          <w:rFonts w:ascii="Consolas" w:cs="Consolas" w:eastAsia="Consolas" w:hAnsi="Consolas"/>
-          <w:sz w:val="16"/>
-          <w:szCs w:val="16"/>
-        </w:rPr>
-        <w:t xml:space="preserve">[BACKGROUND ACTION — constant movement] In the mid-ground behind her right shoulder a young operator lunges forward and slams a large square button on the control desk; instantly a wall of red lamps flashes, two colleagues jump up from their chairs, one grabs a telephone, rod position indicators start moving on the panel.</w:t>
+        <w:t xml:space="preserve">[VERA] Vera is the main character and stays clearly visible from the first to the last frame, face readable. She faces the camera in the left foreground; at the button press she flinches and half-turns toward the desk, then slowly looks back into the lens, frozen with dread. Long dark worn coat, wine-red scarf, brass compass-rose brooch, dark waistcoat, light shirt.</w:t>
+      </w:r>
+    </w:p>
+    <w:p>
+      <w:pPr>
+        <w:shd w:fill="F2EFEA" w:color="auto" w:val="clear"/>
+        <w:spacing w:after="0"/>
+        <w:ind w:left="120" w:right="120"/>
+      </w:pPr>
+      <w:r>
+        <w:rPr>
+          <w:rFonts w:ascii="Consolas" w:cs="Consolas" w:eastAsia="Consolas" w:hAnsi="Consolas"/>
+          <w:sz w:val="16"/>
+          <w:szCs w:val="16"/>
+        </w:rPr>
+        <w:t xml:space="preserve">[SPEECH] Vera says aloud in Russian, once, in her own character voice, very quiet and tense, almost a whisper on the last sentence: "Час двадцать три. Оператор нажимает кнопку аварийной остановки. Почему именно сейчас — так и не выяснили." Russian only. Her lips and jaw move naturally with every Russian word. She starts at about 0.4 seconds and finishes before the end of the clip.</w:t>
+      </w:r>
+    </w:p>
+    <w:p>
+      <w:pPr>
+        <w:shd w:fill="F2EFEA" w:color="auto" w:val="clear"/>
+        <w:spacing w:after="0"/>
+        <w:ind w:left="120" w:right="120"/>
+      </w:pPr>
+      <w:r>
+        <w:rPr>
+          <w:rFonts w:ascii="Consolas" w:cs="Consolas" w:eastAsia="Consolas" w:hAnsi="Consolas"/>
+          <w:sz w:val="16"/>
+          <w:szCs w:val="16"/>
+        </w:rPr>
+        <w:t xml:space="preserve">[BACKGROUND ACTION — constant, unsettling movement] In the mid-ground behind her right shoulder a young operator lunges forward and slams a large square button on the control desk; instantly a wall of red lamps floods the room with light, two colleagues jump up from their chairs, one freezes with a telephone receiver in his hand, rod position indicators start crawling on the panel.</w:t>
       </w:r>
     </w:p>
     <w:p>
@@ -3237,52 +3237,52 @@
           <w:sz w:val="16"/>
           <w:szCs w:val="16"/>
         </w:rPr>
-        <w:t xml:space="preserve">[CAMERA] Static medium shot that jolts slightly at the button press; Vera in the left foreground, the operator and button clearly visible behind her. Vertical 9:16, Vera and the action both clearly visible.</w:t>
-      </w:r>
-    </w:p>
-    <w:p>
-      <w:pPr>
-        <w:shd w:fill="F2EFEA" w:color="auto" w:val="clear"/>
-        <w:spacing w:after="0"/>
-        <w:ind w:left="120" w:right="120"/>
-      </w:pPr>
-      <w:r>
-        <w:rPr>
-          <w:rFonts w:ascii="Consolas" w:cs="Consolas" w:eastAsia="Consolas" w:hAnsi="Consolas"/>
-          <w:sz w:val="16"/>
-          <w:szCs w:val="16"/>
-        </w:rPr>
-        <w:t xml:space="preserve">[LIGHT] Cold light suddenly washed with flashing red — stylized, soft, like an animated film.</w:t>
-      </w:r>
-    </w:p>
-    <w:p>
-      <w:pPr>
-        <w:shd w:fill="F2EFEA" w:color="auto" w:val="clear"/>
-        <w:spacing w:after="0"/>
-        <w:ind w:left="120" w:right="120"/>
-      </w:pPr>
-      <w:r>
-        <w:rPr>
-          <w:rFonts w:ascii="Consolas" w:cs="Consolas" w:eastAsia="Consolas" w:hAnsi="Consolas"/>
-          <w:sz w:val="16"/>
-          <w:szCs w:val="16"/>
-        </w:rPr>
-        <w:t xml:space="preserve">[AUDIO] Only Vera's Russian line in her character voice, plus layered ambient sound: heavy click of the button, alarm buzzer, chairs scraping.</w:t>
-      </w:r>
-    </w:p>
-    <w:p>
-      <w:pPr>
-        <w:shd w:fill="F2EFEA" w:color="auto" w:val="clear"/>
-        <w:spacing w:after="0"/>
-        <w:ind w:left="120" w:right="120"/>
-      </w:pPr>
-      <w:r>
-        <w:rPr>
-          <w:rFonts w:ascii="Consolas" w:cs="Consolas" w:eastAsia="Consolas" w:hAnsi="Consolas"/>
-          <w:sz w:val="16"/>
-          <w:szCs w:val="16"/>
-        </w:rPr>
-        <w:t xml:space="preserve">[AVOID] No photorealism, no live-action look, no real-person faces, no skin pores or photographic detail, no film-camera realism; no shots without Vera; no static or frozen background; no English speech, no other voices speaking words, no extra lines, no music; no subtitles or on-screen text, no logos, no watermarks; no extra fingers, no face, style or outfit changes, no modern objects, no gratuitous gore.</w:t>
+        <w:t xml:space="preserve">[CAMERA] Static medium shot that jolts slightly at the button press, then a slow creeping push-in toward Vera. Vertical 9:16, Vera and the action both clearly visible.</w:t>
+      </w:r>
+    </w:p>
+    <w:p>
+      <w:pPr>
+        <w:shd w:fill="F2EFEA" w:color="auto" w:val="clear"/>
+        <w:spacing w:after="0"/>
+        <w:ind w:left="120" w:right="120"/>
+      </w:pPr>
+      <w:r>
+        <w:rPr>
+          <w:rFonts w:ascii="Consolas" w:cs="Consolas" w:eastAsia="Consolas" w:hAnsi="Consolas"/>
+          <w:sz w:val="16"/>
+          <w:szCs w:val="16"/>
+        </w:rPr>
+        <w:t xml:space="preserve">[LIGHT] Cold light suddenly drowned in pulsing red, her face half red, half in shadow — stylized, soft, like an animated film.</w:t>
+      </w:r>
+    </w:p>
+    <w:p>
+      <w:pPr>
+        <w:shd w:fill="F2EFEA" w:color="auto" w:val="clear"/>
+        <w:spacing w:after="0"/>
+        <w:ind w:left="120" w:right="120"/>
+      </w:pPr>
+      <w:r>
+        <w:rPr>
+          <w:rFonts w:ascii="Consolas" w:cs="Consolas" w:eastAsia="Consolas" w:hAnsi="Consolas"/>
+          <w:sz w:val="16"/>
+          <w:szCs w:val="16"/>
+        </w:rPr>
+        <w:t xml:space="preserve">[AUDIO] Only Vera's Russian line in her character voice, plus eerie ambient sound: heavy click of the button, a long alarm buzzer, chairs scraping, then the hum suddenly drops low and heavy.</w:t>
+      </w:r>
+    </w:p>
+    <w:p>
+      <w:pPr>
+        <w:shd w:fill="F2EFEA" w:color="auto" w:val="clear"/>
+        <w:spacing w:after="0"/>
+        <w:ind w:left="120" w:right="120"/>
+      </w:pPr>
+      <w:r>
+        <w:rPr>
+          <w:rFonts w:ascii="Consolas" w:cs="Consolas" w:eastAsia="Consolas" w:hAnsi="Consolas"/>
+          <w:sz w:val="16"/>
+          <w:szCs w:val="16"/>
+        </w:rPr>
+        <w:t xml:space="preserve">[AVOID] No photorealism, no live-action look, no real-person faces, no skin pores or photographic detail; no shots without Vera; no static or frozen background; no monsters, no supernatural creatures; no English speech, no other voices speaking words, no extra lines, no music; no subtitles or on-screen text, no logos, no watermarks; no extra fingers, no face, style or outfit changes, no gratuitous gore.</w:t>
       </w:r>
     </w:p>
     <w:p>
@@ -3297,7 +3297,7 @@
           <w:sz w:val="16"/>
           <w:szCs w:val="16"/>
         </w:rPr>
-        <w:t xml:space="preserve">[STYLE REMINDER] Whole clip in the same stylized painterly 3D animation style as the @Vera character images, not realistic; all other people are stylized animated characters too.</w:t>
+        <w:t xml:space="preserve">[STYLE REMINDER] Whole clip in the same stylized painterly 3D animation style as the @Vera character images, not realistic; all other people are stylized animated characters too; breath-holding suspense.</w:t>
       </w:r>
     </w:p>
     <w:p>
@@ -3347,7 +3347,7 @@
           <w:sz w:val="16"/>
           <w:szCs w:val="16"/>
         </w:rPr>
-        <w:t xml:space="preserve">[STYLE — MOST IMPORTANT] Stylized 3D animated feature-film look with a hand-painted, painterly texture — exactly the same drawn, illustrated style as the @Vera character images. Soft painted shading, slightly simplified stylized forms, smooth painted skin without pores, visible brush-like texture in hair, clothes and background. This is an animated cartoon-film frame, NOT live action, NOT a photograph, NOT photorealistic, NOT a real human actor.</w:t>
+        <w:t xml:space="preserve">[STYLE — MOST IMPORTANT] Stylized 3D animated feature-film look with a hand-painted, painterly texture — exactly the same drawn, illustrated style as the @Vera character images. Soft painted shading, slightly simplified stylized forms, smooth painted skin without pores, visible brush-like texture in hair, clothes and background. This is an animated cartoon-film frame, NOT live action, NOT a photograph, NOT photorealistic, NOT a real human actor. Mood: panic and terror as the room starts to fail around her.</w:t>
       </w:r>
     </w:p>
     <w:p>
@@ -3392,37 +3392,37 @@
           <w:sz w:val="16"/>
           <w:szCs w:val="16"/>
         </w:rPr>
-        <w:t xml:space="preserve">[VERA] Vera is the main character and stays clearly visible from the first to the last frame, face readable. Vera staggers, grabs the edge of a control desk, steadies herself and speaks to the camera, frightened.</w:t>
-      </w:r>
-    </w:p>
-    <w:p>
-      <w:pPr>
-        <w:shd w:fill="F2EFEA" w:color="auto" w:val="clear"/>
-        <w:spacing w:after="0"/>
-        <w:ind w:left="120" w:right="120"/>
-      </w:pPr>
-      <w:r>
-        <w:rPr>
-          <w:rFonts w:ascii="Consolas" w:cs="Consolas" w:eastAsia="Consolas" w:hAnsi="Consolas"/>
-          <w:sz w:val="16"/>
-          <w:szCs w:val="16"/>
-        </w:rPr>
-        <w:t xml:space="preserve">[SPEECH] Vera says aloud in Russian, once, in her own character voice, frightened, faster, breath catching: "Стержни должны заглушить реактор. Но из-за их устройства в первые секунды они его разгоняют." Russian only. Her lips and jaw move naturally with every Russian word. She starts at about 0.5 seconds and finishes before the end of the clip.</w:t>
-      </w:r>
-    </w:p>
-    <w:p>
-      <w:pPr>
-        <w:shd w:fill="F2EFEA" w:color="auto" w:val="clear"/>
-        <w:spacing w:after="0"/>
-        <w:ind w:left="120" w:right="120"/>
-      </w:pPr>
-      <w:r>
-        <w:rPr>
-          <w:rFonts w:ascii="Consolas" w:cs="Consolas" w:eastAsia="Consolas" w:hAnsi="Consolas"/>
-          <w:sz w:val="16"/>
-          <w:szCs w:val="16"/>
-        </w:rPr>
-        <w:t xml:space="preserve">[BACKGROUND ACTION — constant movement] The whole room shakes: ceiling panels rattle and a few drop, plaster dust pours down in streams, fluorescent tubes flicker and one bursts in sparks, papers fly off the desks, operators stumble and shout without audible words, gauge needles slam to the limit.</w:t>
+        <w:t xml:space="preserve">[VERA] Vera is the main character and stays clearly visible from the first to the last frame, face readable. She staggers, grabs the edge of a control desk, steadies herself and speaks to the camera, frightened, eyes darting to the ceiling. Long dark worn coat, wine-red scarf, brass compass-rose brooch, dark waistcoat, light shirt.</w:t>
+      </w:r>
+    </w:p>
+    <w:p>
+      <w:pPr>
+        <w:shd w:fill="F2EFEA" w:color="auto" w:val="clear"/>
+        <w:spacing w:after="0"/>
+        <w:ind w:left="120" w:right="120"/>
+      </w:pPr>
+      <w:r>
+        <w:rPr>
+          <w:rFonts w:ascii="Consolas" w:cs="Consolas" w:eastAsia="Consolas" w:hAnsi="Consolas"/>
+          <w:sz w:val="16"/>
+          <w:szCs w:val="16"/>
+        </w:rPr>
+        <w:t xml:space="preserve">[SPEECH] Vera says aloud in Russian, once, in her own character voice, frightened, faster, breath catching: "Стержни должны заглушить реактор. Но из-за их устройства в первые секунды они его разгоняют." Russian only. Her lips and jaw move naturally with every Russian word. She starts at about 0.3 seconds and finishes before the end of the clip.</w:t>
+      </w:r>
+    </w:p>
+    <w:p>
+      <w:pPr>
+        <w:shd w:fill="F2EFEA" w:color="auto" w:val="clear"/>
+        <w:spacing w:after="0"/>
+        <w:ind w:left="120" w:right="120"/>
+      </w:pPr>
+      <w:r>
+        <w:rPr>
+          <w:rFonts w:ascii="Consolas" w:cs="Consolas" w:eastAsia="Consolas" w:hAnsi="Consolas"/>
+          <w:sz w:val="16"/>
+          <w:szCs w:val="16"/>
+        </w:rPr>
+        <w:t xml:space="preserve">[BACKGROUND ACTION — constant, unsettling movement] The whole room shakes: ceiling panels rattle and a few drop, plaster dust pours down in streams, fluorescent tubes flicker and one bursts in sparks, plunging part of the room into darkness; papers fly off the desks; operators stumble and shout without audible words; gauge needles slam to the limit.</w:t>
       </w:r>
     </w:p>
     <w:p>
@@ -3467,37 +3467,37 @@
           <w:sz w:val="16"/>
           <w:szCs w:val="16"/>
         </w:rPr>
-        <w:t xml:space="preserve">[LIGHT] Strobing fluorescent light, red alarm lamps, dust glowing in the light — stylized, soft, like an animated film.</w:t>
-      </w:r>
-    </w:p>
-    <w:p>
-      <w:pPr>
-        <w:shd w:fill="F2EFEA" w:color="auto" w:val="clear"/>
-        <w:spacing w:after="0"/>
-        <w:ind w:left="120" w:right="120"/>
-      </w:pPr>
-      <w:r>
-        <w:rPr>
-          <w:rFonts w:ascii="Consolas" w:cs="Consolas" w:eastAsia="Consolas" w:hAnsi="Consolas"/>
-          <w:sz w:val="16"/>
-          <w:szCs w:val="16"/>
-        </w:rPr>
-        <w:t xml:space="preserve">[AUDIO] Only Vera's Russian line in her character voice, plus layered ambient sound: deep rising rumble, rattling metal, alarm, glass popping.</w:t>
-      </w:r>
-    </w:p>
-    <w:p>
-      <w:pPr>
-        <w:shd w:fill="F2EFEA" w:color="auto" w:val="clear"/>
-        <w:spacing w:after="0"/>
-        <w:ind w:left="120" w:right="120"/>
-      </w:pPr>
-      <w:r>
-        <w:rPr>
-          <w:rFonts w:ascii="Consolas" w:cs="Consolas" w:eastAsia="Consolas" w:hAnsi="Consolas"/>
-          <w:sz w:val="16"/>
-          <w:szCs w:val="16"/>
-        </w:rPr>
-        <w:t xml:space="preserve">[AVOID] No photorealism, no live-action look, no real-person faces, no skin pores or photographic detail, no film-camera realism; no shots without Vera; no static or frozen background; no English speech, no other voices speaking words, no extra lines, no music; no subtitles or on-screen text, no logos, no watermarks; no extra fingers, no face, style or outfit changes, no modern objects, no gratuitous gore.</w:t>
+        <w:t xml:space="preserve">[LIGHT] Strobing fluorescent light and darkness, red alarm lamps, dust glowing in the beams — stylized, soft, like an animated film.</w:t>
+      </w:r>
+    </w:p>
+    <w:p>
+      <w:pPr>
+        <w:shd w:fill="F2EFEA" w:color="auto" w:val="clear"/>
+        <w:spacing w:after="0"/>
+        <w:ind w:left="120" w:right="120"/>
+      </w:pPr>
+      <w:r>
+        <w:rPr>
+          <w:rFonts w:ascii="Consolas" w:cs="Consolas" w:eastAsia="Consolas" w:hAnsi="Consolas"/>
+          <w:sz w:val="16"/>
+          <w:szCs w:val="16"/>
+        </w:rPr>
+        <w:t xml:space="preserve">[AUDIO] Only Vera's Russian line in her character voice, plus eerie ambient sound: a deep rising rumble like something huge waking up, rattling metal, alarm, glass popping.</w:t>
+      </w:r>
+    </w:p>
+    <w:p>
+      <w:pPr>
+        <w:shd w:fill="F2EFEA" w:color="auto" w:val="clear"/>
+        <w:spacing w:after="0"/>
+        <w:ind w:left="120" w:right="120"/>
+      </w:pPr>
+      <w:r>
+        <w:rPr>
+          <w:rFonts w:ascii="Consolas" w:cs="Consolas" w:eastAsia="Consolas" w:hAnsi="Consolas"/>
+          <w:sz w:val="16"/>
+          <w:szCs w:val="16"/>
+        </w:rPr>
+        <w:t xml:space="preserve">[AVOID] No photorealism, no live-action look, no real-person faces, no skin pores or photographic detail; no shots without Vera; no static or frozen background; no monsters, no supernatural creatures; no English speech, no other voices speaking words, no extra lines, no music; no subtitles or on-screen text, no logos, no watermarks; no extra fingers, no face, style or outfit changes, no gratuitous gore.</w:t>
       </w:r>
     </w:p>
     <w:p>
@@ -3512,7 +3512,7 @@
           <w:sz w:val="16"/>
           <w:szCs w:val="16"/>
         </w:rPr>
-        <w:t xml:space="preserve">[STYLE REMINDER] Whole clip in the same stylized painterly 3D animation style as the @Vera character images, not realistic; all other people are stylized animated characters too.</w:t>
+        <w:t xml:space="preserve">[STYLE REMINDER] Whole clip in the same stylized painterly 3D animation style as the @Vera character images, not realistic; all other people are stylized animated characters too; panic and terror.</w:t>
       </w:r>
     </w:p>
     <w:p>
@@ -3562,7 +3562,7 @@
           <w:sz w:val="16"/>
           <w:szCs w:val="16"/>
         </w:rPr>
-        <w:t xml:space="preserve">[STYLE — MOST IMPORTANT] Stylized 3D animated feature-film look with a hand-painted, painterly texture — exactly the same drawn, illustrated style as the @Vera character images. Soft painted shading, slightly simplified stylized forms, smooth painted skin without pores, visible brush-like texture in hair, clothes and background. This is an animated cartoon-film frame, NOT live action, NOT a photograph, NOT photorealistic, NOT a real human actor.</w:t>
+        <w:t xml:space="preserve">[STYLE — MOST IMPORTANT] Stylized 3D animated feature-film look with a hand-painted, painterly texture — exactly the same drawn, illustrated style as the @Vera character images. Soft painted shading, slightly simplified stylized forms, smooth painted skin without pores, visible brush-like texture in hair, clothes and background. This is an animated cartoon-film frame, NOT live action, NOT a photograph, NOT photorealistic, NOT a real human actor. Mood: pure shock and horror, the moment the night breaks.</w:t>
       </w:r>
     </w:p>
     <w:p>
@@ -3607,52 +3607,52 @@
           <w:sz w:val="16"/>
           <w:szCs w:val="16"/>
         </w:rPr>
-        <w:t xml:space="preserve">[VERA] Vera is the main character and stays clearly visible from the first to the last frame, face readable. Vera stands on the plant road facing the camera; the first blast makes her flinch and crouch, hair blown by the shockwave; she straightens and speaks to the camera.</w:t>
-      </w:r>
-    </w:p>
-    <w:p>
-      <w:pPr>
-        <w:shd w:fill="F2EFEA" w:color="auto" w:val="clear"/>
-        <w:spacing w:after="0"/>
-        <w:ind w:left="120" w:right="120"/>
-      </w:pPr>
-      <w:r>
-        <w:rPr>
-          <w:rFonts w:ascii="Consolas" w:cs="Consolas" w:eastAsia="Consolas" w:hAnsi="Consolas"/>
-          <w:sz w:val="16"/>
-          <w:szCs w:val="16"/>
-        </w:rPr>
-        <w:t xml:space="preserve">[SPEECH] Vera says aloud in Russian, once, in her own character voice, shocked, breathless: "Два взрыва. Крышу реакторного зала разносит, раскалённые обломки летят на соседние здания." Russian only. Her lips and jaw move naturally with every Russian word. She starts at about 0.5 seconds and finishes before the end of the clip.</w:t>
-      </w:r>
-    </w:p>
-    <w:p>
-      <w:pPr>
-        <w:shd w:fill="F2EFEA" w:color="auto" w:val="clear"/>
-        <w:spacing w:after="0"/>
-        <w:ind w:left="120" w:right="120"/>
-      </w:pPr>
-      <w:r>
-        <w:rPr>
-          <w:rFonts w:ascii="Consolas" w:cs="Consolas" w:eastAsia="Consolas" w:hAnsi="Consolas"/>
-          <w:sz w:val="16"/>
-          <w:szCs w:val="16"/>
-        </w:rPr>
-        <w:t xml:space="preserve">[BACKGROUND ACTION — constant movement] Behind her a bright burst of steam and debris erupts from the roof of the unit 4 building; two seconds later a second, larger blast throws a column of fire and glowing fragments high into the sky; a shockwave ripples through the steam, windows of the turbine hall burst outward, burning pieces arc down onto nearby roofs, sparks and dust sweep past Vera.</w:t>
-      </w:r>
-    </w:p>
-    <w:p>
-      <w:pPr>
-        <w:shd w:fill="F2EFEA" w:color="auto" w:val="clear"/>
-        <w:spacing w:after="0"/>
-        <w:ind w:left="120" w:right="120"/>
-      </w:pPr>
-      <w:r>
-        <w:rPr>
-          <w:rFonts w:ascii="Consolas" w:cs="Consolas" w:eastAsia="Consolas" w:hAnsi="Consolas"/>
-          <w:sz w:val="16"/>
-          <w:szCs w:val="16"/>
-        </w:rPr>
-        <w:t xml:space="preserve">[SETTING &amp; ERA] Night of 26 April 1986, about 1:24 a.m., Chernobyl plant, clear night.</w:t>
+        <w:t xml:space="preserve">[VERA] Vera is the main character and stays clearly visible from the first to the last frame, face readable. She stands on the plant road facing the camera; the first blast makes her flinch and crouch, hair blown by the shockwave; she straightens, pale, and speaks to the camera. Long dark worn coat, wine-red scarf, brass compass-rose brooch, dark waistcoat, light shirt.</w:t>
+      </w:r>
+    </w:p>
+    <w:p>
+      <w:pPr>
+        <w:shd w:fill="F2EFEA" w:color="auto" w:val="clear"/>
+        <w:spacing w:after="0"/>
+        <w:ind w:left="120" w:right="120"/>
+      </w:pPr>
+      <w:r>
+        <w:rPr>
+          <w:rFonts w:ascii="Consolas" w:cs="Consolas" w:eastAsia="Consolas" w:hAnsi="Consolas"/>
+          <w:sz w:val="16"/>
+          <w:szCs w:val="16"/>
+        </w:rPr>
+        <w:t xml:space="preserve">[SPEECH] Vera says aloud in Russian, once, in her own character voice, shocked, breathless, almost whispering: "Два взрыва. Крышу реакторного зала разносит, раскалённые обломки летят на соседние здания." Russian only. Her lips and jaw move naturally with every Russian word. She starts at about 0.8 seconds and finishes before the end of the clip.</w:t>
+      </w:r>
+    </w:p>
+    <w:p>
+      <w:pPr>
+        <w:shd w:fill="F2EFEA" w:color="auto" w:val="clear"/>
+        <w:spacing w:after="0"/>
+        <w:ind w:left="120" w:right="120"/>
+      </w:pPr>
+      <w:r>
+        <w:rPr>
+          <w:rFonts w:ascii="Consolas" w:cs="Consolas" w:eastAsia="Consolas" w:hAnsi="Consolas"/>
+          <w:sz w:val="16"/>
+          <w:szCs w:val="16"/>
+        </w:rPr>
+        <w:t xml:space="preserve">[BACKGROUND ACTION — constant, unsettling movement] Behind her a bright burst of steam and debris erupts from the roof of the unit 4 building; two seconds later a second, larger blast throws a column of fire and glowing fragments high into the black sky; a shockwave ripples through the fog, windows of the turbine hall burst outward, burning pieces arc down onto nearby roofs, sparks and dust sweep past Vera, street lamps die one after another.</w:t>
+      </w:r>
+    </w:p>
+    <w:p>
+      <w:pPr>
+        <w:shd w:fill="F2EFEA" w:color="auto" w:val="clear"/>
+        <w:spacing w:after="0"/>
+        <w:ind w:left="120" w:right="120"/>
+      </w:pPr>
+      <w:r>
+        <w:rPr>
+          <w:rFonts w:ascii="Consolas" w:cs="Consolas" w:eastAsia="Consolas" w:hAnsi="Consolas"/>
+          <w:sz w:val="16"/>
+          <w:szCs w:val="16"/>
+        </w:rPr>
+        <w:t xml:space="preserve">[SETTING &amp; ERA] Night of 26 April 1986, about 1:24 a.m., Chernobyl plant.</w:t>
       </w:r>
     </w:p>
     <w:p>
@@ -3682,37 +3682,37 @@
           <w:sz w:val="16"/>
           <w:szCs w:val="16"/>
         </w:rPr>
-        <w:t xml:space="preserve">[LIGHT] Night blue broken by orange-white flashes, red glow on her face — stylized, soft, like an animated film.</w:t>
-      </w:r>
-    </w:p>
-    <w:p>
-      <w:pPr>
-        <w:shd w:fill="F2EFEA" w:color="auto" w:val="clear"/>
-        <w:spacing w:after="0"/>
-        <w:ind w:left="120" w:right="120"/>
-      </w:pPr>
-      <w:r>
-        <w:rPr>
-          <w:rFonts w:ascii="Consolas" w:cs="Consolas" w:eastAsia="Consolas" w:hAnsi="Consolas"/>
-          <w:sz w:val="16"/>
-          <w:szCs w:val="16"/>
-        </w:rPr>
-        <w:t xml:space="preserve">[AUDIO] Only Vera's Russian line in her character voice, plus layered ambient sound: two deep booms two seconds apart, shattering glass, rumbling echo, falling debris.</w:t>
-      </w:r>
-    </w:p>
-    <w:p>
-      <w:pPr>
-        <w:shd w:fill="F2EFEA" w:color="auto" w:val="clear"/>
-        <w:spacing w:after="0"/>
-        <w:ind w:left="120" w:right="120"/>
-      </w:pPr>
-      <w:r>
-        <w:rPr>
-          <w:rFonts w:ascii="Consolas" w:cs="Consolas" w:eastAsia="Consolas" w:hAnsi="Consolas"/>
-          <w:sz w:val="16"/>
-          <w:szCs w:val="16"/>
-        </w:rPr>
-        <w:t xml:space="preserve">[AVOID] No photorealism, no live-action look, no real-person faces, no skin pores or photographic detail, no film-camera realism; no shots without Vera; no static or frozen background; no English speech, no other voices speaking words, no extra lines, no music; no subtitles or on-screen text, no logos, no watermarks; no extra fingers, no face, style or outfit changes, no modern objects, no gratuitous gore.</w:t>
+        <w:t xml:space="preserve">[LIGHT] Darkness broken by blinding orange-white flashes, then a deep red glow on her face — stylized, soft, like an animated film.</w:t>
+      </w:r>
+    </w:p>
+    <w:p>
+      <w:pPr>
+        <w:shd w:fill="F2EFEA" w:color="auto" w:val="clear"/>
+        <w:spacing w:after="0"/>
+        <w:ind w:left="120" w:right="120"/>
+      </w:pPr>
+      <w:r>
+        <w:rPr>
+          <w:rFonts w:ascii="Consolas" w:cs="Consolas" w:eastAsia="Consolas" w:hAnsi="Consolas"/>
+          <w:sz w:val="16"/>
+          <w:szCs w:val="16"/>
+        </w:rPr>
+        <w:t xml:space="preserve">[AUDIO] Only Vera's Russian line in her character voice, plus eerie ambient sound: two deep booms two seconds apart, shattering glass, a ringing silence, then rumbling and falling debris.</w:t>
+      </w:r>
+    </w:p>
+    <w:p>
+      <w:pPr>
+        <w:shd w:fill="F2EFEA" w:color="auto" w:val="clear"/>
+        <w:spacing w:after="0"/>
+        <w:ind w:left="120" w:right="120"/>
+      </w:pPr>
+      <w:r>
+        <w:rPr>
+          <w:rFonts w:ascii="Consolas" w:cs="Consolas" w:eastAsia="Consolas" w:hAnsi="Consolas"/>
+          <w:sz w:val="16"/>
+          <w:szCs w:val="16"/>
+        </w:rPr>
+        <w:t xml:space="preserve">[AVOID] No photorealism, no live-action look, no real-person faces, no skin pores or photographic detail; no shots without Vera; no static or frozen background; no monsters, no supernatural creatures, no mushroom cloud; no English speech, no other voices speaking words, no extra lines, no music; no subtitles or on-screen text, no logos, no watermarks; no extra fingers, no face, style or outfit changes, no gratuitous gore.</w:t>
       </w:r>
     </w:p>
     <w:p>
@@ -3727,7 +3727,7 @@
           <w:sz w:val="16"/>
           <w:szCs w:val="16"/>
         </w:rPr>
-        <w:t xml:space="preserve">[STYLE REMINDER] Whole clip in the same stylized painterly 3D animation style as the @Vera character images, not realistic; all other people are stylized animated characters too.</w:t>
+        <w:t xml:space="preserve">[STYLE REMINDER] Whole clip in the same stylized painterly 3D animation style as the @Vera character images, not realistic; all other people are stylized animated characters too; shock and horror.</w:t>
       </w:r>
     </w:p>
     <w:p>
@@ -3777,22 +3777,22 @@
           <w:sz w:val="16"/>
           <w:szCs w:val="16"/>
         </w:rPr>
-        <w:t xml:space="preserve">[STYLE — MOST IMPORTANT] Stylized 3D animated feature-film look with a hand-painted, painterly texture — exactly the same drawn, illustrated style as the @Vera character images. Soft painted shading, slightly simplified stylized forms, smooth painted skin without pores, visible brush-like texture in hair, clothes and background. This is an animated cartoon-film frame, NOT live action, NOT a photograph, NOT photorealistic, NOT a real human actor.</w:t>
-      </w:r>
-    </w:p>
-    <w:p>
-      <w:pPr>
-        <w:shd w:fill="F2EFEA" w:color="auto" w:val="clear"/>
-        <w:spacing w:after="0"/>
-        <w:ind w:left="120" w:right="120"/>
-      </w:pPr>
-      <w:r>
-        <w:rPr>
-          <w:rFonts w:ascii="Consolas" w:cs="Consolas" w:eastAsia="Consolas" w:hAnsi="Consolas"/>
-          <w:sz w:val="16"/>
-          <w:szCs w:val="16"/>
-        </w:rPr>
-        <w:t xml:space="preserve">[SCENE] Aftermath of the blast: Vera walks through swirling embers in front of the wrecked, burning unit 4.</w:t>
+        <w:t xml:space="preserve">[STYLE — MOST IMPORTANT] Stylized 3D animated feature-film look with a hand-painted, painterly texture — exactly the same drawn, illustrated style as the @Vera character images. Soft painted shading, slightly simplified stylized forms, smooth painted skin without pores, visible brush-like texture in hair, clothes and background. This is an animated cartoon-film frame, NOT live action, NOT a photograph, NOT photorealistic, NOT a real human actor. Mood: haunting, nightmarish, an invisible danger in the air.</w:t>
+      </w:r>
+    </w:p>
+    <w:p>
+      <w:pPr>
+        <w:shd w:fill="F2EFEA" w:color="auto" w:val="clear"/>
+        <w:spacing w:after="0"/>
+        <w:ind w:left="120" w:right="120"/>
+      </w:pPr>
+      <w:r>
+        <w:rPr>
+          <w:rFonts w:ascii="Consolas" w:cs="Consolas" w:eastAsia="Consolas" w:hAnsi="Consolas"/>
+          <w:sz w:val="16"/>
+          <w:szCs w:val="16"/>
+        </w:rPr>
+        <w:t xml:space="preserve">[SCENE] Aftermath of the blast: Vera walks through swirling embers in front of the wrecked, glowing unit 4.</w:t>
       </w:r>
     </w:p>
     <w:p>
@@ -3822,37 +3822,37 @@
           <w:sz w:val="16"/>
           <w:szCs w:val="16"/>
         </w:rPr>
-        <w:t xml:space="preserve">[VERA] Vera is the main character and stays clearly visible from the first to the last frame, face readable. Vera walks toward the camera through drifting embers and smoke, shields her eyes once, then looks into the lens.</w:t>
-      </w:r>
-    </w:p>
-    <w:p>
-      <w:pPr>
-        <w:shd w:fill="F2EFEA" w:color="auto" w:val="clear"/>
-        <w:spacing w:after="0"/>
-        <w:ind w:left="120" w:right="120"/>
-      </w:pPr>
-      <w:r>
-        <w:rPr>
-          <w:rFonts w:ascii="Consolas" w:cs="Consolas" w:eastAsia="Consolas" w:hAnsi="Consolas"/>
-          <w:sz w:val="16"/>
-          <w:szCs w:val="16"/>
-        </w:rPr>
-        <w:t xml:space="preserve">[SPEECH] Vera says aloud in Russian, once, in her own character voice, shaken, quiet and abrupt: "Реактор разрушен. На крышах пожар. А радиацию не видно и не слышно." Russian only. Her lips and jaw move naturally with every Russian word. She starts at about 0.5 seconds and finishes before the end of the clip.</w:t>
-      </w:r>
-    </w:p>
-    <w:p>
-      <w:pPr>
-        <w:shd w:fill="F2EFEA" w:color="auto" w:val="clear"/>
-        <w:spacing w:after="0"/>
-        <w:ind w:left="120" w:right="120"/>
-      </w:pPr>
-      <w:r>
-        <w:rPr>
-          <w:rFonts w:ascii="Consolas" w:cs="Consolas" w:eastAsia="Consolas" w:hAnsi="Consolas"/>
-          <w:sz w:val="16"/>
-          <w:szCs w:val="16"/>
-        </w:rPr>
-        <w:t xml:space="preserve">[BACKGROUND ACTION — constant movement] Behind her the open, wrecked top of unit 4 glows red; fires spread across the turbine hall roof, burning fragments crackle on the ground; thick smoke rolls across the frame; two plant workers run past in panic; far away the first blue flashing lights appear and grow brighter.</w:t>
+        <w:t xml:space="preserve">[VERA] Vera is the main character and stays clearly visible from the first to the last frame, face readable. She walks slowly toward the camera through drifting embers and smoke, shields her eyes once, then stops and looks into the lens, shaken. Long dark worn coat, wine-red scarf, brass compass-rose brooch, dark waistcoat, light shirt.</w:t>
+      </w:r>
+    </w:p>
+    <w:p>
+      <w:pPr>
+        <w:shd w:fill="F2EFEA" w:color="auto" w:val="clear"/>
+        <w:spacing w:after="0"/>
+        <w:ind w:left="120" w:right="120"/>
+      </w:pPr>
+      <w:r>
+        <w:rPr>
+          <w:rFonts w:ascii="Consolas" w:cs="Consolas" w:eastAsia="Consolas" w:hAnsi="Consolas"/>
+          <w:sz w:val="16"/>
+          <w:szCs w:val="16"/>
+        </w:rPr>
+        <w:t xml:space="preserve">[SPEECH] Vera says aloud in Russian, once, in her own character voice, quiet and abrupt, the last sentence slow and chilling: "Реактор разрушен. На крышах пожар. А радиацию не видно и не слышно." Russian only. Her lips and jaw move naturally with every Russian word. She starts at about 0.4 seconds and finishes before the end of the clip.</w:t>
+      </w:r>
+    </w:p>
+    <w:p>
+      <w:pPr>
+        <w:shd w:fill="F2EFEA" w:color="auto" w:val="clear"/>
+        <w:spacing w:after="0"/>
+        <w:ind w:left="120" w:right="120"/>
+      </w:pPr>
+      <w:r>
+        <w:rPr>
+          <w:rFonts w:ascii="Consolas" w:cs="Consolas" w:eastAsia="Consolas" w:hAnsi="Consolas"/>
+          <w:sz w:val="16"/>
+          <w:szCs w:val="16"/>
+        </w:rPr>
+        <w:t xml:space="preserve">[BACKGROUND ACTION — constant, unsettling movement] Behind her the open, wrecked top of unit 4 glows with an eerie red light and a faint pale haze rises above it; fires spread across the turbine hall roof; burning fragments crackle on the ground; thick smoke rolls across the frame; two plant workers run past in panic; ash falls slowly like dark snow; far away the first blue flashing lights appear.</w:t>
       </w:r>
     </w:p>
     <w:p>
@@ -3882,52 +3882,52 @@
           <w:sz w:val="16"/>
           <w:szCs w:val="16"/>
         </w:rPr>
-        <w:t xml:space="preserve">[CAMERA] Handheld tracking shot moving backward in front of Vera, smoke drifting between her and the camera. Vertical 9:16, Vera and the action both clearly visible.</w:t>
-      </w:r>
-    </w:p>
-    <w:p>
-      <w:pPr>
-        <w:shd w:fill="F2EFEA" w:color="auto" w:val="clear"/>
-        <w:spacing w:after="0"/>
-        <w:ind w:left="120" w:right="120"/>
-      </w:pPr>
-      <w:r>
-        <w:rPr>
-          <w:rFonts w:ascii="Consolas" w:cs="Consolas" w:eastAsia="Consolas" w:hAnsi="Consolas"/>
-          <w:sz w:val="16"/>
-          <w:szCs w:val="16"/>
-        </w:rPr>
-        <w:t xml:space="preserve">[LIGHT] Red-orange firelight flickering on her face, black smoke, first blue flashes — stylized, soft, like an animated film.</w:t>
-      </w:r>
-    </w:p>
-    <w:p>
-      <w:pPr>
-        <w:shd w:fill="F2EFEA" w:color="auto" w:val="clear"/>
-        <w:spacing w:after="0"/>
-        <w:ind w:left="120" w:right="120"/>
-      </w:pPr>
-      <w:r>
-        <w:rPr>
-          <w:rFonts w:ascii="Consolas" w:cs="Consolas" w:eastAsia="Consolas" w:hAnsi="Consolas"/>
-          <w:sz w:val="16"/>
-          <w:szCs w:val="16"/>
-        </w:rPr>
-        <w:t xml:space="preserve">[AUDIO] Only Vera's Russian line in her character voice, plus layered ambient sound: crackling fire, popping embers, distant siren growing louder.</w:t>
-      </w:r>
-    </w:p>
-    <w:p>
-      <w:pPr>
-        <w:shd w:fill="F2EFEA" w:color="auto" w:val="clear"/>
-        <w:spacing w:after="0"/>
-        <w:ind w:left="120" w:right="120"/>
-      </w:pPr>
-      <w:r>
-        <w:rPr>
-          <w:rFonts w:ascii="Consolas" w:cs="Consolas" w:eastAsia="Consolas" w:hAnsi="Consolas"/>
-          <w:sz w:val="16"/>
-          <w:szCs w:val="16"/>
-        </w:rPr>
-        <w:t xml:space="preserve">[AVOID] No photorealism, no live-action look, no real-person faces, no skin pores or photographic detail, no film-camera realism; no shots without Vera; no static or frozen background; no English speech, no other voices speaking words, no extra lines, no music; no subtitles or on-screen text, no logos, no watermarks; no extra fingers, no face, style or outfit changes, no modern objects, no gratuitous gore.</w:t>
+        <w:t xml:space="preserve">[CAMERA] Handheld tracking shot moving backward in front of Vera, smoke drifting between her and the camera, then a slow push-in on her face. Vertical 9:16, Vera and the action both clearly visible.</w:t>
+      </w:r>
+    </w:p>
+    <w:p>
+      <w:pPr>
+        <w:shd w:fill="F2EFEA" w:color="auto" w:val="clear"/>
+        <w:spacing w:after="0"/>
+        <w:ind w:left="120" w:right="120"/>
+      </w:pPr>
+      <w:r>
+        <w:rPr>
+          <w:rFonts w:ascii="Consolas" w:cs="Consolas" w:eastAsia="Consolas" w:hAnsi="Consolas"/>
+          <w:sz w:val="16"/>
+          <w:szCs w:val="16"/>
+        </w:rPr>
+        <w:t xml:space="preserve">[LIGHT] Red-orange firelight flickering on her face, black smoke, falling ash, cold blue flashes in the distance — stylized, soft, like an animated film.</w:t>
+      </w:r>
+    </w:p>
+    <w:p>
+      <w:pPr>
+        <w:shd w:fill="F2EFEA" w:color="auto" w:val="clear"/>
+        <w:spacing w:after="0"/>
+        <w:ind w:left="120" w:right="120"/>
+      </w:pPr>
+      <w:r>
+        <w:rPr>
+          <w:rFonts w:ascii="Consolas" w:cs="Consolas" w:eastAsia="Consolas" w:hAnsi="Consolas"/>
+          <w:sz w:val="16"/>
+          <w:szCs w:val="16"/>
+        </w:rPr>
+        <w:t xml:space="preserve">[AUDIO] Only Vera's Russian line in her character voice, plus eerie ambient sound: crackling fire, popping embers, a low unsettling hum, a distant siren growing louder.</w:t>
+      </w:r>
+    </w:p>
+    <w:p>
+      <w:pPr>
+        <w:shd w:fill="F2EFEA" w:color="auto" w:val="clear"/>
+        <w:spacing w:after="0"/>
+        <w:ind w:left="120" w:right="120"/>
+      </w:pPr>
+      <w:r>
+        <w:rPr>
+          <w:rFonts w:ascii="Consolas" w:cs="Consolas" w:eastAsia="Consolas" w:hAnsi="Consolas"/>
+          <w:sz w:val="16"/>
+          <w:szCs w:val="16"/>
+        </w:rPr>
+        <w:t xml:space="preserve">[AVOID] No photorealism, no live-action look, no real-person faces, no skin pores or photographic detail; no shots without Vera; no static or frozen background; no monsters, no supernatural creatures, no glowing green radiation effects; no English speech, no other voices speaking words, no extra lines, no music; no subtitles or on-screen text, no logos, no watermarks; no extra fingers, no face, style or outfit changes, no gratuitous gore.</w:t>
       </w:r>
     </w:p>
     <w:p>
@@ -3942,7 +3942,7 @@
           <w:sz w:val="16"/>
           <w:szCs w:val="16"/>
         </w:rPr>
-        <w:t xml:space="preserve">[STYLE REMINDER] Whole clip in the same stylized painterly 3D animation style as the @Vera character images, not realistic; all other people are stylized animated characters too.</w:t>
+        <w:t xml:space="preserve">[STYLE REMINDER] Whole clip in the same stylized painterly 3D animation style as the @Vera character images, not realistic; all other people are stylized animated characters too; haunting, nightmarish mood.</w:t>
       </w:r>
     </w:p>
     <w:p>
@@ -3992,7 +3992,7 @@
           <w:sz w:val="16"/>
           <w:szCs w:val="16"/>
         </w:rPr>
-        <w:t xml:space="preserve">[STYLE — MOST IMPORTANT] Stylized 3D animated feature-film look with a hand-painted, painterly texture — exactly the same drawn, illustrated style as the @Vera character images. Soft painted shading, slightly simplified stylized forms, smooth painted skin without pores, visible brush-like texture in hair, clothes and background. This is an animated cartoon-film frame, NOT live action, NOT a photograph, NOT photorealistic, NOT a real human actor.</w:t>
+        <w:t xml:space="preserve">[STYLE — MOST IMPORTANT] Stylized 3D animated feature-film look with a hand-painted, painterly texture — exactly the same drawn, illustrated style as the @Vera character images. Soft painted shading, slightly simplified stylized forms, smooth painted skin without pores, visible brush-like texture in hair, clothes and background. This is an animated cartoon-film frame, NOT live action, NOT a photograph, NOT photorealistic, NOT a real human actor. Mood: desperate urgency with a sense of doom — brave people running toward danger they cannot see.</w:t>
       </w:r>
     </w:p>
     <w:p>
@@ -4037,37 +4037,37 @@
           <w:sz w:val="16"/>
           <w:szCs w:val="16"/>
         </w:rPr>
-        <w:t xml:space="preserve">[VERA] Vera is the main character and stays clearly visible from the first to the last frame, face readable. Vera stands in the left foreground and turns her face to the camera as the trucks race in behind her.</w:t>
-      </w:r>
-    </w:p>
-    <w:p>
-      <w:pPr>
-        <w:shd w:fill="F2EFEA" w:color="auto" w:val="clear"/>
-        <w:spacing w:after="0"/>
-        <w:ind w:left="120" w:right="120"/>
-      </w:pPr>
-      <w:r>
-        <w:rPr>
-          <w:rFonts w:ascii="Consolas" w:cs="Consolas" w:eastAsia="Consolas" w:hAnsi="Consolas"/>
-          <w:sz w:val="16"/>
-          <w:szCs w:val="16"/>
-        </w:rPr>
-        <w:t xml:space="preserve">[SPEECH] Vera says aloud in Russian, once, in her own character voice, anxious and compassionate: "Первыми приезжают пожарные. Они поднимаются на крыши — совсем рядом с открытым реактором." Russian only. Her lips and jaw move naturally with every Russian word. She starts at about 0.5 seconds and finishes before the end of the clip.</w:t>
-      </w:r>
-    </w:p>
-    <w:p>
-      <w:pPr>
-        <w:shd w:fill="F2EFEA" w:color="auto" w:val="clear"/>
-        <w:spacing w:after="0"/>
-        <w:ind w:left="120" w:right="120"/>
-      </w:pPr>
-      <w:r>
-        <w:rPr>
-          <w:rFonts w:ascii="Consolas" w:cs="Consolas" w:eastAsia="Consolas" w:hAnsi="Consolas"/>
-          <w:sz w:val="16"/>
-          <w:szCs w:val="16"/>
-        </w:rPr>
-        <w:t xml:space="preserve">[BACKGROUND ACTION — constant movement] Two red Soviet fire engines with blue flashing lights race in and brake hard behind her; firefighters in dark canvas turnout coats and helmets jump out, unroll hoses across the concrete, shout without audible words, run to a tall steel ladder on the wall and start climbing; above them fire and smoke pour from the roof.</w:t>
+        <w:t xml:space="preserve">[VERA] Vera is the main character and stays clearly visible from the first to the last frame, face readable. She stands in the left foreground and turns her face to the camera as the trucks race in behind her; her eyes follow the firefighters with dread. Long dark worn coat, wine-red scarf, brass compass-rose brooch, dark waistcoat, light shirt.</w:t>
+      </w:r>
+    </w:p>
+    <w:p>
+      <w:pPr>
+        <w:shd w:fill="F2EFEA" w:color="auto" w:val="clear"/>
+        <w:spacing w:after="0"/>
+        <w:ind w:left="120" w:right="120"/>
+      </w:pPr>
+      <w:r>
+        <w:rPr>
+          <w:rFonts w:ascii="Consolas" w:cs="Consolas" w:eastAsia="Consolas" w:hAnsi="Consolas"/>
+          <w:sz w:val="16"/>
+          <w:szCs w:val="16"/>
+        </w:rPr>
+        <w:t xml:space="preserve">[SPEECH] Vera says aloud in Russian, once, in her own character voice, anxious and compassionate, voice tight: "Первыми приезжают пожарные. Они поднимаются на крыши — совсем рядом с открытым реактором." Russian only. Her lips and jaw move naturally with every Russian word. She starts at about 0.4 seconds and finishes before the end of the clip.</w:t>
+      </w:r>
+    </w:p>
+    <w:p>
+      <w:pPr>
+        <w:shd w:fill="F2EFEA" w:color="auto" w:val="clear"/>
+        <w:spacing w:after="0"/>
+        <w:ind w:left="120" w:right="120"/>
+      </w:pPr>
+      <w:r>
+        <w:rPr>
+          <w:rFonts w:ascii="Consolas" w:cs="Consolas" w:eastAsia="Consolas" w:hAnsi="Consolas"/>
+          <w:sz w:val="16"/>
+          <w:szCs w:val="16"/>
+        </w:rPr>
+        <w:t xml:space="preserve">[BACKGROUND ACTION — constant, unsettling movement] Two red Soviet fire engines with blue flashing lights race in and brake hard behind her; firefighters in dark canvas turnout coats and helmets jump out, unroll hoses across the concrete, shout without audible words, run to a tall steel ladder on the wall and start climbing into the smoke; above them fire and dark smoke pour from the roof; ash falls around them.</w:t>
       </w:r>
     </w:p>
     <w:p>
@@ -4097,52 +4097,52 @@
           <w:sz w:val="16"/>
           <w:szCs w:val="16"/>
         </w:rPr>
-        <w:t xml:space="preserve">[CAMERA] Smooth fast pan from right to left following the trucks, settling on Vera in the left foreground. Vertical 9:16, Vera and the action both clearly visible.</w:t>
-      </w:r>
-    </w:p>
-    <w:p>
-      <w:pPr>
-        <w:shd w:fill="F2EFEA" w:color="auto" w:val="clear"/>
-        <w:spacing w:after="0"/>
-        <w:ind w:left="120" w:right="120"/>
-      </w:pPr>
-      <w:r>
-        <w:rPr>
-          <w:rFonts w:ascii="Consolas" w:cs="Consolas" w:eastAsia="Consolas" w:hAnsi="Consolas"/>
-          <w:sz w:val="16"/>
-          <w:szCs w:val="16"/>
-        </w:rPr>
-        <w:t xml:space="preserve">[LIGHT] Blue flashing lights mixed with orange firelight from above — stylized, soft, like an animated film.</w:t>
-      </w:r>
-    </w:p>
-    <w:p>
-      <w:pPr>
-        <w:shd w:fill="F2EFEA" w:color="auto" w:val="clear"/>
-        <w:spacing w:after="0"/>
-        <w:ind w:left="120" w:right="120"/>
-      </w:pPr>
-      <w:r>
-        <w:rPr>
-          <w:rFonts w:ascii="Consolas" w:cs="Consolas" w:eastAsia="Consolas" w:hAnsi="Consolas"/>
-          <w:sz w:val="16"/>
-          <w:szCs w:val="16"/>
-        </w:rPr>
-        <w:t xml:space="preserve">[AUDIO] Only Vera's Russian line in her character voice, plus layered ambient sound: engines, brakes, boots on concrete, hoses unrolling, fire roaring above.</w:t>
-      </w:r>
-    </w:p>
-    <w:p>
-      <w:pPr>
-        <w:shd w:fill="F2EFEA" w:color="auto" w:val="clear"/>
-        <w:spacing w:after="0"/>
-        <w:ind w:left="120" w:right="120"/>
-      </w:pPr>
-      <w:r>
-        <w:rPr>
-          <w:rFonts w:ascii="Consolas" w:cs="Consolas" w:eastAsia="Consolas" w:hAnsi="Consolas"/>
-          <w:sz w:val="16"/>
-          <w:szCs w:val="16"/>
-        </w:rPr>
-        <w:t xml:space="preserve">[AVOID] No photorealism, no live-action look, no real-person faces, no skin pores or photographic detail, no film-camera realism; no shots without Vera; no static or frozen background; no English speech, no other voices speaking words, no extra lines, no music; no subtitles or on-screen text, no logos, no watermarks; no extra fingers, no face, style or outfit changes, no modern objects, no gratuitous gore.</w:t>
+        <w:t xml:space="preserve">[CAMERA] Smooth fast pan from right to left following the trucks, settling on Vera in the left foreground, then a slow tilt up the ladder into the smoke. Vertical 9:16, Vera and the action both clearly visible.</w:t>
+      </w:r>
+    </w:p>
+    <w:p>
+      <w:pPr>
+        <w:shd w:fill="F2EFEA" w:color="auto" w:val="clear"/>
+        <w:spacing w:after="0"/>
+        <w:ind w:left="120" w:right="120"/>
+      </w:pPr>
+      <w:r>
+        <w:rPr>
+          <w:rFonts w:ascii="Consolas" w:cs="Consolas" w:eastAsia="Consolas" w:hAnsi="Consolas"/>
+          <w:sz w:val="16"/>
+          <w:szCs w:val="16"/>
+        </w:rPr>
+        <w:t xml:space="preserve">[LIGHT] Blue flashing lights cutting through smoke, orange firelight from above, deep shadows — stylized, soft, like an animated film.</w:t>
+      </w:r>
+    </w:p>
+    <w:p>
+      <w:pPr>
+        <w:shd w:fill="F2EFEA" w:color="auto" w:val="clear"/>
+        <w:spacing w:after="0"/>
+        <w:ind w:left="120" w:right="120"/>
+      </w:pPr>
+      <w:r>
+        <w:rPr>
+          <w:rFonts w:ascii="Consolas" w:cs="Consolas" w:eastAsia="Consolas" w:hAnsi="Consolas"/>
+          <w:sz w:val="16"/>
+          <w:szCs w:val="16"/>
+        </w:rPr>
+        <w:t xml:space="preserve">[AUDIO] Only Vera's Russian line in her character voice, plus eerie ambient sound: engines, brakes, boots on concrete, hoses unrolling, fire roaring above, a low ominous hum.</w:t>
+      </w:r>
+    </w:p>
+    <w:p>
+      <w:pPr>
+        <w:shd w:fill="F2EFEA" w:color="auto" w:val="clear"/>
+        <w:spacing w:after="0"/>
+        <w:ind w:left="120" w:right="120"/>
+      </w:pPr>
+      <w:r>
+        <w:rPr>
+          <w:rFonts w:ascii="Consolas" w:cs="Consolas" w:eastAsia="Consolas" w:hAnsi="Consolas"/>
+          <w:sz w:val="16"/>
+          <w:szCs w:val="16"/>
+        </w:rPr>
+        <w:t xml:space="preserve">[AVOID] No photorealism, no live-action look, no real-person faces, no skin pores or photographic detail; no shots without Vera; no static or frozen background; no monsters, no supernatural creatures; no English speech, no other voices speaking words, no extra lines, no music; no subtitles or on-screen text, no logos, no watermarks; no extra fingers, no face, style or outfit changes, no gratuitous gore.</w:t>
       </w:r>
     </w:p>
     <w:p>
@@ -4157,7 +4157,7 @@
           <w:sz w:val="16"/>
           <w:szCs w:val="16"/>
         </w:rPr>
-        <w:t xml:space="preserve">[STYLE REMINDER] Whole clip in the same stylized painterly 3D animation style as the @Vera character images, not realistic; all other people are stylized animated characters too.</w:t>
+        <w:t xml:space="preserve">[STYLE REMINDER] Whole clip in the same stylized painterly 3D animation style as the @Vera character images, not realistic; all other people are stylized animated characters too; doom and urgency.</w:t>
       </w:r>
     </w:p>
     <w:p>
@@ -4207,22 +4207,22 @@
           <w:sz w:val="16"/>
           <w:szCs w:val="16"/>
         </w:rPr>
-        <w:t xml:space="preserve">[STYLE — MOST IMPORTANT] Stylized 3D animated feature-film look with a hand-painted, painterly texture — exactly the same drawn, illustrated style as the @Vera character images. Soft painted shading, slightly simplified stylized forms, smooth painted skin without pores, visible brush-like texture in hair, clothes and background. This is an animated cartoon-film frame, NOT live action, NOT a photograph, NOT photorealistic, NOT a real human actor.</w:t>
-      </w:r>
-    </w:p>
-    <w:p>
-      <w:pPr>
-        <w:shd w:fill="F2EFEA" w:color="auto" w:val="clear"/>
-        <w:spacing w:after="0"/>
-        <w:ind w:left="120" w:right="120"/>
-      </w:pPr>
-      <w:r>
-        <w:rPr>
-          <w:rFonts w:ascii="Consolas" w:cs="Consolas" w:eastAsia="Consolas" w:hAnsi="Consolas"/>
-          <w:sz w:val="16"/>
-          <w:szCs w:val="16"/>
-        </w:rPr>
-        <w:t xml:space="preserve">[SCENE] Resolution of the night: firefighters fight the fire on the roof above Vera as dawn approaches.</w:t>
+        <w:t xml:space="preserve">[STYLE — MOST IMPORTANT] Stylized 3D animated feature-film look with a hand-painted, painterly texture — exactly the same drawn, illustrated style as the @Vera character images. Soft painted shading, slightly simplified stylized forms, smooth painted skin without pores, visible brush-like texture in hair, clothes and background. This is an animated cartoon-film frame, NOT live action, NOT a photograph, NOT photorealistic, NOT a real human actor. Mood: tragic, mournful — the heavy silence after a terrible night.</w:t>
+      </w:r>
+    </w:p>
+    <w:p>
+      <w:pPr>
+        <w:shd w:fill="F2EFEA" w:color="auto" w:val="clear"/>
+        <w:spacing w:after="0"/>
+        <w:ind w:left="120" w:right="120"/>
+      </w:pPr>
+      <w:r>
+        <w:rPr>
+          <w:rFonts w:ascii="Consolas" w:cs="Consolas" w:eastAsia="Consolas" w:hAnsi="Consolas"/>
+          <w:sz w:val="16"/>
+          <w:szCs w:val="16"/>
+        </w:rPr>
+        <w:t xml:space="preserve">[SCENE] Resolution of the night: firefighters fight the fire on the roof above Vera as a grey dawn approaches.</w:t>
       </w:r>
     </w:p>
     <w:p>
@@ -4252,37 +4252,37 @@
           <w:sz w:val="16"/>
           <w:szCs w:val="16"/>
         </w:rPr>
-        <w:t xml:space="preserve">[VERA] Vera is the main character and stays clearly visible from the first to the last frame, face readable. Vera stands at the foot of the building in the lower third, water mist drifting down around her, and speaks to the camera.</w:t>
-      </w:r>
-    </w:p>
-    <w:p>
-      <w:pPr>
-        <w:shd w:fill="F2EFEA" w:color="auto" w:val="clear"/>
-        <w:spacing w:after="0"/>
-        <w:ind w:left="120" w:right="120"/>
-      </w:pPr>
-      <w:r>
-        <w:rPr>
-          <w:rFonts w:ascii="Consolas" w:cs="Consolas" w:eastAsia="Consolas" w:hAnsi="Consolas"/>
-          <w:sz w:val="16"/>
-          <w:szCs w:val="16"/>
-        </w:rPr>
-        <w:t xml:space="preserve">[SPEECH] Vera says aloud in Russian, once, in her own character voice, quiet pain, slower: "Огонь на крышах сбивают за несколько часов. Но шестеро пожарных потом умрут от лучевой болезни." Russian only. Her lips and jaw move naturally with every Russian word. She starts at about 0.5 seconds and finishes before the end of the clip.</w:t>
-      </w:r>
-    </w:p>
-    <w:p>
-      <w:pPr>
-        <w:shd w:fill="F2EFEA" w:color="auto" w:val="clear"/>
-        <w:spacing w:after="0"/>
-        <w:ind w:left="120" w:right="120"/>
-      </w:pPr>
-      <w:r>
-        <w:rPr>
-          <w:rFonts w:ascii="Consolas" w:cs="Consolas" w:eastAsia="Consolas" w:hAnsi="Consolas"/>
-          <w:sz w:val="16"/>
-          <w:szCs w:val="16"/>
-        </w:rPr>
-        <w:t xml:space="preserve">[BACKGROUND ACTION — constant movement] On the roof above and behind her four firefighters direct two powerful hose jets into the flames; water bursts into clouds of steam, embers whirl up, one firefighter stumbles and is pulled back by another; the flames shrink during the clip while the sky turns from black to pre-dawn blue.</w:t>
+        <w:t xml:space="preserve">[VERA] Vera is the main character and stays clearly visible from the first to the last frame, face readable. She stands at the foot of the building in the lower third, water mist and ash drifting around her, and speaks to the camera, eyes glistening. Long dark worn coat, wine-red scarf, brass compass-rose brooch, dark waistcoat, light shirt.</w:t>
+      </w:r>
+    </w:p>
+    <w:p>
+      <w:pPr>
+        <w:shd w:fill="F2EFEA" w:color="auto" w:val="clear"/>
+        <w:spacing w:after="0"/>
+        <w:ind w:left="120" w:right="120"/>
+      </w:pPr>
+      <w:r>
+        <w:rPr>
+          <w:rFonts w:ascii="Consolas" w:cs="Consolas" w:eastAsia="Consolas" w:hAnsi="Consolas"/>
+          <w:sz w:val="16"/>
+          <w:szCs w:val="16"/>
+        </w:rPr>
+        <w:t xml:space="preserve">[SPEECH] Vera says aloud in Russian, once, in her own character voice, quiet pain, slower, the last sentence almost broken: "Огонь на крышах сбивают за несколько часов. Но шестеро пожарных потом умрут от лучевой болезни." Russian only. Her lips and jaw move naturally with every Russian word. She starts at about 0.4 seconds and finishes before the end of the clip.</w:t>
+      </w:r>
+    </w:p>
+    <w:p>
+      <w:pPr>
+        <w:shd w:fill="F2EFEA" w:color="auto" w:val="clear"/>
+        <w:spacing w:after="0"/>
+        <w:ind w:left="120" w:right="120"/>
+      </w:pPr>
+      <w:r>
+        <w:rPr>
+          <w:rFonts w:ascii="Consolas" w:cs="Consolas" w:eastAsia="Consolas" w:hAnsi="Consolas"/>
+          <w:sz w:val="16"/>
+          <w:szCs w:val="16"/>
+        </w:rPr>
+        <w:t xml:space="preserve">[BACKGROUND ACTION — constant, unsettling movement] On the roof above and behind her silhouettes of firefighters direct hose jets into the dying flames; water bursts into clouds of steam; one firefighter sways, sinks to his knees and is pulled back by another; the flames shrink during the clip while the sky turns from black to a cold, bruised pre-dawn blue; ash keeps falling.</w:t>
       </w:r>
     </w:p>
     <w:p>
@@ -4312,52 +4312,52 @@
           <w:sz w:val="16"/>
           <w:szCs w:val="16"/>
         </w:rPr>
-        <w:t xml:space="preserve">[CAMERA] Low-angle wide shot with Vera in the foreground, slow crane-like rise that reveals the roof. Vertical 9:16, Vera and the action both clearly visible.</w:t>
-      </w:r>
-    </w:p>
-    <w:p>
-      <w:pPr>
-        <w:shd w:fill="F2EFEA" w:color="auto" w:val="clear"/>
-        <w:spacing w:after="0"/>
-        <w:ind w:left="120" w:right="120"/>
-      </w:pPr>
-      <w:r>
-        <w:rPr>
-          <w:rFonts w:ascii="Consolas" w:cs="Consolas" w:eastAsia="Consolas" w:hAnsi="Consolas"/>
-          <w:sz w:val="16"/>
-          <w:szCs w:val="16"/>
-        </w:rPr>
-        <w:t xml:space="preserve">[LIGHT] Fading red glow turning into cold pre-dawn blue, water jets catching the light — stylized, soft, like an animated film.</w:t>
-      </w:r>
-    </w:p>
-    <w:p>
-      <w:pPr>
-        <w:shd w:fill="F2EFEA" w:color="auto" w:val="clear"/>
-        <w:spacing w:after="0"/>
-        <w:ind w:left="120" w:right="120"/>
-      </w:pPr>
-      <w:r>
-        <w:rPr>
-          <w:rFonts w:ascii="Consolas" w:cs="Consolas" w:eastAsia="Consolas" w:hAnsi="Consolas"/>
-          <w:sz w:val="16"/>
-          <w:szCs w:val="16"/>
-        </w:rPr>
-        <w:t xml:space="preserve">[AUDIO] Only Vera's Russian line in her character voice, plus layered ambient sound: rushing water, hissing steam, fading fire, dripping water.</w:t>
-      </w:r>
-    </w:p>
-    <w:p>
-      <w:pPr>
-        <w:shd w:fill="F2EFEA" w:color="auto" w:val="clear"/>
-        <w:spacing w:after="0"/>
-        <w:ind w:left="120" w:right="120"/>
-      </w:pPr>
-      <w:r>
-        <w:rPr>
-          <w:rFonts w:ascii="Consolas" w:cs="Consolas" w:eastAsia="Consolas" w:hAnsi="Consolas"/>
-          <w:sz w:val="16"/>
-          <w:szCs w:val="16"/>
-        </w:rPr>
-        <w:t xml:space="preserve">[AVOID] No photorealism, no live-action look, no real-person faces, no skin pores or photographic detail, no film-camera realism; no shots without Vera; no static or frozen background; no English speech, no other voices speaking words, no extra lines, no music; no subtitles or on-screen text, no logos, no watermarks; no extra fingers, no face, style or outfit changes, no modern objects, no gratuitous gore.</w:t>
+        <w:t xml:space="preserve">[CAMERA] Low-angle wide shot with Vera in the foreground, slow crane-like rise that reveals the roof, then settles back on her face. Vertical 9:16, Vera and the action both clearly visible.</w:t>
+      </w:r>
+    </w:p>
+    <w:p>
+      <w:pPr>
+        <w:shd w:fill="F2EFEA" w:color="auto" w:val="clear"/>
+        <w:spacing w:after="0"/>
+        <w:ind w:left="120" w:right="120"/>
+      </w:pPr>
+      <w:r>
+        <w:rPr>
+          <w:rFonts w:ascii="Consolas" w:cs="Consolas" w:eastAsia="Consolas" w:hAnsi="Consolas"/>
+          <w:sz w:val="16"/>
+          <w:szCs w:val="16"/>
+        </w:rPr>
+        <w:t xml:space="preserve">[LIGHT] Fading red glow turning into cold, colourless pre-dawn light, steam glowing faintly — stylized, soft, like an animated film.</w:t>
+      </w:r>
+    </w:p>
+    <w:p>
+      <w:pPr>
+        <w:shd w:fill="F2EFEA" w:color="auto" w:val="clear"/>
+        <w:spacing w:after="0"/>
+        <w:ind w:left="120" w:right="120"/>
+      </w:pPr>
+      <w:r>
+        <w:rPr>
+          <w:rFonts w:ascii="Consolas" w:cs="Consolas" w:eastAsia="Consolas" w:hAnsi="Consolas"/>
+          <w:sz w:val="16"/>
+          <w:szCs w:val="16"/>
+        </w:rPr>
+        <w:t xml:space="preserve">[AUDIO] Only Vera's Russian line in her character voice, plus eerie ambient sound: rushing water, hissing steam, dying fire, dripping water, then a heavy silence.</w:t>
+      </w:r>
+    </w:p>
+    <w:p>
+      <w:pPr>
+        <w:shd w:fill="F2EFEA" w:color="auto" w:val="clear"/>
+        <w:spacing w:after="0"/>
+        <w:ind w:left="120" w:right="120"/>
+      </w:pPr>
+      <w:r>
+        <w:rPr>
+          <w:rFonts w:ascii="Consolas" w:cs="Consolas" w:eastAsia="Consolas" w:hAnsi="Consolas"/>
+          <w:sz w:val="16"/>
+          <w:szCs w:val="16"/>
+        </w:rPr>
+        <w:t xml:space="preserve">[AVOID] No photorealism, no live-action look, no real-person faces, no skin pores or photographic detail; no shots without Vera; no static or frozen background; no monsters, no supernatural creatures; no English speech, no other voices speaking words, no extra lines, no music; no subtitles or on-screen text, no logos, no watermarks; no extra fingers, no face, style or outfit changes, no gratuitous gore.</w:t>
       </w:r>
     </w:p>
     <w:p>
@@ -4372,7 +4372,7 @@
           <w:sz w:val="16"/>
           <w:szCs w:val="16"/>
         </w:rPr>
-        <w:t xml:space="preserve">[STYLE REMINDER] Whole clip in the same stylized painterly 3D animation style as the @Vera character images, not realistic; all other people are stylized animated characters too.</w:t>
+        <w:t xml:space="preserve">[STYLE REMINDER] Whole clip in the same stylized painterly 3D animation style as the @Vera character images, not realistic; all other people are stylized animated characters too; tragic, mournful mood.</w:t>
       </w:r>
     </w:p>
     <w:p>
@@ -4422,22 +4422,22 @@
           <w:sz w:val="16"/>
           <w:szCs w:val="16"/>
         </w:rPr>
-        <w:t xml:space="preserve">[STYLE — MOST IMPORTANT] Stylized 3D animated feature-film look with a hand-painted, painterly texture — exactly the same drawn, illustrated style as the @Vera character images. Soft painted shading, slightly simplified stylized forms, smooth painted skin without pores, visible brush-like texture in hair, clothes and background. This is an animated cartoon-film frame, NOT live action, NOT a photograph, NOT photorealistic, NOT a real human actor.</w:t>
-      </w:r>
-    </w:p>
-    <w:p>
-      <w:pPr>
-        <w:shd w:fill="F2EFEA" w:color="auto" w:val="clear"/>
-        <w:spacing w:after="0"/>
-        <w:ind w:left="120" w:right="120"/>
-      </w:pPr>
-      <w:r>
-        <w:rPr>
-          <w:rFonts w:ascii="Consolas" w:cs="Consolas" w:eastAsia="Consolas" w:hAnsi="Consolas"/>
-          <w:sz w:val="16"/>
-          <w:szCs w:val="16"/>
-        </w:rPr>
-        <w:t xml:space="preserve">[SCENE] Contrast: a lively ordinary Saturday morning in Pripyat while smoke rises over the distant plant.</w:t>
+        <w:t xml:space="preserve">[STYLE — MOST IMPORTANT] Stylized 3D animated feature-film look with a hand-painted, painterly texture — exactly the same drawn, illustrated style as the @Vera character images. Soft painted shading, slightly simplified stylized forms, smooth painted skin without pores, visible brush-like texture in hair, clothes and background. This is an animated cartoon-film frame, NOT live action, NOT a photograph, NOT photorealistic, NOT a real human actor. Mood: deeply unsettling contrast — sunny ordinary life under an invisible threat.</w:t>
+      </w:r>
+    </w:p>
+    <w:p>
+      <w:pPr>
+        <w:shd w:fill="F2EFEA" w:color="auto" w:val="clear"/>
+        <w:spacing w:after="0"/>
+        <w:ind w:left="120" w:right="120"/>
+      </w:pPr>
+      <w:r>
+        <w:rPr>
+          <w:rFonts w:ascii="Consolas" w:cs="Consolas" w:eastAsia="Consolas" w:hAnsi="Consolas"/>
+          <w:sz w:val="16"/>
+          <w:szCs w:val="16"/>
+        </w:rPr>
+        <w:t xml:space="preserve">[SCENE] Contrast: a lively ordinary Saturday morning in Pripyat while a dark plume rises over the distant plant.</w:t>
       </w:r>
     </w:p>
     <w:p>
@@ -4467,37 +4467,37 @@
           <w:sz w:val="16"/>
           <w:szCs w:val="16"/>
         </w:rPr>
-        <w:t xml:space="preserve">[VERA] Vera is the main character and stays clearly visible from the first to the last frame, face readable. Vera walks down the sidewalk toward the camera through the morning crowd and stops to speak to the lens.</w:t>
-      </w:r>
-    </w:p>
-    <w:p>
-      <w:pPr>
-        <w:shd w:fill="F2EFEA" w:color="auto" w:val="clear"/>
-        <w:spacing w:after="0"/>
-        <w:ind w:left="120" w:right="120"/>
-      </w:pPr>
-      <w:r>
-        <w:rPr>
-          <w:rFonts w:ascii="Consolas" w:cs="Consolas" w:eastAsia="Consolas" w:hAnsi="Consolas"/>
-          <w:sz w:val="16"/>
-          <w:szCs w:val="16"/>
-        </w:rPr>
-        <w:t xml:space="preserve">[SPEECH] Vera says aloud in Russian, once, in her own character voice, bitter calm: "Утро. В Припяти обычная суббота. Об аварии городу не сказали." Russian only. Her lips and jaw move naturally with every Russian word. She starts at about 0.5 seconds and finishes before the end of the clip.</w:t>
-      </w:r>
-    </w:p>
-    <w:p>
-      <w:pPr>
-        <w:shd w:fill="F2EFEA" w:color="auto" w:val="clear"/>
-        <w:spacing w:after="0"/>
-        <w:ind w:left="120" w:right="120"/>
-      </w:pPr>
-      <w:r>
-        <w:rPr>
-          <w:rFonts w:ascii="Consolas" w:cs="Consolas" w:eastAsia="Consolas" w:hAnsi="Consolas"/>
-          <w:sz w:val="16"/>
-          <w:szCs w:val="16"/>
-        </w:rPr>
-        <w:t xml:space="preserve">[BACKGROUND ACTION — constant movement] Life goes on all around her: children ride bicycles past, a mother pushes a pram, men carry shopping bags, a bus stops and people get off, pigeons burst up from the pavement, laundry flaps on balconies, a militia car rolls slowly along the street; far beyond the rooftops a thin grey smoke plume rises over the plant.</w:t>
+        <w:t xml:space="preserve">[VERA] Vera is the main character and stays clearly visible from the first to the last frame, face readable. She walks down the sidewalk toward the camera through the cheerful morning crowd, the only person who looks worried, and stops to speak to the lens. Long dark worn coat, wine-red scarf, brass compass-rose brooch, dark waistcoat, light shirt.</w:t>
+      </w:r>
+    </w:p>
+    <w:p>
+      <w:pPr>
+        <w:shd w:fill="F2EFEA" w:color="auto" w:val="clear"/>
+        <w:spacing w:after="0"/>
+        <w:ind w:left="120" w:right="120"/>
+      </w:pPr>
+      <w:r>
+        <w:rPr>
+          <w:rFonts w:ascii="Consolas" w:cs="Consolas" w:eastAsia="Consolas" w:hAnsi="Consolas"/>
+          <w:sz w:val="16"/>
+          <w:szCs w:val="16"/>
+        </w:rPr>
+        <w:t xml:space="preserve">[SPEECH] Vera says aloud in Russian, once, in her own character voice, bitter calm, quiet: "Утро. В Припяти обычная суббота. Об аварии городу не сказали." Russian only. Her lips and jaw move naturally with every Russian word. She starts at about 0.4 seconds and finishes before the end of the clip.</w:t>
+      </w:r>
+    </w:p>
+    <w:p>
+      <w:pPr>
+        <w:shd w:fill="F2EFEA" w:color="auto" w:val="clear"/>
+        <w:spacing w:after="0"/>
+        <w:ind w:left="120" w:right="120"/>
+      </w:pPr>
+      <w:r>
+        <w:rPr>
+          <w:rFonts w:ascii="Consolas" w:cs="Consolas" w:eastAsia="Consolas" w:hAnsi="Consolas"/>
+          <w:sz w:val="16"/>
+          <w:szCs w:val="16"/>
+        </w:rPr>
+        <w:t xml:space="preserve">[BACKGROUND ACTION — constant, unsettling movement] Life goes on all around her: children ride bicycles past laughing, a mother pushes a pram, men carry shopping bags, a bus stops and people get off, pigeons burst up from the pavement, laundry flaps on balconies; nobody looks toward the horizon, where a thin dark plume rises over the plant; for a moment the shadow of a cloud passes over the street.</w:t>
       </w:r>
     </w:p>
     <w:p>
@@ -4527,52 +4527,52 @@
           <w:sz w:val="16"/>
           <w:szCs w:val="16"/>
         </w:rPr>
-        <w:t xml:space="preserve">[CAMERA] Handheld tracking shot moving backward in front of Vera, then a gentle stop. Vertical 9:16, Vera and the action both clearly visible.</w:t>
-      </w:r>
-    </w:p>
-    <w:p>
-      <w:pPr>
-        <w:shd w:fill="F2EFEA" w:color="auto" w:val="clear"/>
-        <w:spacing w:after="0"/>
-        <w:ind w:left="120" w:right="120"/>
-      </w:pPr>
-      <w:r>
-        <w:rPr>
-          <w:rFonts w:ascii="Consolas" w:cs="Consolas" w:eastAsia="Consolas" w:hAnsi="Consolas"/>
-          <w:sz w:val="16"/>
-          <w:szCs w:val="16"/>
-        </w:rPr>
-        <w:t xml:space="preserve">[LIGHT] Soft warm morning sun, pale blue sky, her wine-red scarf as the accent — stylized, soft, like an animated film.</w:t>
-      </w:r>
-    </w:p>
-    <w:p>
-      <w:pPr>
-        <w:shd w:fill="F2EFEA" w:color="auto" w:val="clear"/>
-        <w:spacing w:after="0"/>
-        <w:ind w:left="120" w:right="120"/>
-      </w:pPr>
-      <w:r>
-        <w:rPr>
-          <w:rFonts w:ascii="Consolas" w:cs="Consolas" w:eastAsia="Consolas" w:hAnsi="Consolas"/>
-          <w:sz w:val="16"/>
-          <w:szCs w:val="16"/>
-        </w:rPr>
-        <w:t xml:space="preserve">[AUDIO] Only Vera's Russian line in her character voice, plus layered ambient sound: birds, children laughing, bicycle bells, bus engine, distant voices without words.</w:t>
-      </w:r>
-    </w:p>
-    <w:p>
-      <w:pPr>
-        <w:shd w:fill="F2EFEA" w:color="auto" w:val="clear"/>
-        <w:spacing w:after="0"/>
-        <w:ind w:left="120" w:right="120"/>
-      </w:pPr>
-      <w:r>
-        <w:rPr>
-          <w:rFonts w:ascii="Consolas" w:cs="Consolas" w:eastAsia="Consolas" w:hAnsi="Consolas"/>
-          <w:sz w:val="16"/>
-          <w:szCs w:val="16"/>
-        </w:rPr>
-        <w:t xml:space="preserve">[AVOID] No photorealism, no live-action look, no real-person faces, no skin pores or photographic detail, no film-camera realism; no shots without Vera; no static or frozen background; no English speech, no other voices speaking words, no extra lines, no music; no subtitles or on-screen text, no logos, no watermarks; no extra fingers, no face, style or outfit changes, no modern objects, no gratuitous gore.</w:t>
+        <w:t xml:space="preserve">[CAMERA] Handheld tracking shot moving backward in front of Vera, then a slow push-in as the dark plume becomes visible over her shoulder. Vertical 9:16, Vera and the action both clearly visible.</w:t>
+      </w:r>
+    </w:p>
+    <w:p>
+      <w:pPr>
+        <w:shd w:fill="F2EFEA" w:color="auto" w:val="clear"/>
+        <w:spacing w:after="0"/>
+        <w:ind w:left="120" w:right="120"/>
+      </w:pPr>
+      <w:r>
+        <w:rPr>
+          <w:rFonts w:ascii="Consolas" w:cs="Consolas" w:eastAsia="Consolas" w:hAnsi="Consolas"/>
+          <w:sz w:val="16"/>
+          <w:szCs w:val="16"/>
+        </w:rPr>
+        <w:t xml:space="preserve">[LIGHT] Bright warm sun on the street, but a cold shadow passes over Vera's face; the plume dark against the pale sky — stylized, soft, like an animated film.</w:t>
+      </w:r>
+    </w:p>
+    <w:p>
+      <w:pPr>
+        <w:shd w:fill="F2EFEA" w:color="auto" w:val="clear"/>
+        <w:spacing w:after="0"/>
+        <w:ind w:left="120" w:right="120"/>
+      </w:pPr>
+      <w:r>
+        <w:rPr>
+          <w:rFonts w:ascii="Consolas" w:cs="Consolas" w:eastAsia="Consolas" w:hAnsi="Consolas"/>
+          <w:sz w:val="16"/>
+          <w:szCs w:val="16"/>
+        </w:rPr>
+        <w:t xml:space="preserve">[AUDIO] Only Vera's Russian line in her character voice, plus eerie ambient sound: birds, children laughing, bicycle bells, a bus engine, distant voices without words, and under it all a faint low hum.</w:t>
+      </w:r>
+    </w:p>
+    <w:p>
+      <w:pPr>
+        <w:shd w:fill="F2EFEA" w:color="auto" w:val="clear"/>
+        <w:spacing w:after="0"/>
+        <w:ind w:left="120" w:right="120"/>
+      </w:pPr>
+      <w:r>
+        <w:rPr>
+          <w:rFonts w:ascii="Consolas" w:cs="Consolas" w:eastAsia="Consolas" w:hAnsi="Consolas"/>
+          <w:sz w:val="16"/>
+          <w:szCs w:val="16"/>
+        </w:rPr>
+        <w:t xml:space="preserve">[AVOID] No photorealism, no live-action look, no real-person faces, no skin pores or photographic detail; no shots without Vera; no static or frozen background; no monsters, no supernatural creatures; no English speech, no other voices speaking words, no extra lines, no music; no subtitles or on-screen text, no logos, no watermarks; no extra fingers, no face, style or outfit changes, no gratuitous gore.</w:t>
       </w:r>
     </w:p>
     <w:p>
@@ -4587,7 +4587,7 @@
           <w:sz w:val="16"/>
           <w:szCs w:val="16"/>
         </w:rPr>
-        <w:t xml:space="preserve">[STYLE REMINDER] Whole clip in the same stylized painterly 3D animation style as the @Vera character images, not realistic; all other people are stylized animated characters too.</w:t>
+        <w:t xml:space="preserve">[STYLE REMINDER] Whole clip in the same stylized painterly 3D animation style as the @Vera character images, not realistic; all other people are stylized animated characters too; unsettling contrast, sunny but ominous.</w:t>
       </w:r>
     </w:p>
     <w:p>
@@ -4637,7 +4637,7 @@
           <w:sz w:val="16"/>
           <w:szCs w:val="16"/>
         </w:rPr>
-        <w:t xml:space="preserve">[STYLE — MOST IMPORTANT] Stylized 3D animated feature-film look with a hand-painted, painterly texture — exactly the same drawn, illustrated style as the @Vera character images. Soft painted shading, slightly simplified stylized forms, smooth painted skin without pores, visible brush-like texture in hair, clothes and background. This is an animated cartoon-film frame, NOT live action, NOT a photograph, NOT photorealistic, NOT a real human actor.</w:t>
+        <w:t xml:space="preserve">[STYLE — MOST IMPORTANT] Stylized 3D animated feature-film look with a hand-painted, painterly texture — exactly the same drawn, illustrated style as the @Vera character images. Soft painted shading, slightly simplified stylized forms, smooth painted skin without pores, visible brush-like texture in hair, clothes and background. This is an animated cartoon-film frame, NOT live action, NOT a photograph, NOT photorealistic, NOT a real human actor. Mood: quiet tragedy and unease — a whole city leaving and not knowing it is forever.</w:t>
       </w:r>
     </w:p>
     <w:p>
@@ -4682,112 +4682,112 @@
           <w:sz w:val="16"/>
           <w:szCs w:val="16"/>
         </w:rPr>
-        <w:t xml:space="preserve">[VERA] Vera is the main character and stays clearly visible from the first to the last frame, face readable. Vera walks against the flow of people toward the camera and speaks to the lens.</w:t>
-      </w:r>
-    </w:p>
-    <w:p>
-      <w:pPr>
-        <w:shd w:fill="F2EFEA" w:color="auto" w:val="clear"/>
-        <w:spacing w:after="0"/>
-        <w:ind w:left="120" w:right="120"/>
-      </w:pPr>
-      <w:r>
-        <w:rPr>
-          <w:rFonts w:ascii="Consolas" w:cs="Consolas" w:eastAsia="Consolas" w:hAnsi="Consolas"/>
-          <w:sz w:val="16"/>
-          <w:szCs w:val="16"/>
-        </w:rPr>
-        <w:t xml:space="preserve">[SPEECH] Vera says aloud in Russian, once, in her own character voice, sad and restrained: "На следующий день к домам подают автобусы. Уезжают около пятидесяти тысяч человек. Говорят — временно." Russian only. Her lips and jaw move naturally with every Russian word. She starts at about 0.5 seconds and finishes before the end of the clip.</w:t>
-      </w:r>
-    </w:p>
-    <w:p>
-      <w:pPr>
-        <w:shd w:fill="F2EFEA" w:color="auto" w:val="clear"/>
-        <w:spacing w:after="0"/>
-        <w:ind w:left="120" w:right="120"/>
-      </w:pPr>
-      <w:r>
-        <w:rPr>
-          <w:rFonts w:ascii="Consolas" w:cs="Consolas" w:eastAsia="Consolas" w:hAnsi="Consolas"/>
-          <w:sz w:val="16"/>
-          <w:szCs w:val="16"/>
-        </w:rPr>
-        <w:t xml:space="preserve">[BACKGROUND ACTION — constant movement] A long column of yellow and cream Soviet buses stretches down the street; streams of residents with small bags and suitcases hurry to the doors, militia officers in grey uniforms wave them on, a child clutching a toy looks back from a bus window, doors close and one bus after another pulls away raising dust.</w:t>
-      </w:r>
-    </w:p>
-    <w:p>
-      <w:pPr>
-        <w:shd w:fill="F2EFEA" w:color="auto" w:val="clear"/>
-        <w:spacing w:after="0"/>
-        <w:ind w:left="120" w:right="120"/>
-      </w:pPr>
-      <w:r>
-        <w:rPr>
-          <w:rFonts w:ascii="Consolas" w:cs="Consolas" w:eastAsia="Consolas" w:hAnsi="Consolas"/>
-          <w:sz w:val="16"/>
-          <w:szCs w:val="16"/>
-        </w:rPr>
-        <w:t xml:space="preserve">[SETTING &amp; ERA] Afternoon of 27 April 1986, Pripyat, sunny and warm, white panel apartment blocks, 1980s LAZ and Ikarus style buses.</w:t>
-      </w:r>
-    </w:p>
-    <w:p>
-      <w:pPr>
-        <w:shd w:fill="F2EFEA" w:color="auto" w:val="clear"/>
-        <w:spacing w:after="0"/>
-        <w:ind w:left="120" w:right="120"/>
-      </w:pPr>
-      <w:r>
-        <w:rPr>
-          <w:rFonts w:ascii="Consolas" w:cs="Consolas" w:eastAsia="Consolas" w:hAnsi="Consolas"/>
-          <w:sz w:val="16"/>
-          <w:szCs w:val="16"/>
-        </w:rPr>
-        <w:t xml:space="preserve">[CAMERA] Lateral tracking shot along the bus column keeping Vera in the right foreground. Vertical 9:16, Vera and the action both clearly visible.</w:t>
-      </w:r>
-    </w:p>
-    <w:p>
-      <w:pPr>
-        <w:shd w:fill="F2EFEA" w:color="auto" w:val="clear"/>
-        <w:spacing w:after="0"/>
-        <w:ind w:left="120" w:right="120"/>
-      </w:pPr>
-      <w:r>
-        <w:rPr>
-          <w:rFonts w:ascii="Consolas" w:cs="Consolas" w:eastAsia="Consolas" w:hAnsi="Consolas"/>
-          <w:sz w:val="16"/>
-          <w:szCs w:val="16"/>
-        </w:rPr>
-        <w:t xml:space="preserve">[LIGHT] Bright spring daylight, dust in the sunbeams, muted pastel colours — stylized, soft, like an animated film.</w:t>
-      </w:r>
-    </w:p>
-    <w:p>
-      <w:pPr>
-        <w:shd w:fill="F2EFEA" w:color="auto" w:val="clear"/>
-        <w:spacing w:after="0"/>
-        <w:ind w:left="120" w:right="120"/>
-      </w:pPr>
-      <w:r>
-        <w:rPr>
-          <w:rFonts w:ascii="Consolas" w:cs="Consolas" w:eastAsia="Consolas" w:hAnsi="Consolas"/>
-          <w:sz w:val="16"/>
-          <w:szCs w:val="16"/>
-        </w:rPr>
-        <w:t xml:space="preserve">[AUDIO] Only Vera's Russian line in her character voice, plus layered ambient sound: bus engines, doors hissing, footsteps, murmur of the crowd without words.</w:t>
-      </w:r>
-    </w:p>
-    <w:p>
-      <w:pPr>
-        <w:shd w:fill="F2EFEA" w:color="auto" w:val="clear"/>
-        <w:spacing w:after="0"/>
-        <w:ind w:left="120" w:right="120"/>
-      </w:pPr>
-      <w:r>
-        <w:rPr>
-          <w:rFonts w:ascii="Consolas" w:cs="Consolas" w:eastAsia="Consolas" w:hAnsi="Consolas"/>
-          <w:sz w:val="16"/>
-          <w:szCs w:val="16"/>
-        </w:rPr>
-        <w:t xml:space="preserve">[AVOID] No photorealism, no live-action look, no real-person faces, no skin pores or photographic detail, no film-camera realism; no shots without Vera; no static or frozen background; no English speech, no other voices speaking words, no extra lines, no music; no subtitles or on-screen text, no logos, no watermarks; no extra fingers, no face, style or outfit changes, no modern objects, no gratuitous gore.</w:t>
+        <w:t xml:space="preserve">[VERA] Vera is the main character and stays clearly visible from the first to the last frame, face readable. She walks against the flow of people toward the camera and speaks to the lens, sad and tense. Long dark worn coat, wine-red scarf, brass compass-rose brooch, dark waistcoat, light shirt.</w:t>
+      </w:r>
+    </w:p>
+    <w:p>
+      <w:pPr>
+        <w:shd w:fill="F2EFEA" w:color="auto" w:val="clear"/>
+        <w:spacing w:after="0"/>
+        <w:ind w:left="120" w:right="120"/>
+      </w:pPr>
+      <w:r>
+        <w:rPr>
+          <w:rFonts w:ascii="Consolas" w:cs="Consolas" w:eastAsia="Consolas" w:hAnsi="Consolas"/>
+          <w:sz w:val="16"/>
+          <w:szCs w:val="16"/>
+        </w:rPr>
+        <w:t xml:space="preserve">[SPEECH] Vera says aloud in Russian, once, in her own character voice, sad and restrained, the last word lingering: "На следующий день к домам подают автобусы. Уезжают около пятидесяти тысяч человек. Говорят — временно." Russian only. Her lips and jaw move naturally with every Russian word. She starts at about 0.3 seconds and finishes before the end of the clip.</w:t>
+      </w:r>
+    </w:p>
+    <w:p>
+      <w:pPr>
+        <w:shd w:fill="F2EFEA" w:color="auto" w:val="clear"/>
+        <w:spacing w:after="0"/>
+        <w:ind w:left="120" w:right="120"/>
+      </w:pPr>
+      <w:r>
+        <w:rPr>
+          <w:rFonts w:ascii="Consolas" w:cs="Consolas" w:eastAsia="Consolas" w:hAnsi="Consolas"/>
+          <w:sz w:val="16"/>
+          <w:szCs w:val="16"/>
+        </w:rPr>
+        <w:t xml:space="preserve">[BACKGROUND ACTION — constant, unsettling movement] A long column of yellow and cream Soviet buses stretches down the street; streams of residents with small bags hurry to the doors, militia officers in grey uniforms wave them on, a child clutching a toy looks back from a bus window, doors close and one bus after another pulls away raising dust; a forgotten ball rolls slowly across the empty pavement.</w:t>
+      </w:r>
+    </w:p>
+    <w:p>
+      <w:pPr>
+        <w:shd w:fill="F2EFEA" w:color="auto" w:val="clear"/>
+        <w:spacing w:after="0"/>
+        <w:ind w:left="120" w:right="120"/>
+      </w:pPr>
+      <w:r>
+        <w:rPr>
+          <w:rFonts w:ascii="Consolas" w:cs="Consolas" w:eastAsia="Consolas" w:hAnsi="Consolas"/>
+          <w:sz w:val="16"/>
+          <w:szCs w:val="16"/>
+        </w:rPr>
+        <w:t xml:space="preserve">[SETTING &amp; ERA] Afternoon of 27 April 1986, Pripyat, hazy sun, white panel apartment blocks, 1980s LAZ and Ikarus style buses.</w:t>
+      </w:r>
+    </w:p>
+    <w:p>
+      <w:pPr>
+        <w:shd w:fill="F2EFEA" w:color="auto" w:val="clear"/>
+        <w:spacing w:after="0"/>
+        <w:ind w:left="120" w:right="120"/>
+      </w:pPr>
+      <w:r>
+        <w:rPr>
+          <w:rFonts w:ascii="Consolas" w:cs="Consolas" w:eastAsia="Consolas" w:hAnsi="Consolas"/>
+          <w:sz w:val="16"/>
+          <w:szCs w:val="16"/>
+        </w:rPr>
+        <w:t xml:space="preserve">[CAMERA] Lateral tracking shot along the bus column keeping Vera in the right foreground, ending on her face. Vertical 9:16, Vera and the action both clearly visible.</w:t>
+      </w:r>
+    </w:p>
+    <w:p>
+      <w:pPr>
+        <w:shd w:fill="F2EFEA" w:color="auto" w:val="clear"/>
+        <w:spacing w:after="0"/>
+        <w:ind w:left="120" w:right="120"/>
+      </w:pPr>
+      <w:r>
+        <w:rPr>
+          <w:rFonts w:ascii="Consolas" w:cs="Consolas" w:eastAsia="Consolas" w:hAnsi="Consolas"/>
+          <w:sz w:val="16"/>
+          <w:szCs w:val="16"/>
+        </w:rPr>
+        <w:t xml:space="preserve">[LIGHT] Hazy pale sunlight, dust in the beams, washed-out colours — stylized, soft, like an animated film.</w:t>
+      </w:r>
+    </w:p>
+    <w:p>
+      <w:pPr>
+        <w:shd w:fill="F2EFEA" w:color="auto" w:val="clear"/>
+        <w:spacing w:after="0"/>
+        <w:ind w:left="120" w:right="120"/>
+      </w:pPr>
+      <w:r>
+        <w:rPr>
+          <w:rFonts w:ascii="Consolas" w:cs="Consolas" w:eastAsia="Consolas" w:hAnsi="Consolas"/>
+          <w:sz w:val="16"/>
+          <w:szCs w:val="16"/>
+        </w:rPr>
+        <w:t xml:space="preserve">[AUDIO] Only Vera's Russian line in her character voice, plus eerie ambient sound: bus engines, doors hissing, footsteps, murmur of the crowd without words, a long distant bus horn.</w:t>
+      </w:r>
+    </w:p>
+    <w:p>
+      <w:pPr>
+        <w:shd w:fill="F2EFEA" w:color="auto" w:val="clear"/>
+        <w:spacing w:after="0"/>
+        <w:ind w:left="120" w:right="120"/>
+      </w:pPr>
+      <w:r>
+        <w:rPr>
+          <w:rFonts w:ascii="Consolas" w:cs="Consolas" w:eastAsia="Consolas" w:hAnsi="Consolas"/>
+          <w:sz w:val="16"/>
+          <w:szCs w:val="16"/>
+        </w:rPr>
+        <w:t xml:space="preserve">[AVOID] No photorealism, no live-action look, no real-person faces, no skin pores or photographic detail; no shots without Vera; no static or frozen background; no monsters, no supernatural creatures; no English speech, no other voices speaking words, no extra lines, no music; no subtitles or on-screen text, no logos, no watermarks; no extra fingers, no face, style or outfit changes, no gratuitous gore.</w:t>
       </w:r>
     </w:p>
     <w:p>
@@ -4802,7 +4802,7 @@
           <w:sz w:val="16"/>
           <w:szCs w:val="16"/>
         </w:rPr>
-        <w:t xml:space="preserve">[STYLE REMINDER] Whole clip in the same stylized painterly 3D animation style as the @Vera character images, not realistic; all other people are stylized animated characters too.</w:t>
+        <w:t xml:space="preserve">[STYLE REMINDER] Whole clip in the same stylized painterly 3D animation style as the @Vera character images, not realistic; all other people are stylized animated characters too; quiet tragedy.</w:t>
       </w:r>
     </w:p>
     <w:p>
@@ -4837,37 +4837,37 @@
         <w:t xml:space="preserve">Реплика:</w:t>
       </w:r>
       <w:r>
-        <w:t xml:space="preserve"> «Виновата не одна кнопка, а изъян реактора и нарушения при испытании. Город, которому было шестнадцать лет, пустует до сих пор.»</w:t>
-      </w:r>
-    </w:p>
-    <w:p>
-      <w:pPr>
-        <w:shd w:fill="F2EFEA" w:color="auto" w:val="clear"/>
-        <w:spacing w:after="0"/>
-        <w:ind w:left="120" w:right="120"/>
-      </w:pPr>
-      <w:r>
-        <w:rPr>
-          <w:rFonts w:ascii="Consolas" w:cs="Consolas" w:eastAsia="Consolas" w:hAnsi="Consolas"/>
-          <w:sz w:val="16"/>
-          <w:szCs w:val="16"/>
-        </w:rPr>
-        <w:t xml:space="preserve">[STYLE — MOST IMPORTANT] Stylized 3D animated feature-film look with a hand-painted, painterly texture — exactly the same drawn, illustrated style as the @Vera character images. Soft painted shading, slightly simplified stylized forms, smooth painted skin without pores, visible brush-like texture in hair, clothes and background. This is an animated cartoon-film frame, NOT live action, NOT a photograph, NOT photorealistic, NOT a real human actor.</w:t>
-      </w:r>
-    </w:p>
-    <w:p>
-      <w:pPr>
-        <w:shd w:fill="F2EFEA" w:color="auto" w:val="clear"/>
-        <w:spacing w:after="0"/>
-        <w:ind w:left="120" w:right="120"/>
-      </w:pPr>
-      <w:r>
-        <w:rPr>
-          <w:rFonts w:ascii="Consolas" w:cs="Consolas" w:eastAsia="Consolas" w:hAnsi="Consolas"/>
-          <w:sz w:val="16"/>
-          <w:szCs w:val="16"/>
-        </w:rPr>
-        <w:t xml:space="preserve">[SCENE] Final: Vera alone in the empty, evacuated city; the wind is the only movement left.</w:t>
+        <w:t xml:space="preserve"> «Виновата не одна кнопка, а изъян реактора и нарушения при испытании. Город пустует уже сорок лет. Такой была ночь Чернобыля.»</w:t>
+      </w:r>
+    </w:p>
+    <w:p>
+      <w:pPr>
+        <w:shd w:fill="F2EFEA" w:color="auto" w:val="clear"/>
+        <w:spacing w:after="0"/>
+        <w:ind w:left="120" w:right="120"/>
+      </w:pPr>
+      <w:r>
+        <w:rPr>
+          <w:rFonts w:ascii="Consolas" w:cs="Consolas" w:eastAsia="Consolas" w:hAnsi="Consolas"/>
+          <w:sz w:val="16"/>
+          <w:szCs w:val="16"/>
+        </w:rPr>
+        <w:t xml:space="preserve">[STYLE — MOST IMPORTANT] Stylized 3D animated feature-film look with a hand-painted, painterly texture — exactly the same drawn, illustrated style as the @Vera character images. Soft painted shading, slightly simplified stylized forms, smooth painted skin without pores, visible brush-like texture in hair, clothes and background. This is an animated cartoon-film frame, NOT live action, NOT a photograph, NOT photorealistic, NOT a real human actor. Mood: haunting emptiness, ghost-town silence, a quiet final chill.</w:t>
+      </w:r>
+    </w:p>
+    <w:p>
+      <w:pPr>
+        <w:shd w:fill="F2EFEA" w:color="auto" w:val="clear"/>
+        <w:spacing w:after="0"/>
+        <w:ind w:left="120" w:right="120"/>
+      </w:pPr>
+      <w:r>
+        <w:rPr>
+          <w:rFonts w:ascii="Consolas" w:cs="Consolas" w:eastAsia="Consolas" w:hAnsi="Consolas"/>
+          <w:sz w:val="16"/>
+          <w:szCs w:val="16"/>
+        </w:rPr>
+        <w:t xml:space="preserve">[SCENE] Final: Vera alone in the empty, evacuated city; only the wind is moving.</w:t>
       </w:r>
     </w:p>
     <w:p>
@@ -4897,37 +4897,37 @@
           <w:sz w:val="16"/>
           <w:szCs w:val="16"/>
         </w:rPr>
-        <w:t xml:space="preserve">[VERA] Vera is the main character and stays clearly visible from the first to the last frame, face readable. Vera stands in the middle of the empty street facing the camera; the wind pulls at her hair and scarf.</w:t>
-      </w:r>
-    </w:p>
-    <w:p>
-      <w:pPr>
-        <w:shd w:fill="F2EFEA" w:color="auto" w:val="clear"/>
-        <w:spacing w:after="0"/>
-        <w:ind w:left="120" w:right="120"/>
-      </w:pPr>
-      <w:r>
-        <w:rPr>
-          <w:rFonts w:ascii="Consolas" w:cs="Consolas" w:eastAsia="Consolas" w:hAnsi="Consolas"/>
-          <w:sz w:val="16"/>
-          <w:szCs w:val="16"/>
-        </w:rPr>
-        <w:t xml:space="preserve">[SPEECH] Vera says aloud in Russian, once, in her own character voice, quiet and firm, no pathos: "Виновата не одна кнопка, а изъян реактора и нарушения при испытании. Город, которому было шестнадцать лет, пустует до сих пор." Russian only. Her lips and jaw move naturally with every Russian word. She starts at about 0.5 seconds and finishes before the end of the clip.</w:t>
-      </w:r>
-    </w:p>
-    <w:p>
-      <w:pPr>
-        <w:shd w:fill="F2EFEA" w:color="auto" w:val="clear"/>
-        <w:spacing w:after="0"/>
-        <w:ind w:left="120" w:right="120"/>
-      </w:pPr>
-      <w:r>
-        <w:rPr>
-          <w:rFonts w:ascii="Consolas" w:cs="Consolas" w:eastAsia="Consolas" w:hAnsi="Consolas"/>
-          <w:sz w:val="16"/>
-          <w:szCs w:val="16"/>
-        </w:rPr>
-        <w:t xml:space="preserve">[BACKGROUND ACTION — constant movement] The abandoned city moves only with the wind: papers and leaves sweep across the street, an open window curtain flaps on a high floor, a swing creaks back and forth on an empty playground, a stray dog crosses the street, far away a military truck drives slowly past and disappears; the buildings are intact.</w:t>
+        <w:t xml:space="preserve">[VERA] Vera is the main character and stays clearly visible from the first to the last frame, face readable. She stands in the middle of the empty street facing the camera; the wind pulls at her hair and scarf; after the last sentence she stays silent and holds her gaze on the camera. Long dark worn coat, wine-red scarf, brass compass-rose brooch, dark waistcoat, light shirt.</w:t>
+      </w:r>
+    </w:p>
+    <w:p>
+      <w:pPr>
+        <w:shd w:fill="F2EFEA" w:color="auto" w:val="clear"/>
+        <w:spacing w:after="0"/>
+        <w:ind w:left="120" w:right="120"/>
+      </w:pPr>
+      <w:r>
+        <w:rPr>
+          <w:rFonts w:ascii="Consolas" w:cs="Consolas" w:eastAsia="Consolas" w:hAnsi="Consolas"/>
+          <w:sz w:val="16"/>
+          <w:szCs w:val="16"/>
+        </w:rPr>
+        <w:t xml:space="preserve">[SPEECH] Vera says aloud in Russian, once, in her own character voice, quiet and firm, no pathos, with a short pause before the last sentence: "Виновата не одна кнопка, а изъян реактора и нарушения при испытании. Город пустует уже сорок лет. Такой была ночь Чернобыля." Russian only. Her lips and jaw move naturally with every Russian word. She starts at about 0.3 seconds and finishes before the end of the clip.</w:t>
+      </w:r>
+    </w:p>
+    <w:p>
+      <w:pPr>
+        <w:shd w:fill="F2EFEA" w:color="auto" w:val="clear"/>
+        <w:spacing w:after="0"/>
+        <w:ind w:left="120" w:right="120"/>
+      </w:pPr>
+      <w:r>
+        <w:rPr>
+          <w:rFonts w:ascii="Consolas" w:cs="Consolas" w:eastAsia="Consolas" w:hAnsi="Consolas"/>
+          <w:sz w:val="16"/>
+          <w:szCs w:val="16"/>
+        </w:rPr>
+        <w:t xml:space="preserve">[BACKGROUND ACTION — constant, unsettling movement] The abandoned city moves only with the wind: papers and dead leaves sweep across the street, a curtain flaps out of an open window high above, a swing creaks back and forth on an empty playground, a stray dog stops and stares, then runs off; one by one the last lit windows go dark; the buildings are intact.</w:t>
       </w:r>
     </w:p>
     <w:p>
@@ -4957,52 +4957,52 @@
           <w:sz w:val="16"/>
           <w:szCs w:val="16"/>
         </w:rPr>
-        <w:t xml:space="preserve">[CAMERA] Slow pull-back that rises like a crane, the empty city opening up around her. Vertical 9:16, Vera and the action both clearly visible.</w:t>
-      </w:r>
-    </w:p>
-    <w:p>
-      <w:pPr>
-        <w:shd w:fill="F2EFEA" w:color="auto" w:val="clear"/>
-        <w:spacing w:after="0"/>
-        <w:ind w:left="120" w:right="120"/>
-      </w:pPr>
-      <w:r>
-        <w:rPr>
-          <w:rFonts w:ascii="Consolas" w:cs="Consolas" w:eastAsia="Consolas" w:hAnsi="Consolas"/>
-          <w:sz w:val="16"/>
-          <w:szCs w:val="16"/>
-        </w:rPr>
-        <w:t xml:space="preserve">[LIGHT] Cold grey-blue overcast light, desaturated, her wine-red scarf the only warm colour — stylized, soft, like an animated film.</w:t>
-      </w:r>
-    </w:p>
-    <w:p>
-      <w:pPr>
-        <w:shd w:fill="F2EFEA" w:color="auto" w:val="clear"/>
-        <w:spacing w:after="0"/>
-        <w:ind w:left="120" w:right="120"/>
-      </w:pPr>
-      <w:r>
-        <w:rPr>
-          <w:rFonts w:ascii="Consolas" w:cs="Consolas" w:eastAsia="Consolas" w:hAnsi="Consolas"/>
-          <w:sz w:val="16"/>
-          <w:szCs w:val="16"/>
-        </w:rPr>
-        <w:t xml:space="preserve">[AUDIO] Only Vera's Russian line in her character voice, plus layered ambient sound: wind, rustling leaves, creaking swing, distant truck engine.</w:t>
-      </w:r>
-    </w:p>
-    <w:p>
-      <w:pPr>
-        <w:shd w:fill="F2EFEA" w:color="auto" w:val="clear"/>
-        <w:spacing w:after="0"/>
-        <w:ind w:left="120" w:right="120"/>
-      </w:pPr>
-      <w:r>
-        <w:rPr>
-          <w:rFonts w:ascii="Consolas" w:cs="Consolas" w:eastAsia="Consolas" w:hAnsi="Consolas"/>
-          <w:sz w:val="16"/>
-          <w:szCs w:val="16"/>
-        </w:rPr>
-        <w:t xml:space="preserve">[AVOID] No photorealism, no live-action look, no real-person faces, no skin pores or photographic detail, no film-camera realism; no shots without Vera; no static or frozen background; no English speech, no other voices speaking words, no extra lines, no music; no subtitles or on-screen text, no logos, no watermarks; no extra fingers, no face, style or outfit changes, no modern objects, no gratuitous gore.</w:t>
+        <w:t xml:space="preserve">[CAMERA] Slow pull-back that rises like a crane, the empty city opening up around her, Vera growing small in the centre. Vertical 9:16, Vera and the action both clearly visible.</w:t>
+      </w:r>
+    </w:p>
+    <w:p>
+      <w:pPr>
+        <w:shd w:fill="F2EFEA" w:color="auto" w:val="clear"/>
+        <w:spacing w:after="0"/>
+        <w:ind w:left="120" w:right="120"/>
+      </w:pPr>
+      <w:r>
+        <w:rPr>
+          <w:rFonts w:ascii="Consolas" w:cs="Consolas" w:eastAsia="Consolas" w:hAnsi="Consolas"/>
+          <w:sz w:val="16"/>
+          <w:szCs w:val="16"/>
+        </w:rPr>
+        <w:t xml:space="preserve">[LIGHT] Cold grey-blue overcast light, desaturated, deep shadows in the windows, her wine-red scarf the only warm colour — stylized, soft, like an animated film.</w:t>
+      </w:r>
+    </w:p>
+    <w:p>
+      <w:pPr>
+        <w:shd w:fill="F2EFEA" w:color="auto" w:val="clear"/>
+        <w:spacing w:after="0"/>
+        <w:ind w:left="120" w:right="120"/>
+      </w:pPr>
+      <w:r>
+        <w:rPr>
+          <w:rFonts w:ascii="Consolas" w:cs="Consolas" w:eastAsia="Consolas" w:hAnsi="Consolas"/>
+          <w:sz w:val="16"/>
+          <w:szCs w:val="16"/>
+        </w:rPr>
+        <w:t xml:space="preserve">[AUDIO] Only Vera's Russian line in her character voice, plus eerie ambient sound: wind, rustling leaves, a creaking swing, a door banging somewhere far away, then silence.</w:t>
+      </w:r>
+    </w:p>
+    <w:p>
+      <w:pPr>
+        <w:shd w:fill="F2EFEA" w:color="auto" w:val="clear"/>
+        <w:spacing w:after="0"/>
+        <w:ind w:left="120" w:right="120"/>
+      </w:pPr>
+      <w:r>
+        <w:rPr>
+          <w:rFonts w:ascii="Consolas" w:cs="Consolas" w:eastAsia="Consolas" w:hAnsi="Consolas"/>
+          <w:sz w:val="16"/>
+          <w:szCs w:val="16"/>
+        </w:rPr>
+        <w:t xml:space="preserve">[AVOID] No photorealism, no live-action look, no real-person faces, no skin pores or photographic detail; no shots without Vera; no static or frozen background; no monsters, no supernatural creatures; no English speech, no other voices speaking words, no extra lines, no music; no subtitles or on-screen text, no logos, no watermarks; no extra fingers, no face, style or outfit changes, no gratuitous gore.</w:t>
       </w:r>
     </w:p>
     <w:p>
@@ -5017,7 +5017,7 @@
           <w:sz w:val="16"/>
           <w:szCs w:val="16"/>
         </w:rPr>
-        <w:t xml:space="preserve">[STYLE REMINDER] Whole clip in the same stylized painterly 3D animation style as the @Vera character images, not realistic; all other people are stylized animated characters too.</w:t>
+        <w:t xml:space="preserve">[STYLE REMINDER] Whole clip in the same stylized painterly 3D animation style as the @Vera character images, not realistic; all other people are stylized animated characters too; haunting ghost-town emptiness.</w:t>
       </w:r>
     </w:p>
     <w:p>
@@ -5033,7 +5033,7 @@
         <w:spacing w:after="80"/>
       </w:pPr>
       <w:r>
-        <w:t xml:space="preserve">Все промпты начинаются с блока [STYLE — MOST IMPORTANT]: Omni Flash по умолчанию делает реалистично, этот блок держит рисованный стиль персонажа. Если всё равно реалистично — замените картинки персонажа на исходный нарисованный vera_face_reference.png или запустите клип в режиме Frames со стартовым кадром в нужном стиле.</w:t>
+        <w:t xml:space="preserve">Все промпты начинаются с блока [STYLE — MOST IMPORTANT] (рисованный стиль персонажа + жутковатое настроение сцены): Omni Flash по умолчанию делает реалистично, этот блок держит стиль. Если всё равно реалистично — замените картинки персонажа на исходный нарисованный vera_face_reference.png или запустите клип в режиме Frames со стартовым кадром в нужном стиле.</w:t>
       </w:r>
     </w:p>
     <w:p>

</xml_diff>

<commit_message>
EP01 v8: clips 02-05 in different locations (turbine hall, reactor hall, control room)
Co-Authored-By: Claude Opus 5.5 <noreply@anthropic.com>
Claude-Session: https://claude.ai/code/session_01VAADPC5RMETnb7oPTVQosk
</commit_message>
<xml_diff>
--- a/episodes/EP01_chernobyl_night/EP01_Чернобыль_Рабочие_промпты.docx
+++ b/episodes/EP01_chernobyl_night/EP01_Чернобыль_Рабочие_промпты.docx
@@ -542,7 +542,7 @@
         <w:keepNext/>
       </w:pPr>
       <w:r>
-        <w:t xml:space="preserve">3.2. loc_control_room — блочный щит (клипы 02–05)</w:t>
+        <w:t xml:space="preserve">3.2. loc_turbine_hall — машинный зал (клип 02)</w:t>
       </w:r>
     </w:p>
     <w:p>
@@ -557,7 +557,7 @@
           <w:sz w:val="16"/>
           <w:szCs w:val="16"/>
         </w:rPr>
-        <w:t xml:space="preserve">Vertical 9:16 image of a Soviet nuclear power plant unit control room at night in 1986: long grey-green control desks with rows of switches, round analogue gauges and small indicator lamps, a large wall panel covered with a circular grid of small lamps, cold fluorescent ceiling light, linoleum floor, no windows. No people. Semi-realistic cinematic 3D/2.5D animation with a subtle painterly texture, natural motivated lighting, atmospheric depth. No text, no letters, no labels with readable writing, no logos, no watermark.</w:t>
+        <w:t xml:space="preserve">Vertical 9:16 image of the vast turbine hall of a Soviet nuclear power plant at night in 1986: giant rounded turbine and generator casings in a long row, thick pipes, metal walkways and railings, overhead cranes high above, dim yellowish ceiling lamps disappearing into darkness, light steam haze. No people. Semi-realistic cinematic 3D/2.5D animation with a subtle painterly texture, atmospheric depth. No text, no letters, no labels with readable writing, no logos, no watermark.</w:t>
       </w:r>
     </w:p>
     <w:p>
@@ -566,7 +566,7 @@
         <w:keepNext/>
       </w:pPr>
       <w:r>
-        <w:t xml:space="preserve">3.3. loc_pripyat_street — улица Припяти (клипы 10–12)</w:t>
+        <w:t xml:space="preserve">3.3. loc_reactor_hall — центральный зал реактора (клипы 03, 05)</w:t>
       </w:r>
     </w:p>
     <w:p>
@@ -581,7 +581,7 @@
           <w:sz w:val="16"/>
           <w:szCs w:val="16"/>
         </w:rPr>
-        <w:t xml:space="preserve">Vertical 9:16 image of a residential street in a young Soviet city in April 1986: nine- and sixteen-storey white panel apartment blocks, wide pavements, young poplar trees with first green leaves, a bus stop shelter, simple street lamps, early morning soft light. No people, no cars. Semi-realistic cinematic 3D/2.5D animation with a subtle painterly texture, natural lighting. No text, no letters, no signs with readable writing, no logos, no watermark.</w:t>
+        <w:t xml:space="preserve">Vertical 9:16 image of the central reactor hall of a Soviet RBMK nuclear power plant in 1986: a vast high concrete hall, a huge round floor made of hundreds of small square metal caps in a tight grid over the reactor, a massive refuelling machine standing on rails above the floor, cold spotlights from the high ceiling, a red warning lamp on the wall. No people. Semi-realistic cinematic 3D/2.5D animation with a subtle painterly texture, atmospheric depth. No text, no letters, no labels with readable writing, no logos, no watermark.</w:t>
       </w:r>
     </w:p>
     <w:p>
@@ -590,7 +590,55 @@
         <w:keepNext/>
       </w:pPr>
       <w:r>
-        <w:t xml:space="preserve">3.4. ref_firefighter — пожарный 1986 (клипы 08, 09)</w:t>
+        <w:t xml:space="preserve">3.4. loc_control_room — блочный щит (клип 04)</w:t>
+      </w:r>
+    </w:p>
+    <w:p>
+      <w:pPr>
+        <w:shd w:fill="F2EFEA" w:color="auto" w:val="clear"/>
+        <w:spacing w:after="120"/>
+        <w:ind w:left="120" w:right="120"/>
+      </w:pPr>
+      <w:r>
+        <w:rPr>
+          <w:rFonts w:ascii="Consolas" w:cs="Consolas" w:eastAsia="Consolas" w:hAnsi="Consolas"/>
+          <w:sz w:val="16"/>
+          <w:szCs w:val="16"/>
+        </w:rPr>
+        <w:t xml:space="preserve">Vertical 9:16 image of a Soviet nuclear power plant unit control room at night in 1986: long grey-green control desks with rows of switches, round analogue gauges and small indicator lamps, a large wall panel covered with a circular grid of small lamps, cold fluorescent ceiling light, linoleum floor, no windows. No people. Semi-realistic cinematic 3D/2.5D animation with a subtle painterly texture, natural motivated lighting, atmospheric depth. No text, no letters, no labels with readable writing, no logos, no watermark.</w:t>
+      </w:r>
+    </w:p>
+    <w:p>
+      <w:pPr>
+        <w:pStyle w:val="Heading2"/>
+        <w:keepNext/>
+      </w:pPr>
+      <w:r>
+        <w:t xml:space="preserve">3.5. loc_pripyat_street — улица Припяти (клипы 10–12)</w:t>
+      </w:r>
+    </w:p>
+    <w:p>
+      <w:pPr>
+        <w:shd w:fill="F2EFEA" w:color="auto" w:val="clear"/>
+        <w:spacing w:after="120"/>
+        <w:ind w:left="120" w:right="120"/>
+      </w:pPr>
+      <w:r>
+        <w:rPr>
+          <w:rFonts w:ascii="Consolas" w:cs="Consolas" w:eastAsia="Consolas" w:hAnsi="Consolas"/>
+          <w:sz w:val="16"/>
+          <w:szCs w:val="16"/>
+        </w:rPr>
+        <w:t xml:space="preserve">Vertical 9:16 image of a residential street in a young Soviet city in April 1986: nine- and sixteen-storey white panel apartment blocks, wide pavements, young poplar trees with first green leaves, a bus stop shelter, simple street lamps, early morning soft light. No people, no cars. Semi-realistic cinematic 3D/2.5D animation with a subtle painterly texture, natural lighting. No text, no letters, no signs with readable writing, no logos, no watermark.</w:t>
+      </w:r>
+    </w:p>
+    <w:p>
+      <w:pPr>
+        <w:pStyle w:val="Heading2"/>
+        <w:keepNext/>
+      </w:pPr>
+      <w:r>
+        <w:t xml:space="preserve">3.6. ref_firefighter — пожарный 1986 (клипы 08, 09)</w:t>
       </w:r>
     </w:p>
     <w:p>
@@ -2677,7 +2725,7 @@
         <w:t xml:space="preserve">Вставить в Ingredients:</w:t>
       </w:r>
       <w:r>
-        <w:t xml:space="preserve"> @Vera (персонаж) + @loc_control_room.png   </w:t>
+        <w:t xml:space="preserve"> @Vera (персонаж) + @loc_turbine_hall.png   </w:t>
       </w:r>
       <w:r>
         <w:rPr>
@@ -2702,52 +2750,52 @@
           <w:sz w:val="16"/>
           <w:szCs w:val="16"/>
         </w:rPr>
-        <w:t xml:space="preserve">[STYLE — MOST IMPORTANT] Stylized 3D animated feature-film look with a hand-painted, painterly texture — exactly the same drawn, illustrated style as the @Vera character images. Soft painted shading, slightly simplified stylized forms, smooth painted skin without pores, visible brush-like texture in hair, clothes and background. This is an animated cartoon-film frame, NOT live action, NOT a photograph, NOT photorealistic, NOT a real human actor. Mood: uneasy, claustrophobic, quietly wrong — an ordinary night shift that feels like the calm before a disaster.</w:t>
-      </w:r>
-    </w:p>
-    <w:p>
-      <w:pPr>
-        <w:shd w:fill="F2EFEA" w:color="auto" w:val="clear"/>
-        <w:spacing w:after="0"/>
-        <w:ind w:left="120" w:right="120"/>
-      </w:pPr>
-      <w:r>
-        <w:rPr>
-          <w:rFonts w:ascii="Consolas" w:cs="Consolas" w:eastAsia="Consolas" w:hAnsi="Consolas"/>
-          <w:sz w:val="16"/>
-          <w:szCs w:val="16"/>
-        </w:rPr>
-        <w:t xml:space="preserve">[SCENE] Immersion: Vera moves through the dim unit 4 control room during the night shift; nobody sees her, and something feels wrong.</w:t>
-      </w:r>
-    </w:p>
-    <w:p>
-      <w:pPr>
-        <w:shd w:fill="F2EFEA" w:color="auto" w:val="clear"/>
-        <w:spacing w:after="0"/>
-        <w:ind w:left="120" w:right="120"/>
-      </w:pPr>
-      <w:r>
-        <w:rPr>
-          <w:rFonts w:ascii="Consolas" w:cs="Consolas" w:eastAsia="Consolas" w:hAnsi="Consolas"/>
-          <w:sz w:val="16"/>
-          <w:szCs w:val="16"/>
-        </w:rPr>
-        <w:t xml:space="preserve">[REFERENCES] Vera is the character @Vera — keep her face, body, outfit, art style and voice exactly as in the character images, in every frame. Do not make her more realistic than the character images. Use @loc_control_room as the setting, painted in the same animated style.</w:t>
-      </w:r>
-    </w:p>
-    <w:p>
-      <w:pPr>
-        <w:shd w:fill="F2EFEA" w:color="auto" w:val="clear"/>
-        <w:spacing w:after="0"/>
-        <w:ind w:left="120" w:right="120"/>
-      </w:pPr>
-      <w:r>
-        <w:rPr>
-          <w:rFonts w:ascii="Consolas" w:cs="Consolas" w:eastAsia="Consolas" w:hAnsi="Consolas"/>
-          <w:sz w:val="16"/>
-          <w:szCs w:val="16"/>
-        </w:rPr>
-        <w:t xml:space="preserve">[VERA] Vera is the main character and stays clearly visible from the first to the last frame, face readable. She walks slowly along the control desks toward the camera, looking at the operators with a worried frown, then stops and turns her face to the lens. Long dark worn coat, wine-red scarf, brass compass-rose brooch, dark waistcoat, light shirt.</w:t>
+        <w:t xml:space="preserve">[STYLE — MOST IMPORTANT] Stylized 3D animated feature-film look with a hand-painted, painterly texture — exactly the same drawn, illustrated style as the @Vera character images. Soft painted shading, slightly simplified stylized forms, smooth painted skin without pores, visible brush-like texture in hair, clothes and background. This is an animated cartoon-film frame, NOT live action, NOT a photograph, NOT photorealistic, NOT a real human actor. Mood: uneasy, oppressive, quietly wrong — an ordinary night shift that feels like the calm before a disaster.</w:t>
+      </w:r>
+    </w:p>
+    <w:p>
+      <w:pPr>
+        <w:shd w:fill="F2EFEA" w:color="auto" w:val="clear"/>
+        <w:spacing w:after="0"/>
+        <w:ind w:left="120" w:right="120"/>
+      </w:pPr>
+      <w:r>
+        <w:rPr>
+          <w:rFonts w:ascii="Consolas" w:cs="Consolas" w:eastAsia="Consolas" w:hAnsi="Consolas"/>
+          <w:sz w:val="16"/>
+          <w:szCs w:val="16"/>
+        </w:rPr>
+        <w:t xml:space="preserve">[SCENE] Immersion: Vera walks through the vast, dim turbine hall of unit 4 where the night test is being prepared; nobody sees her.</w:t>
+      </w:r>
+    </w:p>
+    <w:p>
+      <w:pPr>
+        <w:shd w:fill="F2EFEA" w:color="auto" w:val="clear"/>
+        <w:spacing w:after="0"/>
+        <w:ind w:left="120" w:right="120"/>
+      </w:pPr>
+      <w:r>
+        <w:rPr>
+          <w:rFonts w:ascii="Consolas" w:cs="Consolas" w:eastAsia="Consolas" w:hAnsi="Consolas"/>
+          <w:sz w:val="16"/>
+          <w:szCs w:val="16"/>
+        </w:rPr>
+        <w:t xml:space="preserve">[REFERENCES] Vera is the character @Vera — keep her face, body, outfit, art style and voice exactly as in the character images, in every frame. Do not make her more realistic than the character images. Use @loc_turbine_hall as the setting, painted in the same animated style.</w:t>
+      </w:r>
+    </w:p>
+    <w:p>
+      <w:pPr>
+        <w:shd w:fill="F2EFEA" w:color="auto" w:val="clear"/>
+        <w:spacing w:after="0"/>
+        <w:ind w:left="120" w:right="120"/>
+      </w:pPr>
+      <w:r>
+        <w:rPr>
+          <w:rFonts w:ascii="Consolas" w:cs="Consolas" w:eastAsia="Consolas" w:hAnsi="Consolas"/>
+          <w:sz w:val="16"/>
+          <w:szCs w:val="16"/>
+        </w:rPr>
+        <w:t xml:space="preserve">[VERA] Vera is the main character and stays clearly visible from the first to the last frame, face readable. She walks slowly along the giant turbine toward the camera, glancing up at it with a worried frown, then stops and turns her face to the lens. Long dark worn coat, wine-red scarf, brass compass-rose brooch, dark waistcoat, light shirt.</w:t>
       </w:r>
     </w:p>
     <w:p>
@@ -2777,67 +2825,67 @@
           <w:sz w:val="16"/>
           <w:szCs w:val="16"/>
         </w:rPr>
-        <w:t xml:space="preserve">[BACKGROUND ACTION — constant, unsettling movement] Behind her the night shift works under buzzing fluorescent tubes, one of them flickering: an operator in a white coat hurries past with a thick logbook, another turns heavy switches, another listens to a desk telephone with a tense face without audible words; a recorder pen scratches across scrolling paper; rows of indicator lamps blink in an irregular rhythm across the circular wall panel; long shadows of the operators slide across the wall.</w:t>
-      </w:r>
-    </w:p>
-    <w:p>
-      <w:pPr>
-        <w:shd w:fill="F2EFEA" w:color="auto" w:val="clear"/>
-        <w:spacing w:after="0"/>
-        <w:ind w:left="120" w:right="120"/>
-      </w:pPr>
-      <w:r>
-        <w:rPr>
-          <w:rFonts w:ascii="Consolas" w:cs="Consolas" w:eastAsia="Consolas" w:hAnsi="Consolas"/>
-          <w:sz w:val="16"/>
-          <w:szCs w:val="16"/>
-        </w:rPr>
-        <w:t xml:space="preserve">[SETTING &amp; ERA] Night of 26 April 1986, about 1 a.m., unit 4 control room of the Chernobyl plant, long grey-green control desks, no windows.</w:t>
-      </w:r>
-    </w:p>
-    <w:p>
-      <w:pPr>
-        <w:shd w:fill="F2EFEA" w:color="auto" w:val="clear"/>
-        <w:spacing w:after="0"/>
-        <w:ind w:left="120" w:right="120"/>
-      </w:pPr>
-      <w:r>
-        <w:rPr>
-          <w:rFonts w:ascii="Consolas" w:cs="Consolas" w:eastAsia="Consolas" w:hAnsi="Consolas"/>
-          <w:sz w:val="16"/>
-          <w:szCs w:val="16"/>
-        </w:rPr>
-        <w:t xml:space="preserve">[CAMERA] Slow dolly moving backward in front of Vera; slightly low angle, the long room stretching into darkness behind her. Vertical 9:16, Vera and the action both clearly visible.</w:t>
-      </w:r>
-    </w:p>
-    <w:p>
-      <w:pPr>
-        <w:shd w:fill="F2EFEA" w:color="auto" w:val="clear"/>
-        <w:spacing w:after="0"/>
-        <w:ind w:left="120" w:right="120"/>
-      </w:pPr>
-      <w:r>
-        <w:rPr>
-          <w:rFonts w:ascii="Consolas" w:cs="Consolas" w:eastAsia="Consolas" w:hAnsi="Consolas"/>
-          <w:sz w:val="16"/>
-          <w:szCs w:val="16"/>
-        </w:rPr>
-        <w:t xml:space="preserve">[LIGHT] Cold greenish fluorescent light with one flickering tube, deep shadows in the corners, small red and amber lamps glowing like eyes — stylized, soft, like an animated film.</w:t>
-      </w:r>
-    </w:p>
-    <w:p>
-      <w:pPr>
-        <w:shd w:fill="F2EFEA" w:color="auto" w:val="clear"/>
-        <w:spacing w:after="0"/>
-        <w:ind w:left="120" w:right="120"/>
-      </w:pPr>
-      <w:r>
-        <w:rPr>
-          <w:rFonts w:ascii="Consolas" w:cs="Consolas" w:eastAsia="Consolas" w:hAnsi="Consolas"/>
-          <w:sz w:val="16"/>
-          <w:szCs w:val="16"/>
-        </w:rPr>
-        <w:t xml:space="preserve">[AUDIO] Only Vera's Russian line in her character voice, plus eerie ambient sound: electrical hum, buzzing flickering tube, relay clicks, scratching recorder, a telephone ringing once and stopping.</w:t>
+        <w:t xml:space="preserve">[BACKGROUND ACTION — constant, unsettling movement] Behind her the enormous turbine hall stretches into darkness: a huge turbogenerator casing hums and vibrates, steam leaks from a pipe joint in thin white jets; two workers in white coats and hard hats check gauges and write in a logbook; an overhead crane hook sways slowly high above; rows of ceiling lamps flicker one by one into the distance; long shadows crawl across the floor.</w:t>
+      </w:r>
+    </w:p>
+    <w:p>
+      <w:pPr>
+        <w:shd w:fill="F2EFEA" w:color="auto" w:val="clear"/>
+        <w:spacing w:after="0"/>
+        <w:ind w:left="120" w:right="120"/>
+      </w:pPr>
+      <w:r>
+        <w:rPr>
+          <w:rFonts w:ascii="Consolas" w:cs="Consolas" w:eastAsia="Consolas" w:hAnsi="Consolas"/>
+          <w:sz w:val="16"/>
+          <w:szCs w:val="16"/>
+        </w:rPr>
+        <w:t xml:space="preserve">[SETTING &amp; ERA] Night of 26 April 1986, about 1 a.m., turbine hall of unit 4 of the Chernobyl plant: giant rounded turbine and generator casings, thick pipes, metal walkways, overhead cranes, no windows.</w:t>
+      </w:r>
+    </w:p>
+    <w:p>
+      <w:pPr>
+        <w:shd w:fill="F2EFEA" w:color="auto" w:val="clear"/>
+        <w:spacing w:after="0"/>
+        <w:ind w:left="120" w:right="120"/>
+      </w:pPr>
+      <w:r>
+        <w:rPr>
+          <w:rFonts w:ascii="Consolas" w:cs="Consolas" w:eastAsia="Consolas" w:hAnsi="Consolas"/>
+          <w:sz w:val="16"/>
+          <w:szCs w:val="16"/>
+        </w:rPr>
+        <w:t xml:space="preserve">[CAMERA] Slow dolly moving backward in front of Vera; low angle, the turbine towering beside her and the hall vanishing into darkness behind. Vertical 9:16, Vera and the action both clearly visible.</w:t>
+      </w:r>
+    </w:p>
+    <w:p>
+      <w:pPr>
+        <w:shd w:fill="F2EFEA" w:color="auto" w:val="clear"/>
+        <w:spacing w:after="0"/>
+        <w:ind w:left="120" w:right="120"/>
+      </w:pPr>
+      <w:r>
+        <w:rPr>
+          <w:rFonts w:ascii="Consolas" w:cs="Consolas" w:eastAsia="Consolas" w:hAnsi="Consolas"/>
+          <w:sz w:val="16"/>
+          <w:szCs w:val="16"/>
+        </w:rPr>
+        <w:t xml:space="preserve">[LIGHT] Dim yellowish ceiling lamps, some flickering, deep shadows between the machines, cold blue haze of steam — stylized, soft, like an animated film.</w:t>
+      </w:r>
+    </w:p>
+    <w:p>
+      <w:pPr>
+        <w:shd w:fill="F2EFEA" w:color="auto" w:val="clear"/>
+        <w:spacing w:after="0"/>
+        <w:ind w:left="120" w:right="120"/>
+      </w:pPr>
+      <w:r>
+        <w:rPr>
+          <w:rFonts w:ascii="Consolas" w:cs="Consolas" w:eastAsia="Consolas" w:hAnsi="Consolas"/>
+          <w:sz w:val="16"/>
+          <w:szCs w:val="16"/>
+        </w:rPr>
+        <w:t xml:space="preserve">[AUDIO] Only Vera's Russian line in her character voice, plus eerie ambient sound: a deep mechanical drone of the turbine, hissing steam, metallic ticking, footsteps echoing in the huge hall.</w:t>
       </w:r>
     </w:p>
     <w:p>
@@ -2867,7 +2915,7 @@
           <w:sz w:val="16"/>
           <w:szCs w:val="16"/>
         </w:rPr>
-        <w:t xml:space="preserve">[STYLE REMINDER] Whole clip in the same stylized painterly 3D animation style as the @Vera character images, not realistic; all other people are stylized animated characters too; uneasy, claustrophobic mood.</w:t>
+        <w:t xml:space="preserve">[STYLE REMINDER] Whole clip in the same stylized painterly 3D animation style as the @Vera character images, not realistic; all other people are stylized animated characters too; oppressive, uneasy mood.</w:t>
       </w:r>
     </w:p>
     <w:p>
@@ -2892,7 +2940,7 @@
         <w:t xml:space="preserve">Вставить в Ingredients:</w:t>
       </w:r>
       <w:r>
-        <w:t xml:space="preserve"> @Vera (персонаж) + @loc_control_room.png   </w:t>
+        <w:t xml:space="preserve"> @Vera (персонаж) + @loc_reactor_hall.png   </w:t>
       </w:r>
       <w:r>
         <w:rPr>
@@ -2917,52 +2965,52 @@
           <w:sz w:val="16"/>
           <w:szCs w:val="16"/>
         </w:rPr>
-        <w:t xml:space="preserve">[STYLE — MOST IMPORTANT] Stylized 3D animated feature-film look with a hand-painted, painterly texture — exactly the same drawn, illustrated style as the @Vera character images. Soft painted shading, slightly simplified stylized forms, smooth painted skin without pores, visible brush-like texture in hair, clothes and background. This is an animated cartoon-film frame, NOT live action, NOT a photograph, NOT photorealistic, NOT a real human actor. Mood: growing dread, tension tightening like a wire.</w:t>
-      </w:r>
-    </w:p>
-    <w:p>
-      <w:pPr>
-        <w:shd w:fill="F2EFEA" w:color="auto" w:val="clear"/>
-        <w:spacing w:after="0"/>
-        <w:ind w:left="120" w:right="120"/>
-      </w:pPr>
-      <w:r>
-        <w:rPr>
-          <w:rFonts w:ascii="Consolas" w:cs="Consolas" w:eastAsia="Consolas" w:hAnsi="Consolas"/>
-          <w:sz w:val="16"/>
-          <w:szCs w:val="16"/>
-        </w:rPr>
-        <w:t xml:space="preserve">[SCENE] Rising tension: warning signals multiply in the control room behind Vera while she explains the danger in a low voice.</w:t>
-      </w:r>
-    </w:p>
-    <w:p>
-      <w:pPr>
-        <w:shd w:fill="F2EFEA" w:color="auto" w:val="clear"/>
-        <w:spacing w:after="0"/>
-        <w:ind w:left="120" w:right="120"/>
-      </w:pPr>
-      <w:r>
-        <w:rPr>
-          <w:rFonts w:ascii="Consolas" w:cs="Consolas" w:eastAsia="Consolas" w:hAnsi="Consolas"/>
-          <w:sz w:val="16"/>
-          <w:szCs w:val="16"/>
-        </w:rPr>
-        <w:t xml:space="preserve">[REFERENCES] Vera is the character @Vera — keep her face, body, outfit, art style and voice exactly as in the character images, in every frame. Do not make her more realistic than the character images. Use @loc_control_room as the setting, painted in the same animated style.</w:t>
-      </w:r>
-    </w:p>
-    <w:p>
-      <w:pPr>
-        <w:shd w:fill="F2EFEA" w:color="auto" w:val="clear"/>
-        <w:spacing w:after="0"/>
-        <w:ind w:left="120" w:right="120"/>
-      </w:pPr>
-      <w:r>
-        <w:rPr>
-          <w:rFonts w:ascii="Consolas" w:cs="Consolas" w:eastAsia="Consolas" w:hAnsi="Consolas"/>
-          <w:sz w:val="16"/>
-          <w:szCs w:val="16"/>
-        </w:rPr>
-        <w:t xml:space="preserve">[VERA] Vera is the main character and stays clearly visible from the first to the last frame, face readable. She stands in a medium close-up facing the camera, very still while the room behind her grows restless; once she glances back at a flashing panel, then looks into the lens again, pale and serious. Long dark worn coat, wine-red scarf, brass compass-rose brooch, dark waistcoat, light shirt.</w:t>
+        <w:t xml:space="preserve">[STYLE — MOST IMPORTANT] Stylized 3D animated feature-film look with a hand-painted, painterly texture — exactly the same drawn, illustrated style as the @Vera character images. Soft painted shading, slightly simplified stylized forms, smooth painted skin without pores, visible brush-like texture in hair, clothes and background. This is an animated cartoon-film frame, NOT live action, NOT a photograph, NOT photorealistic, NOT a real human actor. Mood: silent dread, a sleeping giant under her feet.</w:t>
+      </w:r>
+    </w:p>
+    <w:p>
+      <w:pPr>
+        <w:shd w:fill="F2EFEA" w:color="auto" w:val="clear"/>
+        <w:spacing w:after="0"/>
+        <w:ind w:left="120" w:right="120"/>
+      </w:pPr>
+      <w:r>
+        <w:rPr>
+          <w:rFonts w:ascii="Consolas" w:cs="Consolas" w:eastAsia="Consolas" w:hAnsi="Consolas"/>
+          <w:sz w:val="16"/>
+          <w:szCs w:val="16"/>
+        </w:rPr>
+        <w:t xml:space="preserve">[SCENE] Rising tension: Vera stands in the eerie, empty central hall right above the reactor and explains the danger in a low voice.</w:t>
+      </w:r>
+    </w:p>
+    <w:p>
+      <w:pPr>
+        <w:shd w:fill="F2EFEA" w:color="auto" w:val="clear"/>
+        <w:spacing w:after="0"/>
+        <w:ind w:left="120" w:right="120"/>
+      </w:pPr>
+      <w:r>
+        <w:rPr>
+          <w:rFonts w:ascii="Consolas" w:cs="Consolas" w:eastAsia="Consolas" w:hAnsi="Consolas"/>
+          <w:sz w:val="16"/>
+          <w:szCs w:val="16"/>
+        </w:rPr>
+        <w:t xml:space="preserve">[REFERENCES] Vera is the character @Vera — keep her face, body, outfit, art style and voice exactly as in the character images, in every frame. Do not make her more realistic than the character images. Use @loc_reactor_hall as the setting, painted in the same animated style.</w:t>
+      </w:r>
+    </w:p>
+    <w:p>
+      <w:pPr>
+        <w:shd w:fill="F2EFEA" w:color="auto" w:val="clear"/>
+        <w:spacing w:after="0"/>
+        <w:ind w:left="120" w:right="120"/>
+      </w:pPr>
+      <w:r>
+        <w:rPr>
+          <w:rFonts w:ascii="Consolas" w:cs="Consolas" w:eastAsia="Consolas" w:hAnsi="Consolas"/>
+          <w:sz w:val="16"/>
+          <w:szCs w:val="16"/>
+        </w:rPr>
+        <w:t xml:space="preserve">[VERA] Vera is the main character and stays clearly visible from the first to the last frame, face readable. She stands in a medium shot on the round metal floor above the reactor, facing the camera; she looks down at the floor under her feet once, then back into the lens, pale and serious. Long dark worn coat, wine-red scarf, brass compass-rose brooch, dark waistcoat, light shirt.</w:t>
       </w:r>
     </w:p>
     <w:p>
@@ -2992,67 +3040,67 @@
           <w:sz w:val="16"/>
           <w:szCs w:val="16"/>
         </w:rPr>
-        <w:t xml:space="preserve">[BACKGROUND ACTION — constant, unsettling movement] Behind her more and more warning lamps light up one by one across the wall panel like spreading red eyes; a recorder pen jerks into wild zigzags; two operators lean over the desk arguing with sharp gestures without audible words; a third runs from one desk to another; a gauge needle trembles and slowly climbs.</w:t>
-      </w:r>
-    </w:p>
-    <w:p>
-      <w:pPr>
-        <w:shd w:fill="F2EFEA" w:color="auto" w:val="clear"/>
-        <w:spacing w:after="0"/>
-        <w:ind w:left="120" w:right="120"/>
-      </w:pPr>
-      <w:r>
-        <w:rPr>
-          <w:rFonts w:ascii="Consolas" w:cs="Consolas" w:eastAsia="Consolas" w:hAnsi="Consolas"/>
-          <w:sz w:val="16"/>
-          <w:szCs w:val="16"/>
-        </w:rPr>
-        <w:t xml:space="preserve">[SETTING &amp; ERA] Night of 26 April 1986, about 1:20 a.m., unit 4 control room, Chernobyl plant.</w:t>
-      </w:r>
-    </w:p>
-    <w:p>
-      <w:pPr>
-        <w:shd w:fill="F2EFEA" w:color="auto" w:val="clear"/>
-        <w:spacing w:after="0"/>
-        <w:ind w:left="120" w:right="120"/>
-      </w:pPr>
-      <w:r>
-        <w:rPr>
-          <w:rFonts w:ascii="Consolas" w:cs="Consolas" w:eastAsia="Consolas" w:hAnsi="Consolas"/>
-          <w:sz w:val="16"/>
-          <w:szCs w:val="16"/>
-        </w:rPr>
-        <w:t xml:space="preserve">[CAMERA] Slow, slightly unsteady handheld push-in toward Vera; the busy room behind her stays in focus. Vertical 9:16, Vera and the action both clearly visible.</w:t>
-      </w:r>
-    </w:p>
-    <w:p>
-      <w:pPr>
-        <w:shd w:fill="F2EFEA" w:color="auto" w:val="clear"/>
-        <w:spacing w:after="0"/>
-        <w:ind w:left="120" w:right="120"/>
-      </w:pPr>
-      <w:r>
-        <w:rPr>
-          <w:rFonts w:ascii="Consolas" w:cs="Consolas" w:eastAsia="Consolas" w:hAnsi="Consolas"/>
-          <w:sz w:val="16"/>
-          <w:szCs w:val="16"/>
-        </w:rPr>
-        <w:t xml:space="preserve">[LIGHT] Cold fluorescent light, more and more amber and red warning lamps reflecting on her face, shadows deepening — stylized, soft, like an animated film.</w:t>
-      </w:r>
-    </w:p>
-    <w:p>
-      <w:pPr>
-        <w:shd w:fill="F2EFEA" w:color="auto" w:val="clear"/>
-        <w:spacing w:after="0"/>
-        <w:ind w:left="120" w:right="120"/>
-      </w:pPr>
-      <w:r>
-        <w:rPr>
-          <w:rFonts w:ascii="Consolas" w:cs="Consolas" w:eastAsia="Consolas" w:hAnsi="Consolas"/>
-          <w:sz w:val="16"/>
-          <w:szCs w:val="16"/>
-        </w:rPr>
-        <w:t xml:space="preserve">[AUDIO] Only Vera's Russian line in her character voice, plus eerie ambient sound: low electrical hum rising slowly in pitch, irregular warning beeps getting faster, scratching recorder.</w:t>
+        <w:t xml:space="preserve">[BACKGROUND ACTION — constant, unsettling movement] Around and behind her stretches the huge round reactor floor made of hundreds of small square metal caps in a tight grid; a faint warm haze shimmers above them; a massive refuelling machine stands like a sleeping giant on its rails; a red warning lamp on the wall slowly blinks; a few caps start to tremble almost invisibly; dust drifts in the light beams from the high ceiling.</w:t>
+      </w:r>
+    </w:p>
+    <w:p>
+      <w:pPr>
+        <w:shd w:fill="F2EFEA" w:color="auto" w:val="clear"/>
+        <w:spacing w:after="0"/>
+        <w:ind w:left="120" w:right="120"/>
+      </w:pPr>
+      <w:r>
+        <w:rPr>
+          <w:rFonts w:ascii="Consolas" w:cs="Consolas" w:eastAsia="Consolas" w:hAnsi="Consolas"/>
+          <w:sz w:val="16"/>
+          <w:szCs w:val="16"/>
+        </w:rPr>
+        <w:t xml:space="preserve">[SETTING &amp; ERA] Night of 26 April 1986, about 1:20 a.m., central reactor hall of unit 4, Chernobyl plant: a vast high hall, the round floor of metal caps over the reactor, a large refuelling machine on rails, high concrete walls.</w:t>
+      </w:r>
+    </w:p>
+    <w:p>
+      <w:pPr>
+        <w:shd w:fill="F2EFEA" w:color="auto" w:val="clear"/>
+        <w:spacing w:after="0"/>
+        <w:ind w:left="120" w:right="120"/>
+      </w:pPr>
+      <w:r>
+        <w:rPr>
+          <w:rFonts w:ascii="Consolas" w:cs="Consolas" w:eastAsia="Consolas" w:hAnsi="Consolas"/>
+          <w:sz w:val="16"/>
+          <w:szCs w:val="16"/>
+        </w:rPr>
+        <w:t xml:space="preserve">[CAMERA] Slow creeping push-in toward Vera from a slightly high angle, showing the grid of caps around her. Vertical 9:16, Vera and the action both clearly visible.</w:t>
+      </w:r>
+    </w:p>
+    <w:p>
+      <w:pPr>
+        <w:shd w:fill="F2EFEA" w:color="auto" w:val="clear"/>
+        <w:spacing w:after="0"/>
+        <w:ind w:left="120" w:right="120"/>
+      </w:pPr>
+      <w:r>
+        <w:rPr>
+          <w:rFonts w:ascii="Consolas" w:cs="Consolas" w:eastAsia="Consolas" w:hAnsi="Consolas"/>
+          <w:sz w:val="16"/>
+          <w:szCs w:val="16"/>
+        </w:rPr>
+        <w:t xml:space="preserve">[LIGHT] Cold high spotlights from the ceiling, long shadows on the grid of caps, a slow red pulse of the warning lamp on her face — stylized, soft, like an animated film.</w:t>
+      </w:r>
+    </w:p>
+    <w:p>
+      <w:pPr>
+        <w:shd w:fill="F2EFEA" w:color="auto" w:val="clear"/>
+        <w:spacing w:after="0"/>
+        <w:ind w:left="120" w:right="120"/>
+      </w:pPr>
+      <w:r>
+        <w:rPr>
+          <w:rFonts w:ascii="Consolas" w:cs="Consolas" w:eastAsia="Consolas" w:hAnsi="Consolas"/>
+          <w:sz w:val="16"/>
+          <w:szCs w:val="16"/>
+        </w:rPr>
+        <w:t xml:space="preserve">[AUDIO] Only Vera's Russian line in her character voice, plus eerie ambient sound: a deep low hum coming from under the floor, a faint metallic chatter of trembling caps, a slow beeping warning signal.</w:t>
       </w:r>
     </w:p>
     <w:p>
@@ -3082,7 +3130,7 @@
           <w:sz w:val="16"/>
           <w:szCs w:val="16"/>
         </w:rPr>
-        <w:t xml:space="preserve">[STYLE REMINDER] Whole clip in the same stylized painterly 3D animation style as the @Vera character images, not realistic; all other people are stylized animated characters too; growing dread.</w:t>
+        <w:t xml:space="preserve">[STYLE REMINDER] Whole clip in the same stylized painterly 3D animation style as the @Vera character images, not realistic; all other people are stylized animated characters too; silent dread.</w:t>
       </w:r>
     </w:p>
     <w:p>
@@ -3322,7 +3370,7 @@
         <w:t xml:space="preserve">Вставить в Ingredients:</w:t>
       </w:r>
       <w:r>
-        <w:t xml:space="preserve"> @Vera (персонаж) + @loc_control_room.png   </w:t>
+        <w:t xml:space="preserve"> @Vera (персонаж) + @loc_reactor_hall.png   </w:t>
       </w:r>
       <w:r>
         <w:rPr>
@@ -3347,52 +3395,52 @@
           <w:sz w:val="16"/>
           <w:szCs w:val="16"/>
         </w:rPr>
-        <w:t xml:space="preserve">[STYLE — MOST IMPORTANT] Stylized 3D animated feature-film look with a hand-painted, painterly texture — exactly the same drawn, illustrated style as the @Vera character images. Soft painted shading, slightly simplified stylized forms, smooth painted skin without pores, visible brush-like texture in hair, clothes and background. This is an animated cartoon-film frame, NOT live action, NOT a photograph, NOT photorealistic, NOT a real human actor. Mood: panic and terror as the room starts to fail around her.</w:t>
-      </w:r>
-    </w:p>
-    <w:p>
-      <w:pPr>
-        <w:shd w:fill="F2EFEA" w:color="auto" w:val="clear"/>
-        <w:spacing w:after="0"/>
-        <w:ind w:left="120" w:right="120"/>
-      </w:pPr>
-      <w:r>
-        <w:rPr>
-          <w:rFonts w:ascii="Consolas" w:cs="Consolas" w:eastAsia="Consolas" w:hAnsi="Consolas"/>
-          <w:sz w:val="16"/>
-          <w:szCs w:val="16"/>
-        </w:rPr>
-        <w:t xml:space="preserve">[SCENE] Escalation: the control room shakes violently as the power surges; Vera speaks while holding on.</w:t>
-      </w:r>
-    </w:p>
-    <w:p>
-      <w:pPr>
-        <w:shd w:fill="F2EFEA" w:color="auto" w:val="clear"/>
-        <w:spacing w:after="0"/>
-        <w:ind w:left="120" w:right="120"/>
-      </w:pPr>
-      <w:r>
-        <w:rPr>
-          <w:rFonts w:ascii="Consolas" w:cs="Consolas" w:eastAsia="Consolas" w:hAnsi="Consolas"/>
-          <w:sz w:val="16"/>
-          <w:szCs w:val="16"/>
-        </w:rPr>
-        <w:t xml:space="preserve">[REFERENCES] Vera is the character @Vera — keep her face, body, outfit, art style and voice exactly as in the character images, in every frame. Do not make her more realistic than the character images. Use @loc_control_room as the setting, painted in the same animated style.</w:t>
-      </w:r>
-    </w:p>
-    <w:p>
-      <w:pPr>
-        <w:shd w:fill="F2EFEA" w:color="auto" w:val="clear"/>
-        <w:spacing w:after="0"/>
-        <w:ind w:left="120" w:right="120"/>
-      </w:pPr>
-      <w:r>
-        <w:rPr>
-          <w:rFonts w:ascii="Consolas" w:cs="Consolas" w:eastAsia="Consolas" w:hAnsi="Consolas"/>
-          <w:sz w:val="16"/>
-          <w:szCs w:val="16"/>
-        </w:rPr>
-        <w:t xml:space="preserve">[VERA] Vera is the main character and stays clearly visible from the first to the last frame, face readable. She staggers, grabs the edge of a control desk, steadies herself and speaks to the camera, frightened, eyes darting to the ceiling. Long dark worn coat, wine-red scarf, brass compass-rose brooch, dark waistcoat, light shirt.</w:t>
+        <w:t xml:space="preserve">[STYLE — MOST IMPORTANT] Stylized 3D animated feature-film look with a hand-painted, painterly texture — exactly the same drawn, illustrated style as the @Vera character images. Soft painted shading, slightly simplified stylized forms, smooth painted skin without pores, visible brush-like texture in hair, clothes and background. This is an animated cartoon-film frame, NOT live action, NOT a photograph, NOT photorealistic, NOT a real human actor. Mood: panic and terror — the floor itself coming alive.</w:t>
+      </w:r>
+    </w:p>
+    <w:p>
+      <w:pPr>
+        <w:shd w:fill="F2EFEA" w:color="auto" w:val="clear"/>
+        <w:spacing w:after="0"/>
+        <w:ind w:left="120" w:right="120"/>
+      </w:pPr>
+      <w:r>
+        <w:rPr>
+          <w:rFonts w:ascii="Consolas" w:cs="Consolas" w:eastAsia="Consolas" w:hAnsi="Consolas"/>
+          <w:sz w:val="16"/>
+          <w:szCs w:val="16"/>
+        </w:rPr>
+        <w:t xml:space="preserve">[SCENE] Escalation: the power surges and the reactor floor under Vera comes alive — the metal caps start jumping.</w:t>
+      </w:r>
+    </w:p>
+    <w:p>
+      <w:pPr>
+        <w:shd w:fill="F2EFEA" w:color="auto" w:val="clear"/>
+        <w:spacing w:after="0"/>
+        <w:ind w:left="120" w:right="120"/>
+      </w:pPr>
+      <w:r>
+        <w:rPr>
+          <w:rFonts w:ascii="Consolas" w:cs="Consolas" w:eastAsia="Consolas" w:hAnsi="Consolas"/>
+          <w:sz w:val="16"/>
+          <w:szCs w:val="16"/>
+        </w:rPr>
+        <w:t xml:space="preserve">[REFERENCES] Vera is the character @Vera — keep her face, body, outfit, art style and voice exactly as in the character images, in every frame. Do not make her more realistic than the character images. Use @loc_reactor_hall as the setting, painted in the same animated style.</w:t>
+      </w:r>
+    </w:p>
+    <w:p>
+      <w:pPr>
+        <w:shd w:fill="F2EFEA" w:color="auto" w:val="clear"/>
+        <w:spacing w:after="0"/>
+        <w:ind w:left="120" w:right="120"/>
+      </w:pPr>
+      <w:r>
+        <w:rPr>
+          <w:rFonts w:ascii="Consolas" w:cs="Consolas" w:eastAsia="Consolas" w:hAnsi="Consolas"/>
+          <w:sz w:val="16"/>
+          <w:szCs w:val="16"/>
+        </w:rPr>
+        <w:t xml:space="preserve">[VERA] Vera is the main character and stays clearly visible from the first to the last frame, face readable. She staggers on the round reactor floor, catches her balance, looks down in terror and then speaks to the camera, breath catching. Long dark worn coat, wine-red scarf, brass compass-rose brooch, dark waistcoat, light shirt.</w:t>
       </w:r>
     </w:p>
     <w:p>
@@ -3422,82 +3470,82 @@
           <w:sz w:val="16"/>
           <w:szCs w:val="16"/>
         </w:rPr>
-        <w:t xml:space="preserve">[BACKGROUND ACTION — constant, unsettling movement] The whole room shakes: ceiling panels rattle and a few drop, plaster dust pours down in streams, fluorescent tubes flicker and one bursts in sparks, plunging part of the room into darkness; papers fly off the desks; operators stumble and shout without audible words; gauge needles slam to the limit.</w:t>
-      </w:r>
-    </w:p>
-    <w:p>
-      <w:pPr>
-        <w:shd w:fill="F2EFEA" w:color="auto" w:val="clear"/>
-        <w:spacing w:after="0"/>
-        <w:ind w:left="120" w:right="120"/>
-      </w:pPr>
-      <w:r>
-        <w:rPr>
-          <w:rFonts w:ascii="Consolas" w:cs="Consolas" w:eastAsia="Consolas" w:hAnsi="Consolas"/>
-          <w:sz w:val="16"/>
-          <w:szCs w:val="16"/>
-        </w:rPr>
-        <w:t xml:space="preserve">[SETTING &amp; ERA] Night of 26 April 1986, 1:23 a.m., unit 4 control room, Chernobyl plant.</w:t>
-      </w:r>
-    </w:p>
-    <w:p>
-      <w:pPr>
-        <w:shd w:fill="F2EFEA" w:color="auto" w:val="clear"/>
-        <w:spacing w:after="0"/>
-        <w:ind w:left="120" w:right="120"/>
-      </w:pPr>
-      <w:r>
-        <w:rPr>
-          <w:rFonts w:ascii="Consolas" w:cs="Consolas" w:eastAsia="Consolas" w:hAnsi="Consolas"/>
-          <w:sz w:val="16"/>
-          <w:szCs w:val="16"/>
-        </w:rPr>
-        <w:t xml:space="preserve">[CAMERA] Handheld medium shot with strong shaking in one direction, Vera kept centred. Vertical 9:16, Vera and the action both clearly visible.</w:t>
-      </w:r>
-    </w:p>
-    <w:p>
-      <w:pPr>
-        <w:shd w:fill="F2EFEA" w:color="auto" w:val="clear"/>
-        <w:spacing w:after="0"/>
-        <w:ind w:left="120" w:right="120"/>
-      </w:pPr>
-      <w:r>
-        <w:rPr>
-          <w:rFonts w:ascii="Consolas" w:cs="Consolas" w:eastAsia="Consolas" w:hAnsi="Consolas"/>
-          <w:sz w:val="16"/>
-          <w:szCs w:val="16"/>
-        </w:rPr>
-        <w:t xml:space="preserve">[LIGHT] Strobing fluorescent light and darkness, red alarm lamps, dust glowing in the beams — stylized, soft, like an animated film.</w:t>
-      </w:r>
-    </w:p>
-    <w:p>
-      <w:pPr>
-        <w:shd w:fill="F2EFEA" w:color="auto" w:val="clear"/>
-        <w:spacing w:after="0"/>
-        <w:ind w:left="120" w:right="120"/>
-      </w:pPr>
-      <w:r>
-        <w:rPr>
-          <w:rFonts w:ascii="Consolas" w:cs="Consolas" w:eastAsia="Consolas" w:hAnsi="Consolas"/>
-          <w:sz w:val="16"/>
-          <w:szCs w:val="16"/>
-        </w:rPr>
-        <w:t xml:space="preserve">[AUDIO] Only Vera's Russian line in her character voice, plus eerie ambient sound: a deep rising rumble like something huge waking up, rattling metal, alarm, glass popping.</w:t>
-      </w:r>
-    </w:p>
-    <w:p>
-      <w:pPr>
-        <w:shd w:fill="F2EFEA" w:color="auto" w:val="clear"/>
-        <w:spacing w:after="0"/>
-        <w:ind w:left="120" w:right="120"/>
-      </w:pPr>
-      <w:r>
-        <w:rPr>
-          <w:rFonts w:ascii="Consolas" w:cs="Consolas" w:eastAsia="Consolas" w:hAnsi="Consolas"/>
-          <w:sz w:val="16"/>
-          <w:szCs w:val="16"/>
-        </w:rPr>
-        <w:t xml:space="preserve">[AVOID] No photorealism, no live-action look, no real-person faces, no skin pores or photographic detail; no shots without Vera; no static or frozen background; no monsters, no supernatural creatures; no English speech, no other voices speaking words, no extra lines, no music; no subtitles or on-screen text, no logos, no watermarks; no extra fingers, no face, style or outfit changes, no gratuitous gore.</w:t>
+        <w:t xml:space="preserve">[BACKGROUND ACTION — constant, unsettling movement] All around her the hundreds of square metal caps of the reactor floor start jumping up and down, rattling and clattering like a living carpet; the whole hall shakes; dust and fragments rain down from the ceiling; the high lamps swing and flicker; the refuelling machine sways on its rails; a hot shimmering haze rises from between the caps.</w:t>
+      </w:r>
+    </w:p>
+    <w:p>
+      <w:pPr>
+        <w:shd w:fill="F2EFEA" w:color="auto" w:val="clear"/>
+        <w:spacing w:after="0"/>
+        <w:ind w:left="120" w:right="120"/>
+      </w:pPr>
+      <w:r>
+        <w:rPr>
+          <w:rFonts w:ascii="Consolas" w:cs="Consolas" w:eastAsia="Consolas" w:hAnsi="Consolas"/>
+          <w:sz w:val="16"/>
+          <w:szCs w:val="16"/>
+        </w:rPr>
+        <w:t xml:space="preserve">[SETTING &amp; ERA] Night of 26 April 1986, 1:23 a.m., central reactor hall of unit 4, Chernobyl plant.</w:t>
+      </w:r>
+    </w:p>
+    <w:p>
+      <w:pPr>
+        <w:shd w:fill="F2EFEA" w:color="auto" w:val="clear"/>
+        <w:spacing w:after="0"/>
+        <w:ind w:left="120" w:right="120"/>
+      </w:pPr>
+      <w:r>
+        <w:rPr>
+          <w:rFonts w:ascii="Consolas" w:cs="Consolas" w:eastAsia="Consolas" w:hAnsi="Consolas"/>
+          <w:sz w:val="16"/>
+          <w:szCs w:val="16"/>
+        </w:rPr>
+        <w:t xml:space="preserve">[CAMERA] Handheld medium-wide shot with strong shaking in one direction, Vera kept centred, the jumping caps visible all around her feet. Vertical 9:16, Vera and the action both clearly visible.</w:t>
+      </w:r>
+    </w:p>
+    <w:p>
+      <w:pPr>
+        <w:shd w:fill="F2EFEA" w:color="auto" w:val="clear"/>
+        <w:spacing w:after="0"/>
+        <w:ind w:left="120" w:right="120"/>
+      </w:pPr>
+      <w:r>
+        <w:rPr>
+          <w:rFonts w:ascii="Consolas" w:cs="Consolas" w:eastAsia="Consolas" w:hAnsi="Consolas"/>
+          <w:sz w:val="16"/>
+          <w:szCs w:val="16"/>
+        </w:rPr>
+        <w:t xml:space="preserve">[LIGHT] Swinging, flickering ceiling lights, red alarm glow, dust glowing in the beams — stylized, soft, like an animated film.</w:t>
+      </w:r>
+    </w:p>
+    <w:p>
+      <w:pPr>
+        <w:shd w:fill="F2EFEA" w:color="auto" w:val="clear"/>
+        <w:spacing w:after="0"/>
+        <w:ind w:left="120" w:right="120"/>
+      </w:pPr>
+      <w:r>
+        <w:rPr>
+          <w:rFonts w:ascii="Consolas" w:cs="Consolas" w:eastAsia="Consolas" w:hAnsi="Consolas"/>
+          <w:sz w:val="16"/>
+          <w:szCs w:val="16"/>
+        </w:rPr>
+        <w:t xml:space="preserve">[AUDIO] Only Vera's Russian line in her character voice, plus eerie ambient sound: a deafening metallic clatter of jumping caps, a deep rising rumble like something huge waking up, an alarm siren.</w:t>
+      </w:r>
+    </w:p>
+    <w:p>
+      <w:pPr>
+        <w:shd w:fill="F2EFEA" w:color="auto" w:val="clear"/>
+        <w:spacing w:after="0"/>
+        <w:ind w:left="120" w:right="120"/>
+      </w:pPr>
+      <w:r>
+        <w:rPr>
+          <w:rFonts w:ascii="Consolas" w:cs="Consolas" w:eastAsia="Consolas" w:hAnsi="Consolas"/>
+          <w:sz w:val="16"/>
+          <w:szCs w:val="16"/>
+        </w:rPr>
+        <w:t xml:space="preserve">[AVOID] No photorealism, no live-action look, no real-person faces, no skin pores or photographic detail; no shots without Vera; no static or frozen background; no monsters, no supernatural creatures, no explosion yet; no English speech, no other voices speaking words, no extra lines, no music; no subtitles or on-screen text, no logos, no watermarks; no extra fingers, no face, style or outfit changes, no gratuitous gore.</w:t>
       </w:r>
     </w:p>
     <w:p>

</xml_diff>

<commit_message>
EP01 v9: distinct locations for clips 06-12, recognizable Pripyat landmarks
Co-Authored-By: Claude Opus 5.5 <noreply@anthropic.com>
Claude-Session: https://claude.ai/code/session_01VAADPC5RMETnb7oPTVQosk
</commit_message>
<xml_diff>
--- a/episodes/EP01_chernobyl_night/EP01_Чернобыль_Рабочие_промпты.docx
+++ b/episodes/EP01_chernobyl_night/EP01_Чернобыль_Рабочие_промпты.docx
@@ -518,7 +518,7 @@
         <w:keepNext/>
       </w:pPr>
       <w:r>
-        <w:t xml:space="preserve">3.1. loc_unit4_night — станция ночью (клипы 01, 06, 07, 08, 09)</w:t>
+        <w:t xml:space="preserve">3.1. loc_unit4_night — станция ночью (клип 01)</w:t>
       </w:r>
     </w:p>
     <w:p>
@@ -614,7 +614,7 @@
         <w:keepNext/>
       </w:pPr>
       <w:r>
-        <w:t xml:space="preserve">3.5. loc_pripyat_street — улица Припяти (клипы 10–12)</w:t>
+        <w:t xml:space="preserve">3.5. loc_cooling_pond — берег пруда-охладителя (клип 06)</w:t>
       </w:r>
     </w:p>
     <w:p>
@@ -629,7 +629,7 @@
           <w:sz w:val="16"/>
           <w:szCs w:val="16"/>
         </w:rPr>
-        <w:t xml:space="preserve">Vertical 9:16 image of a residential street in a young Soviet city in April 1986: nine- and sixteen-storey white panel apartment blocks, wide pavements, young poplar trees with first green leaves, a bus stop shelter, simple street lamps, early morning soft light. No people, no cars. Semi-realistic cinematic 3D/2.5D animation with a subtle painterly texture, natural lighting. No text, no letters, no signs with readable writing, no logos, no watermark.</w:t>
+        <w:t xml:space="preserve">Vertical 9:16 image of the concrete bank of the cooling pond of a Soviet nuclear power plant at night in spring 1986: dark still water in the foreground, on the far shore the long plant buildings with a red-and-white striped ventilation stack, lights reflected in the water, light fog over the water, reeds at the edge. No people. Semi-realistic cinematic 3D/2.5D animation with a subtle painterly texture, atmospheric depth. No text, no logos, no watermark.</w:t>
       </w:r>
     </w:p>
     <w:p>
@@ -638,7 +638,151 @@
         <w:keepNext/>
       </w:pPr>
       <w:r>
-        <w:t xml:space="preserve">3.6. ref_firefighter — пожарный 1986 (клипы 08, 09)</w:t>
+        <w:t xml:space="preserve">3.6. loc_unit4_ruins — у развалин блока (клип 07)</w:t>
+      </w:r>
+    </w:p>
+    <w:p>
+      <w:pPr>
+        <w:shd w:fill="F2EFEA" w:color="auto" w:val="clear"/>
+        <w:spacing w:after="120"/>
+        <w:ind w:left="120" w:right="120"/>
+      </w:pPr>
+      <w:r>
+        <w:rPr>
+          <w:rFonts w:ascii="Consolas" w:cs="Consolas" w:eastAsia="Consolas" w:hAnsi="Consolas"/>
+          <w:sz w:val="16"/>
+          <w:szCs w:val="16"/>
+        </w:rPr>
+        <w:t xml:space="preserve">Vertical 9:16 image at the foot of a destroyed Soviet nuclear reactor building at night in 1986: torn concrete walls and twisted steel beams, the ground covered with smoking concrete chunks, scattered dark graphite blocks and twisted metal, small fires burning, red glow from the open top of the building, smoke. No people. Semi-realistic cinematic 3D/2.5D animation with a subtle painterly texture, atmospheric depth. No text, no logos, no watermark.</w:t>
+      </w:r>
+    </w:p>
+    <w:p>
+      <w:pPr>
+        <w:pStyle w:val="Heading2"/>
+        <w:keepNext/>
+      </w:pPr>
+      <w:r>
+        <w:t xml:space="preserve">3.7. loc_turbine_wall — стена машзала с лестницей (клип 08)</w:t>
+      </w:r>
+    </w:p>
+    <w:p>
+      <w:pPr>
+        <w:shd w:fill="F2EFEA" w:color="auto" w:val="clear"/>
+        <w:spacing w:after="120"/>
+        <w:ind w:left="120" w:right="120"/>
+      </w:pPr>
+      <w:r>
+        <w:rPr>
+          <w:rFonts w:ascii="Consolas" w:cs="Consolas" w:eastAsia="Consolas" w:hAnsi="Consolas"/>
+          <w:sz w:val="16"/>
+          <w:szCs w:val="16"/>
+        </w:rPr>
+        <w:t xml:space="preserve">Vertical 9:16 image of the long outer concrete wall of a Soviet power plant turbine hall at night in 1986, a tall vertical steel fire ladder going up to the flat roof, fire and smoke visible on the roof edge above, a wide concrete driveway in front, sodium lamps. No people, no vehicles. Semi-realistic cinematic 3D/2.5D animation with a subtle painterly texture, atmospheric depth. No text, no logos, no watermark.</w:t>
+      </w:r>
+    </w:p>
+    <w:p>
+      <w:pPr>
+        <w:pStyle w:val="Heading2"/>
+        <w:keepNext/>
+      </w:pPr>
+      <w:r>
+        <w:t xml:space="preserve">3.8. loc_roof — крыша машзала (клип 09)</w:t>
+      </w:r>
+    </w:p>
+    <w:p>
+      <w:pPr>
+        <w:shd w:fill="F2EFEA" w:color="auto" w:val="clear"/>
+        <w:spacing w:after="120"/>
+        <w:ind w:left="120" w:right="120"/>
+      </w:pPr>
+      <w:r>
+        <w:rPr>
+          <w:rFonts w:ascii="Consolas" w:cs="Consolas" w:eastAsia="Consolas" w:hAnsi="Consolas"/>
+          <w:sz w:val="16"/>
+          <w:szCs w:val="16"/>
+        </w:rPr>
+        <w:t xml:space="preserve">Vertical 9:16 image of the flat bitumen roof of a Soviet power plant turbine hall at dawn in 1986: puddles of water, scattered burnt debris, fire hoses lying across the roof, the tall red-and-white striped ventilation stack rising next to it, steam and smoke, cold pre-dawn sky. No people. Semi-realistic cinematic 3D/2.5D animation with a subtle painterly texture, atmospheric depth. No text, no logos, no watermark.</w:t>
+      </w:r>
+    </w:p>
+    <w:p>
+      <w:pPr>
+        <w:pStyle w:val="Heading2"/>
+        <w:keepNext/>
+      </w:pPr>
+      <w:r>
+        <w:t xml:space="preserve">3.9. loc_pripyat_square — площадь Припяти (клип 10)</w:t>
+      </w:r>
+    </w:p>
+    <w:p>
+      <w:pPr>
+        <w:shd w:fill="F2EFEA" w:color="auto" w:val="clear"/>
+        <w:spacing w:after="120"/>
+        <w:ind w:left="120" w:right="120"/>
+      </w:pPr>
+      <w:r>
+        <w:rPr>
+          <w:rFonts w:ascii="Consolas" w:cs="Consolas" w:eastAsia="Consolas" w:hAnsi="Consolas"/>
+          <w:sz w:val="16"/>
+          <w:szCs w:val="16"/>
+        </w:rPr>
+        <w:t xml:space="preserve">Vertical 9:16 image of the central square of the Soviet city of Pripyat on a sunny April morning in 1986: the modernist Palace of Culture with large glass windows, a tall white hotel building, wide paved square, flower beds, young poplars, white apartment blocks behind. No people. Semi-realistic cinematic 3D/2.5D animation with a subtle painterly texture, atmospheric depth. No text, no letters, no readable signs, no logos, no watermark.</w:t>
+      </w:r>
+    </w:p>
+    <w:p>
+      <w:pPr>
+        <w:pStyle w:val="Heading2"/>
+        <w:keepNext/>
+      </w:pPr>
+      <w:r>
+        <w:t xml:space="preserve">3.10. loc_pripyat_avenue — проспект Припяти (клип 11)</w:t>
+      </w:r>
+    </w:p>
+    <w:p>
+      <w:pPr>
+        <w:shd w:fill="F2EFEA" w:color="auto" w:val="clear"/>
+        <w:spacing w:after="120"/>
+        <w:ind w:left="120" w:right="120"/>
+      </w:pPr>
+      <w:r>
+        <w:rPr>
+          <w:rFonts w:ascii="Consolas" w:cs="Consolas" w:eastAsia="Consolas" w:hAnsi="Consolas"/>
+          <w:sz w:val="16"/>
+          <w:szCs w:val="16"/>
+        </w:rPr>
+        <w:t xml:space="preserve">Vertical 9:16 image of a wide avenue in the Soviet city of Pripyat in 1986, lined with tall white sixteen-storey apartment towers, wide sidewalks, young trees, hazy afternoon sun. No people, no vehicles. Semi-realistic cinematic 3D/2.5D animation with a subtle painterly texture, atmospheric depth. No text, no letters, no readable signs, no logos, no watermark.</w:t>
+      </w:r>
+    </w:p>
+    <w:p>
+      <w:pPr>
+        <w:pStyle w:val="Heading2"/>
+        <w:keepNext/>
+      </w:pPr>
+      <w:r>
+        <w:t xml:space="preserve">3.11. loc_ferris_wheel_today — колесо обозрения сегодня (клип 12)</w:t>
+      </w:r>
+    </w:p>
+    <w:p>
+      <w:pPr>
+        <w:shd w:fill="F2EFEA" w:color="auto" w:val="clear"/>
+        <w:spacing w:after="120"/>
+        <w:ind w:left="120" w:right="120"/>
+      </w:pPr>
+      <w:r>
+        <w:rPr>
+          <w:rFonts w:ascii="Consolas" w:cs="Consolas" w:eastAsia="Consolas" w:hAnsi="Consolas"/>
+          <w:sz w:val="16"/>
+          <w:szCs w:val="16"/>
+        </w:rPr>
+        <w:t xml:space="preserve">Vertical 9:16 image of the abandoned Pripyat amusement park today: the huge rusted yellow Ferris wheel with hanging gondolas, rusty bumper cars in fallen leaves, young birch trees growing through cracked concrete, empty grey apartment towers behind the trees, overcast autumn evening. No people. Semi-realistic cinematic 3D/2.5D animation with a subtle painterly texture, atmospheric depth. No text, no letters, no logos, no watermark.</w:t>
+      </w:r>
+    </w:p>
+    <w:p>
+      <w:pPr>
+        <w:pStyle w:val="Heading2"/>
+        <w:keepNext/>
+      </w:pPr>
+      <w:r>
+        <w:t xml:space="preserve">3.12. ref_firefighter — пожарный 1986 (клипы 08, 09)</w:t>
       </w:r>
     </w:p>
     <w:p>
@@ -3585,7 +3729,7 @@
         <w:t xml:space="preserve">Вставить в Ingredients:</w:t>
       </w:r>
       <w:r>
-        <w:t xml:space="preserve"> @Vera (персонаж) + @loc_unit4_night.png   </w:t>
+        <w:t xml:space="preserve"> @Vera (персонаж) + @loc_cooling_pond.png   </w:t>
       </w:r>
       <w:r>
         <w:rPr>
@@ -3625,37 +3769,37 @@
           <w:sz w:val="16"/>
           <w:szCs w:val="16"/>
         </w:rPr>
-        <w:t xml:space="preserve">[SCENE] Climax: two explosions tear apart the unit 4 reactor building behind Vera.</w:t>
-      </w:r>
-    </w:p>
-    <w:p>
-      <w:pPr>
-        <w:shd w:fill="F2EFEA" w:color="auto" w:val="clear"/>
-        <w:spacing w:after="0"/>
-        <w:ind w:left="120" w:right="120"/>
-      </w:pPr>
-      <w:r>
-        <w:rPr>
-          <w:rFonts w:ascii="Consolas" w:cs="Consolas" w:eastAsia="Consolas" w:hAnsi="Consolas"/>
-          <w:sz w:val="16"/>
-          <w:szCs w:val="16"/>
-        </w:rPr>
-        <w:t xml:space="preserve">[REFERENCES] Vera is the character @Vera — keep her face, body, outfit, art style and voice exactly as in the character images, in every frame. Do not make her more realistic than the character images. Use @loc_unit4_night as the setting, painted in the same animated style.</w:t>
-      </w:r>
-    </w:p>
-    <w:p>
-      <w:pPr>
-        <w:shd w:fill="F2EFEA" w:color="auto" w:val="clear"/>
-        <w:spacing w:after="0"/>
-        <w:ind w:left="120" w:right="120"/>
-      </w:pPr>
-      <w:r>
-        <w:rPr>
-          <w:rFonts w:ascii="Consolas" w:cs="Consolas" w:eastAsia="Consolas" w:hAnsi="Consolas"/>
-          <w:sz w:val="16"/>
-          <w:szCs w:val="16"/>
-        </w:rPr>
-        <w:t xml:space="preserve">[VERA] Vera is the main character and stays clearly visible from the first to the last frame, face readable. She stands on the plant road facing the camera; the first blast makes her flinch and crouch, hair blown by the shockwave; she straightens, pale, and speaks to the camera. Long dark worn coat, wine-red scarf, brass compass-rose brooch, dark waistcoat, light shirt.</w:t>
+        <w:t xml:space="preserve">[SCENE] Climax: from the bank of the plant's cooling pond Vera sees two explosions tear apart the unit 4 reactor building across the water.</w:t>
+      </w:r>
+    </w:p>
+    <w:p>
+      <w:pPr>
+        <w:shd w:fill="F2EFEA" w:color="auto" w:val="clear"/>
+        <w:spacing w:after="0"/>
+        <w:ind w:left="120" w:right="120"/>
+      </w:pPr>
+      <w:r>
+        <w:rPr>
+          <w:rFonts w:ascii="Consolas" w:cs="Consolas" w:eastAsia="Consolas" w:hAnsi="Consolas"/>
+          <w:sz w:val="16"/>
+          <w:szCs w:val="16"/>
+        </w:rPr>
+        <w:t xml:space="preserve">[REFERENCES] Vera is the character @Vera — keep her face, body, outfit, art style and voice exactly as in the character images, in every frame. Do not make her more realistic than the character images. Use @loc_cooling_pond as the setting, painted in the same animated style.</w:t>
+      </w:r>
+    </w:p>
+    <w:p>
+      <w:pPr>
+        <w:shd w:fill="F2EFEA" w:color="auto" w:val="clear"/>
+        <w:spacing w:after="0"/>
+        <w:ind w:left="120" w:right="120"/>
+      </w:pPr>
+      <w:r>
+        <w:rPr>
+          <w:rFonts w:ascii="Consolas" w:cs="Consolas" w:eastAsia="Consolas" w:hAnsi="Consolas"/>
+          <w:sz w:val="16"/>
+          <w:szCs w:val="16"/>
+        </w:rPr>
+        <w:t xml:space="preserve">[VERA] Vera is the main character and stays clearly visible from the first to the last frame, face readable. She stands on the concrete bank of the cooling pond facing the camera; the first blast makes her flinch and crouch, hair blown by the shockwave; she straightens, pale, and speaks to the camera. Long dark worn coat, wine-red scarf, brass compass-rose brooch, dark waistcoat, light shirt.</w:t>
       </w:r>
     </w:p>
     <w:p>
@@ -3685,22 +3829,22 @@
           <w:sz w:val="16"/>
           <w:szCs w:val="16"/>
         </w:rPr>
-        <w:t xml:space="preserve">[BACKGROUND ACTION — constant, unsettling movement] Behind her a bright burst of steam and debris erupts from the roof of the unit 4 building; two seconds later a second, larger blast throws a column of fire and glowing fragments high into the black sky; a shockwave ripples through the fog, windows of the turbine hall burst outward, burning pieces arc down onto nearby roofs, sparks and dust sweep past Vera, street lamps die one after another.</w:t>
-      </w:r>
-    </w:p>
-    <w:p>
-      <w:pPr>
-        <w:shd w:fill="F2EFEA" w:color="auto" w:val="clear"/>
-        <w:spacing w:after="0"/>
-        <w:ind w:left="120" w:right="120"/>
-      </w:pPr>
-      <w:r>
-        <w:rPr>
-          <w:rFonts w:ascii="Consolas" w:cs="Consolas" w:eastAsia="Consolas" w:hAnsi="Consolas"/>
-          <w:sz w:val="16"/>
-          <w:szCs w:val="16"/>
-        </w:rPr>
-        <w:t xml:space="preserve">[SETTING &amp; ERA] Night of 26 April 1986, about 1:24 a.m., Chernobyl plant.</w:t>
+        <w:t xml:space="preserve">[BACKGROUND ACTION — constant, unsettling movement] Behind her, across the dark still water, two night fishermen with rods jump up in fright; on the far shore a bright burst of steam and debris erupts from the roof of the unit 4 building; two seconds later a second, larger blast throws a column of fire and glowing fragments high into the black sky; the fiery column is reflected and shattered in the water, a shockwave ripples across the pond surface and through the fog, burning pieces arc down onto the plant roofs, the lights along the far shore die one after another.</w:t>
+      </w:r>
+    </w:p>
+    <w:p>
+      <w:pPr>
+        <w:shd w:fill="F2EFEA" w:color="auto" w:val="clear"/>
+        <w:spacing w:after="0"/>
+        <w:ind w:left="120" w:right="120"/>
+      </w:pPr>
+      <w:r>
+        <w:rPr>
+          <w:rFonts w:ascii="Consolas" w:cs="Consolas" w:eastAsia="Consolas" w:hAnsi="Consolas"/>
+          <w:sz w:val="16"/>
+          <w:szCs w:val="16"/>
+        </w:rPr>
+        <w:t xml:space="preserve">[SETTING &amp; ERA] Night of 26 April 1986, about 1:24 a.m., bank of the cooling pond of the Chernobyl plant, the plant on the opposite shore.</w:t>
       </w:r>
     </w:p>
     <w:p>
@@ -3800,7 +3944,7 @@
         <w:t xml:space="preserve">Вставить в Ingredients:</w:t>
       </w:r>
       <w:r>
-        <w:t xml:space="preserve"> @Vera (персонаж) + @loc_unit4_night.png   </w:t>
+        <w:t xml:space="preserve"> @Vera (персонаж) + @loc_unit4_ruins.png   </w:t>
       </w:r>
       <w:r>
         <w:rPr>
@@ -3840,37 +3984,37 @@
           <w:sz w:val="16"/>
           <w:szCs w:val="16"/>
         </w:rPr>
-        <w:t xml:space="preserve">[SCENE] Aftermath of the blast: Vera walks through swirling embers in front of the wrecked, glowing unit 4.</w:t>
-      </w:r>
-    </w:p>
-    <w:p>
-      <w:pPr>
-        <w:shd w:fill="F2EFEA" w:color="auto" w:val="clear"/>
-        <w:spacing w:after="0"/>
-        <w:ind w:left="120" w:right="120"/>
-      </w:pPr>
-      <w:r>
-        <w:rPr>
-          <w:rFonts w:ascii="Consolas" w:cs="Consolas" w:eastAsia="Consolas" w:hAnsi="Consolas"/>
-          <w:sz w:val="16"/>
-          <w:szCs w:val="16"/>
-        </w:rPr>
-        <w:t xml:space="preserve">[REFERENCES] Vera is the character @Vera — keep her face, body, outfit, art style and voice exactly as in the character images, in every frame. Do not make her more realistic than the character images. Use @loc_unit4_night as the setting, painted in the same animated style.</w:t>
-      </w:r>
-    </w:p>
-    <w:p>
-      <w:pPr>
-        <w:shd w:fill="F2EFEA" w:color="auto" w:val="clear"/>
-        <w:spacing w:after="0"/>
-        <w:ind w:left="120" w:right="120"/>
-      </w:pPr>
-      <w:r>
-        <w:rPr>
-          <w:rFonts w:ascii="Consolas" w:cs="Consolas" w:eastAsia="Consolas" w:hAnsi="Consolas"/>
-          <w:sz w:val="16"/>
-          <w:szCs w:val="16"/>
-        </w:rPr>
-        <w:t xml:space="preserve">[VERA] Vera is the main character and stays clearly visible from the first to the last frame, face readable. She walks slowly toward the camera through drifting embers and smoke, shields her eyes once, then stops and looks into the lens, shaken. Long dark worn coat, wine-red scarf, brass compass-rose brooch, dark waistcoat, light shirt.</w:t>
+        <w:t xml:space="preserve">[SCENE] Aftermath of the blast: Vera walks through the debris field right at the foot of the wrecked, glowing unit 4.</w:t>
+      </w:r>
+    </w:p>
+    <w:p>
+      <w:pPr>
+        <w:shd w:fill="F2EFEA" w:color="auto" w:val="clear"/>
+        <w:spacing w:after="0"/>
+        <w:ind w:left="120" w:right="120"/>
+      </w:pPr>
+      <w:r>
+        <w:rPr>
+          <w:rFonts w:ascii="Consolas" w:cs="Consolas" w:eastAsia="Consolas" w:hAnsi="Consolas"/>
+          <w:sz w:val="16"/>
+          <w:szCs w:val="16"/>
+        </w:rPr>
+        <w:t xml:space="preserve">[REFERENCES] Vera is the character @Vera — keep her face, body, outfit, art style and voice exactly as in the character images, in every frame. Do not make her more realistic than the character images. Use @loc_unit4_ruins as the setting, painted in the same animated style.</w:t>
+      </w:r>
+    </w:p>
+    <w:p>
+      <w:pPr>
+        <w:shd w:fill="F2EFEA" w:color="auto" w:val="clear"/>
+        <w:spacing w:after="0"/>
+        <w:ind w:left="120" w:right="120"/>
+      </w:pPr>
+      <w:r>
+        <w:rPr>
+          <w:rFonts w:ascii="Consolas" w:cs="Consolas" w:eastAsia="Consolas" w:hAnsi="Consolas"/>
+          <w:sz w:val="16"/>
+          <w:szCs w:val="16"/>
+        </w:rPr>
+        <w:t xml:space="preserve">[VERA] Vera is the main character and stays clearly visible from the first to the last frame, face readable. She picks her way toward the camera between smoking chunks of concrete, twisted metal and scattered dark graphite blocks, shields her eyes once, then stops and looks into the lens, shaken. Long dark worn coat, wine-red scarf, brass compass-rose brooch, dark waistcoat, light shirt.</w:t>
       </w:r>
     </w:p>
     <w:p>
@@ -3915,7 +4059,7 @@
           <w:sz w:val="16"/>
           <w:szCs w:val="16"/>
         </w:rPr>
-        <w:t xml:space="preserve">[SETTING &amp; ERA] Night of 26 April 1986, about 1:30 a.m., Chernobyl plant.</w:t>
+        <w:t xml:space="preserve">[SETTING &amp; ERA] Night of 26 April 1986, about 1:30 a.m., at the foot of the destroyed unit 4 building, Chernobyl plant, ground covered with debris.</w:t>
       </w:r>
     </w:p>
     <w:p>
@@ -4015,7 +4159,7 @@
         <w:t xml:space="preserve">Вставить в Ingredients:</w:t>
       </w:r>
       <w:r>
-        <w:t xml:space="preserve"> @Vera (персонаж) + @loc_unit4_night.png + @ref_firefighter.png   </w:t>
+        <w:t xml:space="preserve"> @Vera (персонаж) + @loc_turbine_wall.png + @ref_firefighter.png   </w:t>
       </w:r>
       <w:r>
         <w:rPr>
@@ -4070,7 +4214,7 @@
           <w:sz w:val="16"/>
           <w:szCs w:val="16"/>
         </w:rPr>
-        <w:t xml:space="preserve">[REFERENCES] Vera is the character @Vera — keep her face, body, outfit, art style and voice exactly as in the character images, in every frame. Do not make her more realistic than the character images. Use @loc_unit4_night as the setting, painted in the same animated style. Use @ref_firefighter as the exact look of the firefighters, in the same animated style.</w:t>
+        <w:t xml:space="preserve">[REFERENCES] Vera is the character @Vera — keep her face, body, outfit, art style and voice exactly as in the character images, in every frame. Do not make her more realistic than the character images. Use @loc_turbine_wall as the setting, painted in the same animated style. Use @ref_firefighter as the exact look of the firefighters, in the same animated style.</w:t>
       </w:r>
     </w:p>
     <w:p>
@@ -4130,7 +4274,7 @@
           <w:sz w:val="16"/>
           <w:szCs w:val="16"/>
         </w:rPr>
-        <w:t xml:space="preserve">[SETTING &amp; ERA] Night of 26 April 1986, about 1:30 a.m., beside the turbine hall of the Chernobyl plant.</w:t>
+        <w:t xml:space="preserve">[SETTING &amp; ERA] Night of 26 April 1986, about 1:30 a.m., at the long outer wall of the turbine hall with a tall steel fire ladder, Chernobyl plant.</w:t>
       </w:r>
     </w:p>
     <w:p>
@@ -4230,7 +4374,7 @@
         <w:t xml:space="preserve">Вставить в Ingredients:</w:t>
       </w:r>
       <w:r>
-        <w:t xml:space="preserve"> @Vera (персонаж) + @loc_unit4_night.png + @ref_firefighter.png   </w:t>
+        <w:t xml:space="preserve"> @Vera (персонаж) + @loc_roof.png + @ref_firefighter.png   </w:t>
       </w:r>
       <w:r>
         <w:rPr>
@@ -4270,37 +4414,37 @@
           <w:sz w:val="16"/>
           <w:szCs w:val="16"/>
         </w:rPr>
-        <w:t xml:space="preserve">[SCENE] Resolution of the night: firefighters fight the fire on the roof above Vera as a grey dawn approaches.</w:t>
-      </w:r>
-    </w:p>
-    <w:p>
-      <w:pPr>
-        <w:shd w:fill="F2EFEA" w:color="auto" w:val="clear"/>
-        <w:spacing w:after="0"/>
-        <w:ind w:left="120" w:right="120"/>
-      </w:pPr>
-      <w:r>
-        <w:rPr>
-          <w:rFonts w:ascii="Consolas" w:cs="Consolas" w:eastAsia="Consolas" w:hAnsi="Consolas"/>
-          <w:sz w:val="16"/>
-          <w:szCs w:val="16"/>
-        </w:rPr>
-        <w:t xml:space="preserve">[REFERENCES] Vera is the character @Vera — keep her face, body, outfit, art style and voice exactly as in the character images, in every frame. Do not make her more realistic than the character images. Use @loc_unit4_night as the setting, painted in the same animated style. Use @ref_firefighter as the exact look of the firefighters, in the same animated style.</w:t>
-      </w:r>
-    </w:p>
-    <w:p>
-      <w:pPr>
-        <w:shd w:fill="F2EFEA" w:color="auto" w:val="clear"/>
-        <w:spacing w:after="0"/>
-        <w:ind w:left="120" w:right="120"/>
-      </w:pPr>
-      <w:r>
-        <w:rPr>
-          <w:rFonts w:ascii="Consolas" w:cs="Consolas" w:eastAsia="Consolas" w:hAnsi="Consolas"/>
-          <w:sz w:val="16"/>
-          <w:szCs w:val="16"/>
-        </w:rPr>
-        <w:t xml:space="preserve">[VERA] Vera is the main character and stays clearly visible from the first to the last frame, face readable. She stands at the foot of the building in the lower third, water mist and ash drifting around her, and speaks to the camera, eyes glistening. Long dark worn coat, wine-red scarf, brass compass-rose brooch, dark waistcoat, light shirt.</w:t>
+        <w:t xml:space="preserve">[SCENE] Resolution of the night: Vera stands on the roof among the firefighters as they fight the last flames and a grey dawn approaches.</w:t>
+      </w:r>
+    </w:p>
+    <w:p>
+      <w:pPr>
+        <w:shd w:fill="F2EFEA" w:color="auto" w:val="clear"/>
+        <w:spacing w:after="0"/>
+        <w:ind w:left="120" w:right="120"/>
+      </w:pPr>
+      <w:r>
+        <w:rPr>
+          <w:rFonts w:ascii="Consolas" w:cs="Consolas" w:eastAsia="Consolas" w:hAnsi="Consolas"/>
+          <w:sz w:val="16"/>
+          <w:szCs w:val="16"/>
+        </w:rPr>
+        <w:t xml:space="preserve">[REFERENCES] Vera is the character @Vera — keep her face, body, outfit, art style and voice exactly as in the character images, in every frame. Do not make her more realistic than the character images. Use @loc_roof as the setting, painted in the same animated style. Use @ref_firefighter as the exact look of the firefighters, in the same animated style.</w:t>
+      </w:r>
+    </w:p>
+    <w:p>
+      <w:pPr>
+        <w:shd w:fill="F2EFEA" w:color="auto" w:val="clear"/>
+        <w:spacing w:after="0"/>
+        <w:ind w:left="120" w:right="120"/>
+      </w:pPr>
+      <w:r>
+        <w:rPr>
+          <w:rFonts w:ascii="Consolas" w:cs="Consolas" w:eastAsia="Consolas" w:hAnsi="Consolas"/>
+          <w:sz w:val="16"/>
+          <w:szCs w:val="16"/>
+        </w:rPr>
+        <w:t xml:space="preserve">[VERA] Vera is the main character and stays clearly visible from the first to the last frame, face readable. She stands on the flat bitumen roof in the lower third of the frame, water mist and ash drifting around her, and speaks to the camera, eyes glistening. Long dark worn coat, wine-red scarf, brass compass-rose brooch, dark waistcoat, light shirt.</w:t>
       </w:r>
     </w:p>
     <w:p>
@@ -4330,37 +4474,37 @@
           <w:sz w:val="16"/>
           <w:szCs w:val="16"/>
         </w:rPr>
-        <w:t xml:space="preserve">[BACKGROUND ACTION — constant, unsettling movement] On the roof above and behind her silhouettes of firefighters direct hose jets into the dying flames; water bursts into clouds of steam; one firefighter sways, sinks to his knees and is pulled back by another; the flames shrink during the clip while the sky turns from black to a cold, bruised pre-dawn blue; ash keeps falling.</w:t>
-      </w:r>
-    </w:p>
-    <w:p>
-      <w:pPr>
-        <w:shd w:fill="F2EFEA" w:color="auto" w:val="clear"/>
-        <w:spacing w:after="0"/>
-        <w:ind w:left="120" w:right="120"/>
-      </w:pPr>
-      <w:r>
-        <w:rPr>
-          <w:rFonts w:ascii="Consolas" w:cs="Consolas" w:eastAsia="Consolas" w:hAnsi="Consolas"/>
-          <w:sz w:val="16"/>
-          <w:szCs w:val="16"/>
-        </w:rPr>
-        <w:t xml:space="preserve">[SETTING &amp; ERA] Early morning of 26 April 1986, Chernobyl plant.</w:t>
-      </w:r>
-    </w:p>
-    <w:p>
-      <w:pPr>
-        <w:shd w:fill="F2EFEA" w:color="auto" w:val="clear"/>
-        <w:spacing w:after="0"/>
-        <w:ind w:left="120" w:right="120"/>
-      </w:pPr>
-      <w:r>
-        <w:rPr>
-          <w:rFonts w:ascii="Consolas" w:cs="Consolas" w:eastAsia="Consolas" w:hAnsi="Consolas"/>
-          <w:sz w:val="16"/>
-          <w:szCs w:val="16"/>
-        </w:rPr>
-        <w:t xml:space="preserve">[CAMERA] Low-angle wide shot with Vera in the foreground, slow crane-like rise that reveals the roof, then settles back on her face. Vertical 9:16, Vera and the action both clearly visible.</w:t>
+        <w:t xml:space="preserve">[BACKGROUND ACTION — constant, unsettling movement] Behind her on the same roof silhouettes of firefighters direct hose jets into the dying flames; water bursts into clouds of steam; one firefighter sways, sinks to his knees and is pulled back by another; the flames shrink during the clip while the sky turns from black to a cold, bruised pre-dawn blue; ash keeps falling.</w:t>
+      </w:r>
+    </w:p>
+    <w:p>
+      <w:pPr>
+        <w:shd w:fill="F2EFEA" w:color="auto" w:val="clear"/>
+        <w:spacing w:after="0"/>
+        <w:ind w:left="120" w:right="120"/>
+      </w:pPr>
+      <w:r>
+        <w:rPr>
+          <w:rFonts w:ascii="Consolas" w:cs="Consolas" w:eastAsia="Consolas" w:hAnsi="Consolas"/>
+          <w:sz w:val="16"/>
+          <w:szCs w:val="16"/>
+        </w:rPr>
+        <w:t xml:space="preserve">[SETTING &amp; ERA] Early morning of 26 April 1986, flat roof of the turbine hall next to the red-and-white striped ventilation stack, Chernobyl plant.</w:t>
+      </w:r>
+    </w:p>
+    <w:p>
+      <w:pPr>
+        <w:shd w:fill="F2EFEA" w:color="auto" w:val="clear"/>
+        <w:spacing w:after="0"/>
+        <w:ind w:left="120" w:right="120"/>
+      </w:pPr>
+      <w:r>
+        <w:rPr>
+          <w:rFonts w:ascii="Consolas" w:cs="Consolas" w:eastAsia="Consolas" w:hAnsi="Consolas"/>
+          <w:sz w:val="16"/>
+          <w:szCs w:val="16"/>
+        </w:rPr>
+        <w:t xml:space="preserve">[CAMERA] Wide shot on the roof with Vera in the foreground, slow lateral move revealing the firefighters and the stack, then settles on her face. Vertical 9:16, Vera and the action both clearly visible.</w:t>
       </w:r>
     </w:p>
     <w:p>
@@ -4445,7 +4589,7 @@
         <w:t xml:space="preserve">Вставить в Ingredients:</w:t>
       </w:r>
       <w:r>
-        <w:t xml:space="preserve"> @Vera (персонаж) + @loc_pripyat_street.png   </w:t>
+        <w:t xml:space="preserve"> @Vera (персонаж) + @loc_pripyat_square.png   </w:t>
       </w:r>
       <w:r>
         <w:rPr>
@@ -4485,37 +4629,37 @@
           <w:sz w:val="16"/>
           <w:szCs w:val="16"/>
         </w:rPr>
-        <w:t xml:space="preserve">[SCENE] Contrast: a lively ordinary Saturday morning in Pripyat while a dark plume rises over the distant plant.</w:t>
-      </w:r>
-    </w:p>
-    <w:p>
-      <w:pPr>
-        <w:shd w:fill="F2EFEA" w:color="auto" w:val="clear"/>
-        <w:spacing w:after="0"/>
-        <w:ind w:left="120" w:right="120"/>
-      </w:pPr>
-      <w:r>
-        <w:rPr>
-          <w:rFonts w:ascii="Consolas" w:cs="Consolas" w:eastAsia="Consolas" w:hAnsi="Consolas"/>
-          <w:sz w:val="16"/>
-          <w:szCs w:val="16"/>
-        </w:rPr>
-        <w:t xml:space="preserve">[REFERENCES] Vera is the character @Vera — keep her face, body, outfit, art style and voice exactly as in the character images, in every frame. Do not make her more realistic than the character images. Use @loc_pripyat_street as the setting, painted in the same animated style.</w:t>
-      </w:r>
-    </w:p>
-    <w:p>
-      <w:pPr>
-        <w:shd w:fill="F2EFEA" w:color="auto" w:val="clear"/>
-        <w:spacing w:after="0"/>
-        <w:ind w:left="120" w:right="120"/>
-      </w:pPr>
-      <w:r>
-        <w:rPr>
-          <w:rFonts w:ascii="Consolas" w:cs="Consolas" w:eastAsia="Consolas" w:hAnsi="Consolas"/>
-          <w:sz w:val="16"/>
-          <w:szCs w:val="16"/>
-        </w:rPr>
-        <w:t xml:space="preserve">[VERA] Vera is the main character and stays clearly visible from the first to the last frame, face readable. She walks down the sidewalk toward the camera through the cheerful morning crowd, the only person who looks worried, and stops to speak to the lens. Long dark worn coat, wine-red scarf, brass compass-rose brooch, dark waistcoat, light shirt.</w:t>
+        <w:t xml:space="preserve">[SCENE] Contrast: a lively ordinary Saturday morning on the central square of Pripyat while a dark plume rises over the distant plant.</w:t>
+      </w:r>
+    </w:p>
+    <w:p>
+      <w:pPr>
+        <w:shd w:fill="F2EFEA" w:color="auto" w:val="clear"/>
+        <w:spacing w:after="0"/>
+        <w:ind w:left="120" w:right="120"/>
+      </w:pPr>
+      <w:r>
+        <w:rPr>
+          <w:rFonts w:ascii="Consolas" w:cs="Consolas" w:eastAsia="Consolas" w:hAnsi="Consolas"/>
+          <w:sz w:val="16"/>
+          <w:szCs w:val="16"/>
+        </w:rPr>
+        <w:t xml:space="preserve">[REFERENCES] Vera is the character @Vera — keep her face, body, outfit, art style and voice exactly as in the character images, in every frame. Do not make her more realistic than the character images. Use @loc_pripyat_square as the setting, painted in the same animated style.</w:t>
+      </w:r>
+    </w:p>
+    <w:p>
+      <w:pPr>
+        <w:shd w:fill="F2EFEA" w:color="auto" w:val="clear"/>
+        <w:spacing w:after="0"/>
+        <w:ind w:left="120" w:right="120"/>
+      </w:pPr>
+      <w:r>
+        <w:rPr>
+          <w:rFonts w:ascii="Consolas" w:cs="Consolas" w:eastAsia="Consolas" w:hAnsi="Consolas"/>
+          <w:sz w:val="16"/>
+          <w:szCs w:val="16"/>
+        </w:rPr>
+        <w:t xml:space="preserve">[VERA] Vera is the main character and stays clearly visible from the first to the last frame, face readable. She walks across the square toward the camera through the cheerful morning crowd, the only person who looks worried, and stops to speak to the lens. Long dark worn coat, wine-red scarf, brass compass-rose brooch, dark waistcoat, light shirt.</w:t>
       </w:r>
     </w:p>
     <w:p>
@@ -4545,22 +4689,22 @@
           <w:sz w:val="16"/>
           <w:szCs w:val="16"/>
         </w:rPr>
-        <w:t xml:space="preserve">[BACKGROUND ACTION — constant, unsettling movement] Life goes on all around her: children ride bicycles past laughing, a mother pushes a pram, men carry shopping bags, a bus stops and people get off, pigeons burst up from the pavement, laundry flaps on balconies; nobody looks toward the horizon, where a thin dark plume rises over the plant; for a moment the shadow of a cloud passes over the street.</w:t>
-      </w:r>
-    </w:p>
-    <w:p>
-      <w:pPr>
-        <w:shd w:fill="F2EFEA" w:color="auto" w:val="clear"/>
-        <w:spacing w:after="0"/>
-        <w:ind w:left="120" w:right="120"/>
-      </w:pPr>
-      <w:r>
-        <w:rPr>
-          <w:rFonts w:ascii="Consolas" w:cs="Consolas" w:eastAsia="Consolas" w:hAnsi="Consolas"/>
-          <w:sz w:val="16"/>
-          <w:szCs w:val="16"/>
-        </w:rPr>
-        <w:t xml:space="preserve">[SETTING &amp; ERA] Saturday morning, 26 April 1986, Pripyat, Ukrainian SSR, sunny and warm, white panel apartment blocks, young poplars.</w:t>
+        <w:t xml:space="preserve">[BACKGROUND ACTION — constant, unsettling movement] Behind her the Palace of Culture «Energetik» and the tall Hotel «Polissya» frame the square; life goes on all around her: children ride bicycles past laughing, a mother pushes a pram, men carry shopping bags, a bus stops and people get off, pigeons burst up from the pavement, laundry flaps on balconies; nobody looks toward the horizon, where a thin dark plume rises over the plant; for a moment the shadow of a cloud passes over the street.</w:t>
+      </w:r>
+    </w:p>
+    <w:p>
+      <w:pPr>
+        <w:shd w:fill="F2EFEA" w:color="auto" w:val="clear"/>
+        <w:spacing w:after="0"/>
+        <w:ind w:left="120" w:right="120"/>
+      </w:pPr>
+      <w:r>
+        <w:rPr>
+          <w:rFonts w:ascii="Consolas" w:cs="Consolas" w:eastAsia="Consolas" w:hAnsi="Consolas"/>
+          <w:sz w:val="16"/>
+          <w:szCs w:val="16"/>
+        </w:rPr>
+        <w:t xml:space="preserve">[SETTING &amp; ERA] Saturday morning, 26 April 1986, central square of Pripyat, Ukrainian SSR, sunny and warm: the Palace of Culture «Energetik», the Hotel «Polissya», flower beds, young poplars.</w:t>
       </w:r>
     </w:p>
     <w:p>
@@ -4660,7 +4804,7 @@
         <w:t xml:space="preserve">Вставить в Ingredients:</w:t>
       </w:r>
       <w:r>
-        <w:t xml:space="preserve"> @Vera (персонаж) + @loc_pripyat_street.png   </w:t>
+        <w:t xml:space="preserve"> @Vera (персонаж) + @loc_pripyat_avenue.png   </w:t>
       </w:r>
       <w:r>
         <w:rPr>
@@ -4715,7 +4859,7 @@
           <w:sz w:val="16"/>
           <w:szCs w:val="16"/>
         </w:rPr>
-        <w:t xml:space="preserve">[REFERENCES] Vera is the character @Vera — keep her face, body, outfit, art style and voice exactly as in the character images, in every frame. Do not make her more realistic than the character images. Use @loc_pripyat_street as the setting, painted in the same animated style.</w:t>
+        <w:t xml:space="preserve">[REFERENCES] Vera is the character @Vera — keep her face, body, outfit, art style and voice exactly as in the character images, in every frame. Do not make her more realistic than the character images. Use @loc_pripyat_avenue as the setting, painted in the same animated style.</w:t>
       </w:r>
     </w:p>
     <w:p>
@@ -4775,7 +4919,7 @@
           <w:sz w:val="16"/>
           <w:szCs w:val="16"/>
         </w:rPr>
-        <w:t xml:space="preserve">[SETTING &amp; ERA] Afternoon of 27 April 1986, Pripyat, hazy sun, white panel apartment blocks, 1980s LAZ and Ikarus style buses.</w:t>
+        <w:t xml:space="preserve">[SETTING &amp; ERA] Afternoon of 27 April 1986, wide avenue of Pripyat lined with white sixteen-storey apartment towers, hazy sun, 1980s LAZ and Ikarus style buses.</w:t>
       </w:r>
     </w:p>
     <w:p>
@@ -4875,7 +5019,7 @@
         <w:t xml:space="preserve">Вставить в Ingredients:</w:t>
       </w:r>
       <w:r>
-        <w:t xml:space="preserve"> @Vera (персонаж) + @loc_pripyat_street.png   </w:t>
+        <w:t xml:space="preserve"> @Vera (персонаж) + @loc_ferris_wheel_today.png   </w:t>
       </w:r>
       <w:r>
         <w:rPr>
@@ -4915,37 +5059,37 @@
           <w:sz w:val="16"/>
           <w:szCs w:val="16"/>
         </w:rPr>
-        <w:t xml:space="preserve">[SCENE] Final: Vera alone in the empty, evacuated city; only the wind is moving.</w:t>
-      </w:r>
-    </w:p>
-    <w:p>
-      <w:pPr>
-        <w:shd w:fill="F2EFEA" w:color="auto" w:val="clear"/>
-        <w:spacing w:after="0"/>
-        <w:ind w:left="120" w:right="120"/>
-      </w:pPr>
-      <w:r>
-        <w:rPr>
-          <w:rFonts w:ascii="Consolas" w:cs="Consolas" w:eastAsia="Consolas" w:hAnsi="Consolas"/>
-          <w:sz w:val="16"/>
-          <w:szCs w:val="16"/>
-        </w:rPr>
-        <w:t xml:space="preserve">[REFERENCES] Vera is the character @Vera — keep her face, body, outfit, art style and voice exactly as in the character images, in every frame. Do not make her more realistic than the character images. Use @loc_pripyat_street as the setting, painted in the same animated style.</w:t>
-      </w:r>
-    </w:p>
-    <w:p>
-      <w:pPr>
-        <w:shd w:fill="F2EFEA" w:color="auto" w:val="clear"/>
-        <w:spacing w:after="0"/>
-        <w:ind w:left="120" w:right="120"/>
-      </w:pPr>
-      <w:r>
-        <w:rPr>
-          <w:rFonts w:ascii="Consolas" w:cs="Consolas" w:eastAsia="Consolas" w:hAnsi="Consolas"/>
-          <w:sz w:val="16"/>
-          <w:szCs w:val="16"/>
-        </w:rPr>
-        <w:t xml:space="preserve">[VERA] Vera is the main character and stays clearly visible from the first to the last frame, face readable. She stands in the middle of the empty street facing the camera; the wind pulls at her hair and scarf; after the last sentence she stays silent and holds her gaze on the camera. Long dark worn coat, wine-red scarf, brass compass-rose brooch, dark waistcoat, light shirt.</w:t>
+        <w:t xml:space="preserve">[SCENE] Final: Vera stands alone in the abandoned Pripyat amusement park today, in front of the rusted yellow Ferris wheel that never opened.</w:t>
+      </w:r>
+    </w:p>
+    <w:p>
+      <w:pPr>
+        <w:shd w:fill="F2EFEA" w:color="auto" w:val="clear"/>
+        <w:spacing w:after="0"/>
+        <w:ind w:left="120" w:right="120"/>
+      </w:pPr>
+      <w:r>
+        <w:rPr>
+          <w:rFonts w:ascii="Consolas" w:cs="Consolas" w:eastAsia="Consolas" w:hAnsi="Consolas"/>
+          <w:sz w:val="16"/>
+          <w:szCs w:val="16"/>
+        </w:rPr>
+        <w:t xml:space="preserve">[REFERENCES] Vera is the character @Vera — keep her face, body, outfit, art style and voice exactly as in the character images, in every frame. Do not make her more realistic than the character images. Use @loc_ferris_wheel_today as the setting, painted in the same animated style.</w:t>
+      </w:r>
+    </w:p>
+    <w:p>
+      <w:pPr>
+        <w:shd w:fill="F2EFEA" w:color="auto" w:val="clear"/>
+        <w:spacing w:after="0"/>
+        <w:ind w:left="120" w:right="120"/>
+      </w:pPr>
+      <w:r>
+        <w:rPr>
+          <w:rFonts w:ascii="Consolas" w:cs="Consolas" w:eastAsia="Consolas" w:hAnsi="Consolas"/>
+          <w:sz w:val="16"/>
+          <w:szCs w:val="16"/>
+        </w:rPr>
+        <w:t xml:space="preserve">[VERA] Vera is the main character and stays clearly visible from the first to the last frame, face readable. She stands in front of the Ferris wheel facing the camera; the wind pulls at her hair and scarf; after the last sentence she stays silent and holds her gaze on the camera. Long dark worn coat, wine-red scarf, brass compass-rose brooch, dark waistcoat, light shirt.</w:t>
       </w:r>
     </w:p>
     <w:p>
@@ -4975,37 +5119,37 @@
           <w:sz w:val="16"/>
           <w:szCs w:val="16"/>
         </w:rPr>
-        <w:t xml:space="preserve">[BACKGROUND ACTION — constant, unsettling movement] The abandoned city moves only with the wind: papers and dead leaves sweep across the street, a curtain flaps out of an open window high above, a swing creaks back and forth on an empty playground, a stray dog stops and stares, then runs off; one by one the last lit windows go dark; the buildings are intact.</w:t>
-      </w:r>
-    </w:p>
-    <w:p>
-      <w:pPr>
-        <w:shd w:fill="F2EFEA" w:color="auto" w:val="clear"/>
-        <w:spacing w:after="0"/>
-        <w:ind w:left="120" w:right="120"/>
-      </w:pPr>
-      <w:r>
-        <w:rPr>
-          <w:rFonts w:ascii="Consolas" w:cs="Consolas" w:eastAsia="Consolas" w:hAnsi="Consolas"/>
-          <w:sz w:val="16"/>
-          <w:szCs w:val="16"/>
-        </w:rPr>
-        <w:t xml:space="preserve">[SETTING &amp; ERA] After the evacuation, late April 1986, Pripyat, overcast evening, intact white panel apartment blocks with dark windows.</w:t>
-      </w:r>
-    </w:p>
-    <w:p>
-      <w:pPr>
-        <w:shd w:fill="F2EFEA" w:color="auto" w:val="clear"/>
-        <w:spacing w:after="0"/>
-        <w:ind w:left="120" w:right="120"/>
-      </w:pPr>
-      <w:r>
-        <w:rPr>
-          <w:rFonts w:ascii="Consolas" w:cs="Consolas" w:eastAsia="Consolas" w:hAnsi="Consolas"/>
-          <w:sz w:val="16"/>
-          <w:szCs w:val="16"/>
-        </w:rPr>
-        <w:t xml:space="preserve">[CAMERA] Slow pull-back that rises like a crane, the empty city opening up around her, Vera growing small in the centre. Vertical 9:16, Vera and the action both clearly visible.</w:t>
+        <w:t xml:space="preserve">[BACKGROUND ACTION — constant, unsettling movement] Behind her the huge rusted yellow Ferris wheel creaks and its gondolas sway in the wind; rusty bumper cars stand in fallen leaves; young birch trees grow through the cracked concrete; dead leaves swirl across the empty park; a crow lands on a gondola; behind the trees stand empty grey apartment towers with dark broken windows.</w:t>
+      </w:r>
+    </w:p>
+    <w:p>
+      <w:pPr>
+        <w:shd w:fill="F2EFEA" w:color="auto" w:val="clear"/>
+        <w:spacing w:after="0"/>
+        <w:ind w:left="120" w:right="120"/>
+      </w:pPr>
+      <w:r>
+        <w:rPr>
+          <w:rFonts w:ascii="Consolas" w:cs="Consolas" w:eastAsia="Consolas" w:hAnsi="Consolas"/>
+          <w:sz w:val="16"/>
+          <w:szCs w:val="16"/>
+        </w:rPr>
+        <w:t xml:space="preserve">[SETTING &amp; ERA] Present day, abandoned Pripyat amusement park, overcast autumn evening, decades of decay: rust, moss, trees growing through the park.</w:t>
+      </w:r>
+    </w:p>
+    <w:p>
+      <w:pPr>
+        <w:shd w:fill="F2EFEA" w:color="auto" w:val="clear"/>
+        <w:spacing w:after="0"/>
+        <w:ind w:left="120" w:right="120"/>
+      </w:pPr>
+      <w:r>
+        <w:rPr>
+          <w:rFonts w:ascii="Consolas" w:cs="Consolas" w:eastAsia="Consolas" w:hAnsi="Consolas"/>
+          <w:sz w:val="16"/>
+          <w:szCs w:val="16"/>
+        </w:rPr>
+        <w:t xml:space="preserve">[CAMERA] Slow pull-back that rises like a crane, the Ferris wheel towering over her, Vera growing small in the centre. Vertical 9:16, Vera and the action both clearly visible.</w:t>
       </w:r>
     </w:p>
     <w:p>
@@ -5035,7 +5179,7 @@
           <w:sz w:val="16"/>
           <w:szCs w:val="16"/>
         </w:rPr>
-        <w:t xml:space="preserve">[AUDIO] Only Vera's Russian line in her character voice, plus eerie ambient sound: wind, rustling leaves, a creaking swing, a door banging somewhere far away, then silence.</w:t>
+        <w:t xml:space="preserve">[AUDIO] Only Vera's Russian line in her character voice, plus eerie ambient sound: wind, rustling leaves, the slow metallic creak of the Ferris wheel, a crow's cry, then silence.</w:t>
       </w:r>
     </w:p>
     <w:p>

</xml_diff>